<commit_message>
Ajustes na documentação do projeto
</commit_message>
<xml_diff>
--- a/doc/didacta_vision_documentacao.docx
+++ b/doc/didacta_vision_documentacao.docx
@@ -1,6 +1,6 @@
 
 <file path=word/document.xml><?xml version="1.0" encoding="utf-8"?>
-<w:document xmlns:wpc="http://schemas.microsoft.com/office/word/2010/wordprocessingCanvas" xmlns:cx="http://schemas.microsoft.com/office/drawing/2014/chartex" xmlns:cx1="http://schemas.microsoft.com/office/drawing/2015/9/8/chartex" xmlns:cx2="http://schemas.microsoft.com/office/drawing/2015/10/21/chartex" xmlns:cx3="http://schemas.microsoft.com/office/drawing/2016/5/9/chartex" xmlns:cx4="http://schemas.microsoft.com/office/drawing/2016/5/10/chartex" xmlns:cx5="http://schemas.microsoft.com/office/drawing/2016/5/11/chartex" xmlns:cx6="http://schemas.microsoft.com/office/drawing/2016/5/12/chartex" xmlns:cx7="http://schemas.microsoft.com/office/drawing/2016/5/13/chartex" xmlns:cx8="http://schemas.microsoft.com/office/drawing/2016/5/14/chartex" xmlns:mc="http://schemas.openxmlformats.org/markup-compatibility/2006" xmlns:aink="http://schemas.microsoft.com/office/drawing/2016/ink" xmlns:am3d="http://schemas.microsoft.com/office/drawing/2017/model3d" xmlns:o="urn:schemas-microsoft-com:office:office" xmlns:oel="http://schemas.microsoft.com/office/2019/extlst" xmlns:r="http://schemas.openxmlformats.org/officeDocument/2006/relationships" xmlns:m="http://schemas.openxmlformats.org/officeDocument/2006/math" xmlns:v="urn:schemas-microsoft-com:vml" xmlns:wp14="http://schemas.microsoft.com/office/word/2010/wordprocessingDrawing" xmlns:wp="http://schemas.openxmlformats.org/drawingml/2006/wordprocessingDrawing" xmlns:w10="urn:schemas-microsoft-com:office:word" xmlns:w="http://schemas.openxmlformats.org/wordprocessingml/2006/main" xmlns:w14="http://schemas.microsoft.com/office/word/2010/wordml" xmlns:w15="http://schemas.microsoft.com/office/word/2012/wordml" xmlns:w16cex="http://schemas.microsoft.com/office/word/2018/wordml/cex" xmlns:w16cid="http://schemas.microsoft.com/office/word/2016/wordml/cid" xmlns:w16="http://schemas.microsoft.com/office/word/2018/wordml" xmlns:w16du="http://schemas.microsoft.com/office/word/2023/wordml/word16du" xmlns:w16sdtdh="http://schemas.microsoft.com/office/word/2020/wordml/sdtdatahash" xmlns:w16sdtfl="http://schemas.microsoft.com/office/word/2024/wordml/sdtformatlock" xmlns:w16se="http://schemas.microsoft.com/office/word/2015/wordml/symex" xmlns:wpg="http://schemas.microsoft.com/office/word/2010/wordprocessingGroup" xmlns:wpi="http://schemas.microsoft.com/office/word/2010/wordprocessingInk" xmlns:wne="http://schemas.microsoft.com/office/word/2006/wordml" xmlns:wps="http://schemas.microsoft.com/office/word/2010/wordprocessingShape" mc:Ignorable="w14 w15 w16se w16cid w16 w16cex w16sdtdh w16sdtfl w16du wp14">
+<w:document xmlns:wpc="http://schemas.microsoft.com/office/word/2010/wordprocessingCanvas" xmlns:cx="http://schemas.microsoft.com/office/drawing/2014/chartex" xmlns:cx1="http://schemas.microsoft.com/office/drawing/2015/9/8/chartex" xmlns:cx2="http://schemas.microsoft.com/office/drawing/2015/10/21/chartex" xmlns:cx3="http://schemas.microsoft.com/office/drawing/2016/5/9/chartex" xmlns:cx4="http://schemas.microsoft.com/office/drawing/2016/5/10/chartex" xmlns:cx5="http://schemas.microsoft.com/office/drawing/2016/5/11/chartex" xmlns:cx6="http://schemas.microsoft.com/office/drawing/2016/5/12/chartex" xmlns:cx7="http://schemas.microsoft.com/office/drawing/2016/5/13/chartex" xmlns:cx8="http://schemas.microsoft.com/office/drawing/2016/5/14/chartex" xmlns:mc="http://schemas.openxmlformats.org/markup-compatibility/2006" xmlns:aink="http://schemas.microsoft.com/office/drawing/2016/ink" xmlns:am3d="http://schemas.microsoft.com/office/drawing/2017/model3d" xmlns:o="urn:schemas-microsoft-com:office:office" xmlns:r="http://schemas.openxmlformats.org/officeDocument/2006/relationships" xmlns:m="http://schemas.openxmlformats.org/officeDocument/2006/math" xmlns:v="urn:schemas-microsoft-com:vml" xmlns:wp14="http://schemas.microsoft.com/office/word/2010/wordprocessingDrawing" xmlns:wp="http://schemas.openxmlformats.org/drawingml/2006/wordprocessingDrawing" xmlns:w10="urn:schemas-microsoft-com:office:word" xmlns:w="http://schemas.openxmlformats.org/wordprocessingml/2006/main" xmlns:w14="http://schemas.microsoft.com/office/word/2010/wordml" xmlns:w15="http://schemas.microsoft.com/office/word/2012/wordml" xmlns:w16cid="http://schemas.microsoft.com/office/word/2016/wordml/cid" xmlns:w16se="http://schemas.microsoft.com/office/word/2015/wordml/symex" xmlns:wpg="http://schemas.microsoft.com/office/word/2010/wordprocessingGroup" xmlns:wpi="http://schemas.microsoft.com/office/word/2010/wordprocessingInk" xmlns:wne="http://schemas.microsoft.com/office/word/2006/wordml" xmlns:wps="http://schemas.microsoft.com/office/word/2010/wordprocessingShape" mc:Ignorable="w14 w15 w16se w16cid wp14">
   <w:body>
     <w:p>
       <w:pPr>
@@ -337,8 +337,8 @@
         <w:rPr>
           <w:rFonts w:asciiTheme="minorHAnsi" w:eastAsiaTheme="minorEastAsia" w:hAnsiTheme="minorHAnsi" w:cstheme="minorBidi"/>
           <w:noProof/>
-          <w:kern w:val="2"/>
-          <w14:ligatures w14:val="standardContextual"/>
+          <w:sz w:val="22"/>
+          <w:szCs w:val="22"/>
         </w:rPr>
       </w:pPr>
       <w:r>
@@ -359,7 +359,7 @@
         </w:rPr>
         <w:fldChar w:fldCharType="separate"/>
       </w:r>
-      <w:hyperlink w:anchor="_Toc216246692" w:history="1">
+      <w:hyperlink w:anchor="_Toc216271857" w:history="1">
         <w:r>
           <w:rPr>
             <w:rStyle w:val="Hyperlink"/>
@@ -386,7 +386,7 @@
             <w:noProof/>
             <w:webHidden/>
           </w:rPr>
-          <w:instrText xml:space="preserve"> PAGEREF _Toc216246692 \h </w:instrText>
+          <w:instrText xml:space="preserve"> PAGEREF _Toc216271857 \h </w:instrText>
         </w:r>
         <w:r>
           <w:rPr>
@@ -426,11 +426,11 @@
         <w:rPr>
           <w:rFonts w:asciiTheme="minorHAnsi" w:eastAsiaTheme="minorEastAsia" w:hAnsiTheme="minorHAnsi" w:cstheme="minorBidi"/>
           <w:noProof/>
-          <w:kern w:val="2"/>
-          <w14:ligatures w14:val="standardContextual"/>
-        </w:rPr>
-      </w:pPr>
-      <w:hyperlink w:anchor="_Toc216246693" w:history="1">
+          <w:sz w:val="22"/>
+          <w:szCs w:val="22"/>
+        </w:rPr>
+      </w:pPr>
+      <w:hyperlink w:anchor="_Toc216271858" w:history="1">
         <w:r>
           <w:rPr>
             <w:rStyle w:val="Hyperlink"/>
@@ -457,7 +457,7 @@
             <w:noProof/>
             <w:webHidden/>
           </w:rPr>
-          <w:instrText xml:space="preserve"> PAGEREF _Toc216246693 \h </w:instrText>
+          <w:instrText xml:space="preserve"> PAGEREF _Toc216271858 \h </w:instrText>
         </w:r>
         <w:r>
           <w:rPr>
@@ -497,11 +497,11 @@
         <w:rPr>
           <w:rFonts w:asciiTheme="minorHAnsi" w:eastAsiaTheme="minorEastAsia" w:hAnsiTheme="minorHAnsi" w:cstheme="minorBidi"/>
           <w:noProof/>
-          <w:kern w:val="2"/>
-          <w14:ligatures w14:val="standardContextual"/>
-        </w:rPr>
-      </w:pPr>
-      <w:hyperlink w:anchor="_Toc216246694" w:history="1">
+          <w:sz w:val="22"/>
+          <w:szCs w:val="22"/>
+        </w:rPr>
+      </w:pPr>
+      <w:hyperlink w:anchor="_Toc216271859" w:history="1">
         <w:r>
           <w:rPr>
             <w:rStyle w:val="Hyperlink"/>
@@ -528,7 +528,7 @@
             <w:noProof/>
             <w:webHidden/>
           </w:rPr>
-          <w:instrText xml:space="preserve"> PAGEREF _Toc216246694 \h </w:instrText>
+          <w:instrText xml:space="preserve"> PAGEREF _Toc216271859 \h </w:instrText>
         </w:r>
         <w:r>
           <w:rPr>
@@ -568,11 +568,11 @@
         <w:rPr>
           <w:rFonts w:asciiTheme="minorHAnsi" w:eastAsiaTheme="minorEastAsia" w:hAnsiTheme="minorHAnsi" w:cstheme="minorBidi"/>
           <w:noProof/>
-          <w:kern w:val="2"/>
-          <w14:ligatures w14:val="standardContextual"/>
-        </w:rPr>
-      </w:pPr>
-      <w:hyperlink w:anchor="_Toc216246695" w:history="1">
+          <w:sz w:val="22"/>
+          <w:szCs w:val="22"/>
+        </w:rPr>
+      </w:pPr>
+      <w:hyperlink w:anchor="_Toc216271860" w:history="1">
         <w:r>
           <w:rPr>
             <w:rStyle w:val="Hyperlink"/>
@@ -599,7 +599,7 @@
             <w:noProof/>
             <w:webHidden/>
           </w:rPr>
-          <w:instrText xml:space="preserve"> PAGEREF _Toc216246695 \h </w:instrText>
+          <w:instrText xml:space="preserve"> PAGEREF _Toc216271860 \h </w:instrText>
         </w:r>
         <w:r>
           <w:rPr>
@@ -639,11 +639,11 @@
         <w:rPr>
           <w:rFonts w:asciiTheme="minorHAnsi" w:eastAsiaTheme="minorEastAsia" w:hAnsiTheme="minorHAnsi" w:cstheme="minorBidi"/>
           <w:noProof/>
-          <w:kern w:val="2"/>
-          <w14:ligatures w14:val="standardContextual"/>
-        </w:rPr>
-      </w:pPr>
-      <w:hyperlink w:anchor="_Toc216246696" w:history="1">
+          <w:sz w:val="22"/>
+          <w:szCs w:val="22"/>
+        </w:rPr>
+      </w:pPr>
+      <w:hyperlink w:anchor="_Toc216271861" w:history="1">
         <w:r>
           <w:rPr>
             <w:rStyle w:val="Hyperlink"/>
@@ -670,7 +670,7 @@
             <w:noProof/>
             <w:webHidden/>
           </w:rPr>
-          <w:instrText xml:space="preserve"> PAGEREF _Toc216246696 \h </w:instrText>
+          <w:instrText xml:space="preserve"> PAGEREF _Toc216271861 \h </w:instrText>
         </w:r>
         <w:r>
           <w:rPr>
@@ -710,11 +710,11 @@
         <w:rPr>
           <w:rFonts w:asciiTheme="minorHAnsi" w:eastAsiaTheme="minorEastAsia" w:hAnsiTheme="minorHAnsi" w:cstheme="minorBidi"/>
           <w:noProof/>
-          <w:kern w:val="2"/>
-          <w14:ligatures w14:val="standardContextual"/>
-        </w:rPr>
-      </w:pPr>
-      <w:hyperlink w:anchor="_Toc216246697" w:history="1">
+          <w:sz w:val="22"/>
+          <w:szCs w:val="22"/>
+        </w:rPr>
+      </w:pPr>
+      <w:hyperlink w:anchor="_Toc216271862" w:history="1">
         <w:r>
           <w:rPr>
             <w:rStyle w:val="Hyperlink"/>
@@ -741,7 +741,7 @@
             <w:noProof/>
             <w:webHidden/>
           </w:rPr>
-          <w:instrText xml:space="preserve"> PAGEREF _Toc216246697 \h </w:instrText>
+          <w:instrText xml:space="preserve"> PAGEREF _Toc216271862 \h </w:instrText>
         </w:r>
         <w:r>
           <w:rPr>
@@ -781,11 +781,11 @@
         <w:rPr>
           <w:rFonts w:asciiTheme="minorHAnsi" w:eastAsiaTheme="minorEastAsia" w:hAnsiTheme="minorHAnsi" w:cstheme="minorBidi"/>
           <w:noProof/>
-          <w:kern w:val="2"/>
-          <w14:ligatures w14:val="standardContextual"/>
-        </w:rPr>
-      </w:pPr>
-      <w:hyperlink w:anchor="_Toc216246698" w:history="1">
+          <w:sz w:val="22"/>
+          <w:szCs w:val="22"/>
+        </w:rPr>
+      </w:pPr>
+      <w:hyperlink w:anchor="_Toc216271863" w:history="1">
         <w:r>
           <w:rPr>
             <w:rStyle w:val="Hyperlink"/>
@@ -812,7 +812,78 @@
             <w:noProof/>
             <w:webHidden/>
           </w:rPr>
-          <w:instrText xml:space="preserve"> PAGEREF _Toc216246698 \h </w:instrText>
+          <w:instrText xml:space="preserve"> PAGEREF _Toc216271863 \h </w:instrText>
+        </w:r>
+        <w:r>
+          <w:rPr>
+            <w:noProof/>
+            <w:webHidden/>
+          </w:rPr>
+        </w:r>
+        <w:r>
+          <w:rPr>
+            <w:noProof/>
+            <w:webHidden/>
+          </w:rPr>
+          <w:fldChar w:fldCharType="separate"/>
+        </w:r>
+        <w:r>
+          <w:rPr>
+            <w:noProof/>
+            <w:webHidden/>
+          </w:rPr>
+          <w:t>21</w:t>
+        </w:r>
+        <w:r>
+          <w:rPr>
+            <w:noProof/>
+            <w:webHidden/>
+          </w:rPr>
+          <w:fldChar w:fldCharType="end"/>
+        </w:r>
+      </w:hyperlink>
+    </w:p>
+    <w:p>
+      <w:pPr>
+        <w:pStyle w:val="ndicedeilustraes"/>
+        <w:tabs>
+          <w:tab w:val="right" w:leader="dot" w:pos="9127"/>
+        </w:tabs>
+        <w:rPr>
+          <w:rFonts w:asciiTheme="minorHAnsi" w:eastAsiaTheme="minorEastAsia" w:hAnsiTheme="minorHAnsi" w:cstheme="minorBidi"/>
+          <w:noProof/>
+          <w:sz w:val="22"/>
+          <w:szCs w:val="22"/>
+        </w:rPr>
+      </w:pPr>
+      <w:hyperlink w:anchor="_Toc216271864" w:history="1">
+        <w:r>
+          <w:rPr>
+            <w:rStyle w:val="Hyperlink"/>
+            <w:noProof/>
+          </w:rPr>
+          <w:t>Figura 8 – Ajuda</w:t>
+        </w:r>
+        <w:r>
+          <w:rPr>
+            <w:noProof/>
+            <w:webHidden/>
+          </w:rPr>
+          <w:tab/>
+        </w:r>
+        <w:r>
+          <w:rPr>
+            <w:noProof/>
+            <w:webHidden/>
+          </w:rPr>
+          <w:fldChar w:fldCharType="begin"/>
+        </w:r>
+        <w:r>
+          <w:rPr>
+            <w:noProof/>
+            <w:webHidden/>
+          </w:rPr>
+          <w:instrText xml:space="preserve"> PAGEREF _Toc216271864 \h </w:instrText>
         </w:r>
         <w:r>
           <w:rPr>
@@ -852,17 +923,17 @@
         <w:rPr>
           <w:rFonts w:asciiTheme="minorHAnsi" w:eastAsiaTheme="minorEastAsia" w:hAnsiTheme="minorHAnsi" w:cstheme="minorBidi"/>
           <w:noProof/>
-          <w:kern w:val="2"/>
-          <w14:ligatures w14:val="standardContextual"/>
-        </w:rPr>
-      </w:pPr>
-      <w:hyperlink w:anchor="_Toc216246699" w:history="1">
+          <w:sz w:val="22"/>
+          <w:szCs w:val="22"/>
+        </w:rPr>
+      </w:pPr>
+      <w:hyperlink w:anchor="_Toc216271865" w:history="1">
         <w:r>
           <w:rPr>
             <w:rStyle w:val="Hyperlink"/>
             <w:noProof/>
           </w:rPr>
-          <w:t>Figura 8 – Ajuda</w:t>
+          <w:t>Figura 9 - Editar Perfil</w:t>
         </w:r>
         <w:r>
           <w:rPr>
@@ -883,7 +954,7 @@
             <w:noProof/>
             <w:webHidden/>
           </w:rPr>
-          <w:instrText xml:space="preserve"> PAGEREF _Toc216246699 \h </w:instrText>
+          <w:instrText xml:space="preserve"> PAGEREF _Toc216271865 \h </w:instrText>
         </w:r>
         <w:r>
           <w:rPr>
@@ -923,17 +994,17 @@
         <w:rPr>
           <w:rFonts w:asciiTheme="minorHAnsi" w:eastAsiaTheme="minorEastAsia" w:hAnsiTheme="minorHAnsi" w:cstheme="minorBidi"/>
           <w:noProof/>
-          <w:kern w:val="2"/>
-          <w14:ligatures w14:val="standardContextual"/>
-        </w:rPr>
-      </w:pPr>
-      <w:hyperlink w:anchor="_Toc216246700" w:history="1">
+          <w:sz w:val="22"/>
+          <w:szCs w:val="22"/>
+        </w:rPr>
+      </w:pPr>
+      <w:hyperlink w:anchor="_Toc216271866" w:history="1">
         <w:r>
           <w:rPr>
             <w:rStyle w:val="Hyperlink"/>
             <w:noProof/>
           </w:rPr>
-          <w:t>Figura 9 - Editar Perfil</w:t>
+          <w:t>Figura 10 – Discussão</w:t>
         </w:r>
         <w:r>
           <w:rPr>
@@ -954,7 +1025,7 @@
             <w:noProof/>
             <w:webHidden/>
           </w:rPr>
-          <w:instrText xml:space="preserve"> PAGEREF _Toc216246700 \h </w:instrText>
+          <w:instrText xml:space="preserve"> PAGEREF _Toc216271866 \h </w:instrText>
         </w:r>
         <w:r>
           <w:rPr>
@@ -994,17 +1065,17 @@
         <w:rPr>
           <w:rFonts w:asciiTheme="minorHAnsi" w:eastAsiaTheme="minorEastAsia" w:hAnsiTheme="minorHAnsi" w:cstheme="minorBidi"/>
           <w:noProof/>
-          <w:kern w:val="2"/>
-          <w14:ligatures w14:val="standardContextual"/>
-        </w:rPr>
-      </w:pPr>
-      <w:hyperlink w:anchor="_Toc216246701" w:history="1">
+          <w:sz w:val="22"/>
+          <w:szCs w:val="22"/>
+        </w:rPr>
+      </w:pPr>
+      <w:hyperlink w:anchor="_Toc216271867" w:history="1">
         <w:r>
           <w:rPr>
             <w:rStyle w:val="Hyperlink"/>
             <w:noProof/>
           </w:rPr>
-          <w:t>Figura 10 – Discussão</w:t>
+          <w:t>Figura 11 - Notificações</w:t>
         </w:r>
         <w:r>
           <w:rPr>
@@ -1025,7 +1096,7 @@
             <w:noProof/>
             <w:webHidden/>
           </w:rPr>
-          <w:instrText xml:space="preserve"> PAGEREF _Toc216246701 \h </w:instrText>
+          <w:instrText xml:space="preserve"> PAGEREF _Toc216271867 \h </w:instrText>
         </w:r>
         <w:r>
           <w:rPr>
@@ -1065,17 +1136,17 @@
         <w:rPr>
           <w:rFonts w:asciiTheme="minorHAnsi" w:eastAsiaTheme="minorEastAsia" w:hAnsiTheme="minorHAnsi" w:cstheme="minorBidi"/>
           <w:noProof/>
-          <w:kern w:val="2"/>
-          <w14:ligatures w14:val="standardContextual"/>
-        </w:rPr>
-      </w:pPr>
-      <w:hyperlink w:anchor="_Toc216246702" w:history="1">
+          <w:sz w:val="22"/>
+          <w:szCs w:val="22"/>
+        </w:rPr>
+      </w:pPr>
+      <w:hyperlink w:anchor="_Toc216271868" w:history="1">
         <w:r>
           <w:rPr>
             <w:rStyle w:val="Hyperlink"/>
             <w:noProof/>
           </w:rPr>
-          <w:t>Figura 11 - Notificações</w:t>
+          <w:t>Figura 12 – Dashboard</w:t>
         </w:r>
         <w:r>
           <w:rPr>
@@ -1096,7 +1167,7 @@
             <w:noProof/>
             <w:webHidden/>
           </w:rPr>
-          <w:instrText xml:space="preserve"> PAGEREF _Toc216246702 \h </w:instrText>
+          <w:instrText xml:space="preserve"> PAGEREF _Toc216271868 \h </w:instrText>
         </w:r>
         <w:r>
           <w:rPr>
@@ -1136,17 +1207,17 @@
         <w:rPr>
           <w:rFonts w:asciiTheme="minorHAnsi" w:eastAsiaTheme="minorEastAsia" w:hAnsiTheme="minorHAnsi" w:cstheme="minorBidi"/>
           <w:noProof/>
-          <w:kern w:val="2"/>
-          <w14:ligatures w14:val="standardContextual"/>
-        </w:rPr>
-      </w:pPr>
-      <w:hyperlink w:anchor="_Toc216246703" w:history="1">
+          <w:sz w:val="22"/>
+          <w:szCs w:val="22"/>
+        </w:rPr>
+      </w:pPr>
+      <w:hyperlink w:anchor="_Toc216271869" w:history="1">
         <w:r>
           <w:rPr>
             <w:rStyle w:val="Hyperlink"/>
             <w:noProof/>
           </w:rPr>
-          <w:t>Figura 12 – Dashboard</w:t>
+          <w:t>Figura 13 - Reservas dos Usuários</w:t>
         </w:r>
         <w:r>
           <w:rPr>
@@ -1167,7 +1238,7 @@
             <w:noProof/>
             <w:webHidden/>
           </w:rPr>
-          <w:instrText xml:space="preserve"> PAGEREF _Toc216246703 \h </w:instrText>
+          <w:instrText xml:space="preserve"> PAGEREF _Toc216271869 \h </w:instrText>
         </w:r>
         <w:r>
           <w:rPr>
@@ -1207,17 +1278,17 @@
         <w:rPr>
           <w:rFonts w:asciiTheme="minorHAnsi" w:eastAsiaTheme="minorEastAsia" w:hAnsiTheme="minorHAnsi" w:cstheme="minorBidi"/>
           <w:noProof/>
-          <w:kern w:val="2"/>
-          <w14:ligatures w14:val="standardContextual"/>
-        </w:rPr>
-      </w:pPr>
-      <w:hyperlink w:anchor="_Toc216246704" w:history="1">
+          <w:sz w:val="22"/>
+          <w:szCs w:val="22"/>
+        </w:rPr>
+      </w:pPr>
+      <w:hyperlink w:anchor="_Toc216271870" w:history="1">
         <w:r>
           <w:rPr>
             <w:rStyle w:val="Hyperlink"/>
             <w:noProof/>
           </w:rPr>
-          <w:t>Figura 13 - Reservas dos Usuários</w:t>
+          <w:t>Figura 14 – Sessões</w:t>
         </w:r>
         <w:r>
           <w:rPr>
@@ -1238,7 +1309,7 @@
             <w:noProof/>
             <w:webHidden/>
           </w:rPr>
-          <w:instrText xml:space="preserve"> PAGEREF _Toc216246704 \h </w:instrText>
+          <w:instrText xml:space="preserve"> PAGEREF _Toc216271870 \h </w:instrText>
         </w:r>
         <w:r>
           <w:rPr>
@@ -1278,17 +1349,17 @@
         <w:rPr>
           <w:rFonts w:asciiTheme="minorHAnsi" w:eastAsiaTheme="minorEastAsia" w:hAnsiTheme="minorHAnsi" w:cstheme="minorBidi"/>
           <w:noProof/>
-          <w:kern w:val="2"/>
-          <w14:ligatures w14:val="standardContextual"/>
-        </w:rPr>
-      </w:pPr>
-      <w:hyperlink w:anchor="_Toc216246705" w:history="1">
+          <w:sz w:val="22"/>
+          <w:szCs w:val="22"/>
+        </w:rPr>
+      </w:pPr>
+      <w:hyperlink w:anchor="_Toc216271871" w:history="1">
         <w:r>
           <w:rPr>
             <w:rStyle w:val="Hyperlink"/>
             <w:noProof/>
           </w:rPr>
-          <w:t>Figura 14 – Sessões</w:t>
+          <w:t>Figura 15 - Gerenciamento de Notificações pelo Admin</w:t>
         </w:r>
         <w:r>
           <w:rPr>
@@ -1309,7 +1380,7 @@
             <w:noProof/>
             <w:webHidden/>
           </w:rPr>
-          <w:instrText xml:space="preserve"> PAGEREF _Toc216246705 \h </w:instrText>
+          <w:instrText xml:space="preserve"> PAGEREF _Toc216271871 \h </w:instrText>
         </w:r>
         <w:r>
           <w:rPr>
@@ -1349,17 +1420,17 @@
         <w:rPr>
           <w:rFonts w:asciiTheme="minorHAnsi" w:eastAsiaTheme="minorEastAsia" w:hAnsiTheme="minorHAnsi" w:cstheme="minorBidi"/>
           <w:noProof/>
-          <w:kern w:val="2"/>
-          <w14:ligatures w14:val="standardContextual"/>
-        </w:rPr>
-      </w:pPr>
-      <w:hyperlink w:anchor="_Toc216246706" w:history="1">
+          <w:sz w:val="22"/>
+          <w:szCs w:val="22"/>
+        </w:rPr>
+      </w:pPr>
+      <w:hyperlink w:anchor="_Toc216271872" w:history="1">
         <w:r>
           <w:rPr>
             <w:rStyle w:val="Hyperlink"/>
             <w:noProof/>
           </w:rPr>
-          <w:t>Figura 15 - Gerenciamento de Notificações pelo Admin</w:t>
+          <w:t>Figura 16 - Menu do Admin</w:t>
         </w:r>
         <w:r>
           <w:rPr>
@@ -1380,7 +1451,7 @@
             <w:noProof/>
             <w:webHidden/>
           </w:rPr>
-          <w:instrText xml:space="preserve"> PAGEREF _Toc216246706 \h </w:instrText>
+          <w:instrText xml:space="preserve"> PAGEREF _Toc216271872 \h </w:instrText>
         </w:r>
         <w:r>
           <w:rPr>
@@ -1420,17 +1491,17 @@
         <w:rPr>
           <w:rFonts w:asciiTheme="minorHAnsi" w:eastAsiaTheme="minorEastAsia" w:hAnsiTheme="minorHAnsi" w:cstheme="minorBidi"/>
           <w:noProof/>
-          <w:kern w:val="2"/>
-          <w14:ligatures w14:val="standardContextual"/>
-        </w:rPr>
-      </w:pPr>
-      <w:hyperlink w:anchor="_Toc216246707" w:history="1">
+          <w:sz w:val="22"/>
+          <w:szCs w:val="22"/>
+        </w:rPr>
+      </w:pPr>
+      <w:hyperlink w:anchor="_Toc216271873" w:history="1">
         <w:r>
           <w:rPr>
             <w:rStyle w:val="Hyperlink"/>
             <w:noProof/>
           </w:rPr>
-          <w:t>Figura 16 - Menu do Admin</w:t>
+          <w:t>Figura 17 - Cadastrar Filme</w:t>
         </w:r>
         <w:r>
           <w:rPr>
@@ -1451,7 +1522,7 @@
             <w:noProof/>
             <w:webHidden/>
           </w:rPr>
-          <w:instrText xml:space="preserve"> PAGEREF _Toc216246707 \h </w:instrText>
+          <w:instrText xml:space="preserve"> PAGEREF _Toc216271873 \h </w:instrText>
         </w:r>
         <w:r>
           <w:rPr>
@@ -1483,77 +1554,6 @@
       </w:hyperlink>
     </w:p>
     <w:p>
-      <w:pPr>
-        <w:pStyle w:val="ndicedeilustraes"/>
-        <w:tabs>
-          <w:tab w:val="right" w:leader="dot" w:pos="9127"/>
-        </w:tabs>
-        <w:rPr>
-          <w:rFonts w:asciiTheme="minorHAnsi" w:eastAsiaTheme="minorEastAsia" w:hAnsiTheme="minorHAnsi" w:cstheme="minorBidi"/>
-          <w:noProof/>
-          <w:kern w:val="2"/>
-          <w14:ligatures w14:val="standardContextual"/>
-        </w:rPr>
-      </w:pPr>
-      <w:hyperlink w:anchor="_Toc216246708" w:history="1">
-        <w:r>
-          <w:rPr>
-            <w:rStyle w:val="Hyperlink"/>
-            <w:noProof/>
-          </w:rPr>
-          <w:t>Figura 17 - Cadastrar Filme</w:t>
-        </w:r>
-        <w:r>
-          <w:rPr>
-            <w:noProof/>
-            <w:webHidden/>
-          </w:rPr>
-          <w:tab/>
-        </w:r>
-        <w:r>
-          <w:rPr>
-            <w:noProof/>
-            <w:webHidden/>
-          </w:rPr>
-          <w:fldChar w:fldCharType="begin"/>
-        </w:r>
-        <w:r>
-          <w:rPr>
-            <w:noProof/>
-            <w:webHidden/>
-          </w:rPr>
-          <w:instrText xml:space="preserve"> PAGEREF _Toc216246708 \h </w:instrText>
-        </w:r>
-        <w:r>
-          <w:rPr>
-            <w:noProof/>
-            <w:webHidden/>
-          </w:rPr>
-        </w:r>
-        <w:r>
-          <w:rPr>
-            <w:noProof/>
-            <w:webHidden/>
-          </w:rPr>
-          <w:fldChar w:fldCharType="separate"/>
-        </w:r>
-        <w:r>
-          <w:rPr>
-            <w:noProof/>
-            <w:webHidden/>
-          </w:rPr>
-          <w:t>32</w:t>
-        </w:r>
-        <w:r>
-          <w:rPr>
-            <w:noProof/>
-            <w:webHidden/>
-          </w:rPr>
-          <w:fldChar w:fldCharType="end"/>
-        </w:r>
-      </w:hyperlink>
-    </w:p>
-    <w:p>
       <w:r>
         <w:rPr>
           <w:b/>
@@ -1986,22 +1986,7 @@
       </w:r>
       <w:r>
         <w:tab/>
-      </w:r>
-      <w:proofErr w:type="spellStart"/>
-      <w:r>
-        <w:t>HyperText</w:t>
-      </w:r>
-      <w:proofErr w:type="spellEnd"/>
-      <w:r>
-        <w:t xml:space="preserve"> Markup </w:t>
-      </w:r>
-      <w:proofErr w:type="spellStart"/>
-      <w:r>
-        <w:t>Language</w:t>
-      </w:r>
-      <w:proofErr w:type="spellEnd"/>
-      <w:r>
-        <w:t xml:space="preserve"> </w:t>
+        <w:t xml:space="preserve">HyperText Markup Language </w:t>
       </w:r>
     </w:p>
     <w:p>
@@ -2028,30 +2013,7 @@
       </w:r>
       <w:r>
         <w:tab/>
-      </w:r>
-      <w:proofErr w:type="spellStart"/>
-      <w:r>
-        <w:t>Cascading</w:t>
-      </w:r>
-      <w:proofErr w:type="spellEnd"/>
-      <w:r>
-        <w:t xml:space="preserve"> </w:t>
-      </w:r>
-      <w:proofErr w:type="spellStart"/>
-      <w:r>
-        <w:t>Style</w:t>
-      </w:r>
-      <w:proofErr w:type="spellEnd"/>
-      <w:r>
-        <w:t xml:space="preserve"> </w:t>
-      </w:r>
-      <w:proofErr w:type="spellStart"/>
-      <w:r>
-        <w:t>Sheets</w:t>
-      </w:r>
-      <w:proofErr w:type="spellEnd"/>
-      <w:r>
-        <w:t xml:space="preserve"> </w:t>
+        <w:t xml:space="preserve">Cascading Style Sheets </w:t>
       </w:r>
     </w:p>
     <w:p>
@@ -2102,14 +2064,7 @@
       </w:r>
       <w:r>
         <w:tab/>
-      </w:r>
-      <w:proofErr w:type="spellStart"/>
-      <w:r>
-        <w:t>Application</w:t>
-      </w:r>
-      <w:proofErr w:type="spellEnd"/>
-      <w:r>
-        <w:t xml:space="preserve"> Programming Interface </w:t>
+        <w:t xml:space="preserve">Application Programming Interface </w:t>
       </w:r>
     </w:p>
     <w:p>
@@ -2121,21 +2076,8 @@
         <w:ind w:left="0" w:right="0" w:firstLine="0"/>
         <w:jc w:val="left"/>
       </w:pPr>
-      <w:proofErr w:type="spellStart"/>
-      <w:r>
-        <w:t>Argon</w:t>
-      </w:r>
-      <w:proofErr w:type="spellEnd"/>
-      <w:r>
-        <w:t xml:space="preserve"> 2                              </w:t>
-      </w:r>
-      <w:proofErr w:type="spellStart"/>
-      <w:r>
-        <w:t>Hash</w:t>
-      </w:r>
-      <w:proofErr w:type="spellEnd"/>
-      <w:r>
-        <w:t xml:space="preserve"> </w:t>
+      <w:r>
+        <w:t xml:space="preserve">Argon 2                              Hash </w:t>
       </w:r>
     </w:p>
     <w:p>
@@ -2152,30 +2094,7 @@
       </w:r>
       <w:r>
         <w:tab/>
-      </w:r>
-      <w:proofErr w:type="spellStart"/>
-      <w:r>
-        <w:t>Uniform</w:t>
-      </w:r>
-      <w:proofErr w:type="spellEnd"/>
-      <w:r>
-        <w:t xml:space="preserve"> </w:t>
-      </w:r>
-      <w:proofErr w:type="spellStart"/>
-      <w:r>
-        <w:t>Resource</w:t>
-      </w:r>
-      <w:proofErr w:type="spellEnd"/>
-      <w:r>
-        <w:t xml:space="preserve"> </w:t>
-      </w:r>
-      <w:proofErr w:type="spellStart"/>
-      <w:r>
-        <w:t>Locator</w:t>
-      </w:r>
-      <w:proofErr w:type="spellEnd"/>
-      <w:r>
-        <w:t xml:space="preserve"> </w:t>
+        <w:t xml:space="preserve">Uniform Resource Locator </w:t>
       </w:r>
     </w:p>
     <w:p>
@@ -2192,14 +2111,7 @@
       </w:r>
       <w:r>
         <w:tab/>
-      </w:r>
-      <w:proofErr w:type="spellStart"/>
-      <w:r>
-        <w:t>Structured</w:t>
-      </w:r>
-      <w:proofErr w:type="spellEnd"/>
-      <w:r>
-        <w:t xml:space="preserve"> Query Language </w:t>
+        <w:t xml:space="preserve">Structured Query Language </w:t>
       </w:r>
     </w:p>
     <w:p>
@@ -2217,21 +2129,11 @@
         <w:tab/>
       </w:r>
       <w:r>
-        <w:t xml:space="preserve">                               Model </w:t>
-      </w:r>
-      <w:proofErr w:type="spellStart"/>
-      <w:r>
-        <w:t>View</w:t>
-      </w:r>
-      <w:proofErr w:type="spellEnd"/>
-      <w:r>
-        <w:t xml:space="preserve"> </w:t>
-      </w:r>
-      <w:proofErr w:type="spellStart"/>
+        <w:t xml:space="preserve">                               Model View </w:t>
+      </w:r>
       <w:r>
         <w:t>Template</w:t>
       </w:r>
-      <w:proofErr w:type="spellEnd"/>
       <w:r>
         <w:t xml:space="preserve"> </w:t>
       </w:r>
@@ -2372,7 +2274,7 @@
             </w:rPr>
             <w:fldChar w:fldCharType="separate"/>
           </w:r>
-          <w:hyperlink w:anchor="_Toc216182974" w:history="1">
+          <w:hyperlink w:anchor="_Toc216271874" w:history="1">
             <w:r>
               <w:rPr>
                 <w:rStyle w:val="Hyperlink"/>
@@ -2417,7 +2319,7 @@
                 <w:noProof/>
                 <w:webHidden/>
               </w:rPr>
-              <w:instrText xml:space="preserve"> PAGEREF _Toc216182974 \h </w:instrText>
+              <w:instrText xml:space="preserve"> PAGEREF _Toc216271874 \h </w:instrText>
             </w:r>
             <w:r>
               <w:rPr>
@@ -2437,7 +2339,7 @@
                 <w:noProof/>
                 <w:webHidden/>
               </w:rPr>
-              <w:t>5</w:t>
+              <w:t>6</w:t>
             </w:r>
             <w:r>
               <w:rPr>
@@ -2464,7 +2366,7 @@
               <w14:ligatures w14:val="none"/>
             </w:rPr>
           </w:pPr>
-          <w:hyperlink w:anchor="_Toc216182975" w:history="1">
+          <w:hyperlink w:anchor="_Toc216271875" w:history="1">
             <w:r>
               <w:rPr>
                 <w:rStyle w:val="Hyperlink"/>
@@ -2509,7 +2411,7 @@
                 <w:noProof/>
                 <w:webHidden/>
               </w:rPr>
-              <w:instrText xml:space="preserve"> PAGEREF _Toc216182975 \h </w:instrText>
+              <w:instrText xml:space="preserve"> PAGEREF _Toc216271875 \h </w:instrText>
             </w:r>
             <w:r>
               <w:rPr>
@@ -2529,7 +2431,7 @@
                 <w:noProof/>
                 <w:webHidden/>
               </w:rPr>
-              <w:t>5</w:t>
+              <w:t>6</w:t>
             </w:r>
             <w:r>
               <w:rPr>
@@ -2556,7 +2458,7 @@
               <w14:ligatures w14:val="none"/>
             </w:rPr>
           </w:pPr>
-          <w:hyperlink w:anchor="_Toc216182976" w:history="1">
+          <w:hyperlink w:anchor="_Toc216271876" w:history="1">
             <w:r>
               <w:rPr>
                 <w:rStyle w:val="Hyperlink"/>
@@ -2601,7 +2503,7 @@
                 <w:noProof/>
                 <w:webHidden/>
               </w:rPr>
-              <w:instrText xml:space="preserve"> PAGEREF _Toc216182976 \h </w:instrText>
+              <w:instrText xml:space="preserve"> PAGEREF _Toc216271876 \h </w:instrText>
             </w:r>
             <w:r>
               <w:rPr>
@@ -2621,7 +2523,7 @@
                 <w:noProof/>
                 <w:webHidden/>
               </w:rPr>
-              <w:t>5</w:t>
+              <w:t>7</w:t>
             </w:r>
             <w:r>
               <w:rPr>
@@ -2648,7 +2550,7 @@
               <w14:ligatures w14:val="none"/>
             </w:rPr>
           </w:pPr>
-          <w:hyperlink w:anchor="_Toc216182977" w:history="1">
+          <w:hyperlink w:anchor="_Toc216271877" w:history="1">
             <w:r>
               <w:rPr>
                 <w:rStyle w:val="Hyperlink"/>
@@ -2693,7 +2595,7 @@
                 <w:noProof/>
                 <w:webHidden/>
               </w:rPr>
-              <w:instrText xml:space="preserve"> PAGEREF _Toc216182977 \h </w:instrText>
+              <w:instrText xml:space="preserve"> PAGEREF _Toc216271877 \h </w:instrText>
             </w:r>
             <w:r>
               <w:rPr>
@@ -2713,7 +2615,7 @@
                 <w:noProof/>
                 <w:webHidden/>
               </w:rPr>
-              <w:t>6</w:t>
+              <w:t>7</w:t>
             </w:r>
             <w:r>
               <w:rPr>
@@ -2740,7 +2642,7 @@
               <w14:ligatures w14:val="none"/>
             </w:rPr>
           </w:pPr>
-          <w:hyperlink w:anchor="_Toc216182978" w:history="1">
+          <w:hyperlink w:anchor="_Toc216271878" w:history="1">
             <w:r>
               <w:rPr>
                 <w:rStyle w:val="Hyperlink"/>
@@ -2785,7 +2687,7 @@
                 <w:noProof/>
                 <w:webHidden/>
               </w:rPr>
-              <w:instrText xml:space="preserve"> PAGEREF _Toc216182978 \h </w:instrText>
+              <w:instrText xml:space="preserve"> PAGEREF _Toc216271878 \h </w:instrText>
             </w:r>
             <w:r>
               <w:rPr>
@@ -2805,7 +2707,7 @@
                 <w:noProof/>
                 <w:webHidden/>
               </w:rPr>
-              <w:t>6</w:t>
+              <w:t>8</w:t>
             </w:r>
             <w:r>
               <w:rPr>
@@ -2832,7 +2734,7 @@
               <w14:ligatures w14:val="none"/>
             </w:rPr>
           </w:pPr>
-          <w:hyperlink w:anchor="_Toc216182979" w:history="1">
+          <w:hyperlink w:anchor="_Toc216271879" w:history="1">
             <w:r>
               <w:rPr>
                 <w:rStyle w:val="Hyperlink"/>
@@ -2877,7 +2779,7 @@
                 <w:noProof/>
                 <w:webHidden/>
               </w:rPr>
-              <w:instrText xml:space="preserve"> PAGEREF _Toc216182979 \h </w:instrText>
+              <w:instrText xml:space="preserve"> PAGEREF _Toc216271879 \h </w:instrText>
             </w:r>
             <w:r>
               <w:rPr>
@@ -2897,7 +2799,7 @@
                 <w:noProof/>
                 <w:webHidden/>
               </w:rPr>
-              <w:t>6</w:t>
+              <w:t>8</w:t>
             </w:r>
             <w:r>
               <w:rPr>
@@ -2924,7 +2826,7 @@
               <w14:ligatures w14:val="none"/>
             </w:rPr>
           </w:pPr>
-          <w:hyperlink w:anchor="_Toc216182980" w:history="1">
+          <w:hyperlink w:anchor="_Toc216271880" w:history="1">
             <w:r>
               <w:rPr>
                 <w:rStyle w:val="Hyperlink"/>
@@ -2969,7 +2871,7 @@
                 <w:noProof/>
                 <w:webHidden/>
               </w:rPr>
-              <w:instrText xml:space="preserve"> PAGEREF _Toc216182980 \h </w:instrText>
+              <w:instrText xml:space="preserve"> PAGEREF _Toc216271880 \h </w:instrText>
             </w:r>
             <w:r>
               <w:rPr>
@@ -2989,7 +2891,7 @@
                 <w:noProof/>
                 <w:webHidden/>
               </w:rPr>
-              <w:t>7</w:t>
+              <w:t>8</w:t>
             </w:r>
             <w:r>
               <w:rPr>
@@ -3016,7 +2918,7 @@
               <w14:ligatures w14:val="none"/>
             </w:rPr>
           </w:pPr>
-          <w:hyperlink w:anchor="_Toc216182981" w:history="1">
+          <w:hyperlink w:anchor="_Toc216271881" w:history="1">
             <w:r>
               <w:rPr>
                 <w:rStyle w:val="Hyperlink"/>
@@ -3061,7 +2963,7 @@
                 <w:noProof/>
                 <w:webHidden/>
               </w:rPr>
-              <w:instrText xml:space="preserve"> PAGEREF _Toc216182981 \h </w:instrText>
+              <w:instrText xml:space="preserve"> PAGEREF _Toc216271881 \h </w:instrText>
             </w:r>
             <w:r>
               <w:rPr>
@@ -3081,7 +2983,7 @@
                 <w:noProof/>
                 <w:webHidden/>
               </w:rPr>
-              <w:t>7</w:t>
+              <w:t>9</w:t>
             </w:r>
             <w:r>
               <w:rPr>
@@ -3108,7 +3010,7 @@
               <w14:ligatures w14:val="none"/>
             </w:rPr>
           </w:pPr>
-          <w:hyperlink w:anchor="_Toc216182982" w:history="1">
+          <w:hyperlink w:anchor="_Toc216271882" w:history="1">
             <w:r>
               <w:rPr>
                 <w:rStyle w:val="Hyperlink"/>
@@ -3153,7 +3055,7 @@
                 <w:noProof/>
                 <w:webHidden/>
               </w:rPr>
-              <w:instrText xml:space="preserve"> PAGEREF _Toc216182982 \h </w:instrText>
+              <w:instrText xml:space="preserve"> PAGEREF _Toc216271882 \h </w:instrText>
             </w:r>
             <w:r>
               <w:rPr>
@@ -3173,7 +3075,375 @@
                 <w:noProof/>
                 <w:webHidden/>
               </w:rPr>
-              <w:t>7</w:t>
+              <w:t>9</w:t>
+            </w:r>
+            <w:r>
+              <w:rPr>
+                <w:noProof/>
+                <w:webHidden/>
+              </w:rPr>
+              <w:fldChar w:fldCharType="end"/>
+            </w:r>
+          </w:hyperlink>
+        </w:p>
+        <w:p>
+          <w:pPr>
+            <w:pStyle w:val="Sumrio1"/>
+            <w:tabs>
+              <w:tab w:val="left" w:pos="480"/>
+              <w:tab w:val="right" w:leader="dot" w:pos="9127"/>
+            </w:tabs>
+            <w:rPr>
+              <w:rFonts w:asciiTheme="minorHAnsi" w:eastAsiaTheme="minorEastAsia" w:hAnsiTheme="minorHAnsi" w:cstheme="minorBidi"/>
+              <w:noProof/>
+              <w:color w:val="auto"/>
+              <w:kern w:val="0"/>
+              <w:szCs w:val="22"/>
+              <w14:ligatures w14:val="none"/>
+            </w:rPr>
+          </w:pPr>
+          <w:hyperlink w:anchor="_Toc216271883" w:history="1">
+            <w:r>
+              <w:rPr>
+                <w:rStyle w:val="Hyperlink"/>
+                <w:noProof/>
+              </w:rPr>
+              <w:t>4.</w:t>
+            </w:r>
+            <w:r>
+              <w:rPr>
+                <w:rFonts w:asciiTheme="minorHAnsi" w:eastAsiaTheme="minorEastAsia" w:hAnsiTheme="minorHAnsi" w:cstheme="minorBidi"/>
+                <w:noProof/>
+                <w:color w:val="auto"/>
+                <w:kern w:val="0"/>
+                <w:szCs w:val="22"/>
+                <w14:ligatures w14:val="none"/>
+              </w:rPr>
+              <w:tab/>
+            </w:r>
+            <w:r>
+              <w:rPr>
+                <w:rStyle w:val="Hyperlink"/>
+                <w:noProof/>
+              </w:rPr>
+              <w:t>Técnicas Utilizadas</w:t>
+            </w:r>
+            <w:r>
+              <w:rPr>
+                <w:noProof/>
+                <w:webHidden/>
+              </w:rPr>
+              <w:tab/>
+            </w:r>
+            <w:r>
+              <w:rPr>
+                <w:noProof/>
+                <w:webHidden/>
+              </w:rPr>
+              <w:fldChar w:fldCharType="begin"/>
+            </w:r>
+            <w:r>
+              <w:rPr>
+                <w:noProof/>
+                <w:webHidden/>
+              </w:rPr>
+              <w:instrText xml:space="preserve"> PAGEREF _Toc216271883 \h </w:instrText>
+            </w:r>
+            <w:r>
+              <w:rPr>
+                <w:noProof/>
+                <w:webHidden/>
+              </w:rPr>
+            </w:r>
+            <w:r>
+              <w:rPr>
+                <w:noProof/>
+                <w:webHidden/>
+              </w:rPr>
+              <w:fldChar w:fldCharType="separate"/>
+            </w:r>
+            <w:r>
+              <w:rPr>
+                <w:noProof/>
+                <w:webHidden/>
+              </w:rPr>
+              <w:t>11</w:t>
+            </w:r>
+            <w:r>
+              <w:rPr>
+                <w:noProof/>
+                <w:webHidden/>
+              </w:rPr>
+              <w:fldChar w:fldCharType="end"/>
+            </w:r>
+          </w:hyperlink>
+        </w:p>
+        <w:p>
+          <w:pPr>
+            <w:pStyle w:val="Sumrio2"/>
+            <w:tabs>
+              <w:tab w:val="left" w:pos="660"/>
+              <w:tab w:val="right" w:leader="dot" w:pos="9127"/>
+            </w:tabs>
+            <w:rPr>
+              <w:rFonts w:asciiTheme="minorHAnsi" w:eastAsiaTheme="minorEastAsia" w:hAnsiTheme="minorHAnsi" w:cstheme="minorBidi"/>
+              <w:noProof/>
+              <w:color w:val="auto"/>
+              <w:kern w:val="0"/>
+              <w:szCs w:val="22"/>
+              <w14:ligatures w14:val="none"/>
+            </w:rPr>
+          </w:pPr>
+          <w:hyperlink w:anchor="_Toc216271884" w:history="1">
+            <w:r>
+              <w:rPr>
+                <w:rStyle w:val="Hyperlink"/>
+                <w:noProof/>
+              </w:rPr>
+              <w:t>4.1.</w:t>
+            </w:r>
+            <w:r>
+              <w:rPr>
+                <w:rFonts w:asciiTheme="minorHAnsi" w:eastAsiaTheme="minorEastAsia" w:hAnsiTheme="minorHAnsi" w:cstheme="minorBidi"/>
+                <w:noProof/>
+                <w:color w:val="auto"/>
+                <w:kern w:val="0"/>
+                <w:szCs w:val="22"/>
+                <w14:ligatures w14:val="none"/>
+              </w:rPr>
+              <w:tab/>
+            </w:r>
+            <w:r>
+              <w:rPr>
+                <w:rStyle w:val="Hyperlink"/>
+                <w:noProof/>
+              </w:rPr>
+              <w:t>Requisitos funcionais</w:t>
+            </w:r>
+            <w:r>
+              <w:rPr>
+                <w:noProof/>
+                <w:webHidden/>
+              </w:rPr>
+              <w:tab/>
+            </w:r>
+            <w:r>
+              <w:rPr>
+                <w:noProof/>
+                <w:webHidden/>
+              </w:rPr>
+              <w:fldChar w:fldCharType="begin"/>
+            </w:r>
+            <w:r>
+              <w:rPr>
+                <w:noProof/>
+                <w:webHidden/>
+              </w:rPr>
+              <w:instrText xml:space="preserve"> PAGEREF _Toc216271884 \h </w:instrText>
+            </w:r>
+            <w:r>
+              <w:rPr>
+                <w:noProof/>
+                <w:webHidden/>
+              </w:rPr>
+            </w:r>
+            <w:r>
+              <w:rPr>
+                <w:noProof/>
+                <w:webHidden/>
+              </w:rPr>
+              <w:fldChar w:fldCharType="separate"/>
+            </w:r>
+            <w:r>
+              <w:rPr>
+                <w:noProof/>
+                <w:webHidden/>
+              </w:rPr>
+              <w:t>12</w:t>
+            </w:r>
+            <w:r>
+              <w:rPr>
+                <w:noProof/>
+                <w:webHidden/>
+              </w:rPr>
+              <w:fldChar w:fldCharType="end"/>
+            </w:r>
+          </w:hyperlink>
+        </w:p>
+        <w:p>
+          <w:pPr>
+            <w:pStyle w:val="Sumrio2"/>
+            <w:tabs>
+              <w:tab w:val="left" w:pos="660"/>
+              <w:tab w:val="right" w:leader="dot" w:pos="9127"/>
+            </w:tabs>
+            <w:rPr>
+              <w:rFonts w:asciiTheme="minorHAnsi" w:eastAsiaTheme="minorEastAsia" w:hAnsiTheme="minorHAnsi" w:cstheme="minorBidi"/>
+              <w:noProof/>
+              <w:color w:val="auto"/>
+              <w:kern w:val="0"/>
+              <w:szCs w:val="22"/>
+              <w14:ligatures w14:val="none"/>
+            </w:rPr>
+          </w:pPr>
+          <w:hyperlink w:anchor="_Toc216271885" w:history="1">
+            <w:r>
+              <w:rPr>
+                <w:rStyle w:val="Hyperlink"/>
+                <w:noProof/>
+              </w:rPr>
+              <w:t>4.2.</w:t>
+            </w:r>
+            <w:r>
+              <w:rPr>
+                <w:rFonts w:asciiTheme="minorHAnsi" w:eastAsiaTheme="minorEastAsia" w:hAnsiTheme="minorHAnsi" w:cstheme="minorBidi"/>
+                <w:noProof/>
+                <w:color w:val="auto"/>
+                <w:kern w:val="0"/>
+                <w:szCs w:val="22"/>
+                <w14:ligatures w14:val="none"/>
+              </w:rPr>
+              <w:tab/>
+            </w:r>
+            <w:r>
+              <w:rPr>
+                <w:rStyle w:val="Hyperlink"/>
+                <w:noProof/>
+              </w:rPr>
+              <w:t>Requisitos não funcionais</w:t>
+            </w:r>
+            <w:r>
+              <w:rPr>
+                <w:noProof/>
+                <w:webHidden/>
+              </w:rPr>
+              <w:tab/>
+            </w:r>
+            <w:r>
+              <w:rPr>
+                <w:noProof/>
+                <w:webHidden/>
+              </w:rPr>
+              <w:fldChar w:fldCharType="begin"/>
+            </w:r>
+            <w:r>
+              <w:rPr>
+                <w:noProof/>
+                <w:webHidden/>
+              </w:rPr>
+              <w:instrText xml:space="preserve"> PAGEREF _Toc216271885 \h </w:instrText>
+            </w:r>
+            <w:r>
+              <w:rPr>
+                <w:noProof/>
+                <w:webHidden/>
+              </w:rPr>
+            </w:r>
+            <w:r>
+              <w:rPr>
+                <w:noProof/>
+                <w:webHidden/>
+              </w:rPr>
+              <w:fldChar w:fldCharType="separate"/>
+            </w:r>
+            <w:r>
+              <w:rPr>
+                <w:noProof/>
+                <w:webHidden/>
+              </w:rPr>
+              <w:t>13</w:t>
+            </w:r>
+            <w:r>
+              <w:rPr>
+                <w:noProof/>
+                <w:webHidden/>
+              </w:rPr>
+              <w:fldChar w:fldCharType="end"/>
+            </w:r>
+          </w:hyperlink>
+        </w:p>
+        <w:p>
+          <w:pPr>
+            <w:pStyle w:val="Sumrio1"/>
+            <w:tabs>
+              <w:tab w:val="left" w:pos="480"/>
+              <w:tab w:val="right" w:leader="dot" w:pos="9127"/>
+            </w:tabs>
+            <w:rPr>
+              <w:rFonts w:asciiTheme="minorHAnsi" w:eastAsiaTheme="minorEastAsia" w:hAnsiTheme="minorHAnsi" w:cstheme="minorBidi"/>
+              <w:noProof/>
+              <w:color w:val="auto"/>
+              <w:kern w:val="0"/>
+              <w:szCs w:val="22"/>
+              <w14:ligatures w14:val="none"/>
+            </w:rPr>
+          </w:pPr>
+          <w:hyperlink w:anchor="_Toc216271886" w:history="1">
+            <w:r>
+              <w:rPr>
+                <w:rStyle w:val="Hyperlink"/>
+                <w:noProof/>
+              </w:rPr>
+              <w:t>5.</w:t>
+            </w:r>
+            <w:r>
+              <w:rPr>
+                <w:rFonts w:asciiTheme="minorHAnsi" w:eastAsiaTheme="minorEastAsia" w:hAnsiTheme="minorHAnsi" w:cstheme="minorBidi"/>
+                <w:noProof/>
+                <w:color w:val="auto"/>
+                <w:kern w:val="0"/>
+                <w:szCs w:val="22"/>
+                <w14:ligatures w14:val="none"/>
+              </w:rPr>
+              <w:tab/>
+            </w:r>
+            <w:r>
+              <w:rPr>
+                <w:rStyle w:val="Hyperlink"/>
+                <w:noProof/>
+              </w:rPr>
+              <w:t>PROTÓTIPOS DE TELA</w:t>
+            </w:r>
+            <w:r>
+              <w:rPr>
+                <w:noProof/>
+                <w:webHidden/>
+              </w:rPr>
+              <w:tab/>
+            </w:r>
+            <w:r>
+              <w:rPr>
+                <w:noProof/>
+                <w:webHidden/>
+              </w:rPr>
+              <w:fldChar w:fldCharType="begin"/>
+            </w:r>
+            <w:r>
+              <w:rPr>
+                <w:noProof/>
+                <w:webHidden/>
+              </w:rPr>
+              <w:instrText xml:space="preserve"> PAGEREF _Toc216271886 \h </w:instrText>
+            </w:r>
+            <w:r>
+              <w:rPr>
+                <w:noProof/>
+                <w:webHidden/>
+              </w:rPr>
+            </w:r>
+            <w:r>
+              <w:rPr>
+                <w:noProof/>
+                <w:webHidden/>
+              </w:rPr>
+              <w:fldChar w:fldCharType="separate"/>
+            </w:r>
+            <w:r>
+              <w:rPr>
+                <w:noProof/>
+                <w:webHidden/>
+              </w:rPr>
+              <w:t>15</w:t>
             </w:r>
             <w:r>
               <w:rPr>
@@ -3268,7 +3538,7 @@
       <w:pPr>
         <w:pStyle w:val="TtulodoProjeto"/>
       </w:pPr>
-      <w:bookmarkStart w:id="1" w:name="_Toc216182974"/>
+      <w:bookmarkStart w:id="1" w:name="_Toc216271874"/>
       <w:r>
         <w:lastRenderedPageBreak/>
         <w:t>INTRODUÇÃO</w:t>
@@ -3329,7 +3599,7 @@
       <w:pPr>
         <w:pStyle w:val="SubttulodoProjeto"/>
       </w:pPr>
-      <w:bookmarkStart w:id="2" w:name="_Toc216182975"/>
+      <w:bookmarkStart w:id="2" w:name="_Toc216271875"/>
       <w:r>
         <w:t>JUSTIFICATIVA</w:t>
       </w:r>
@@ -3401,7 +3671,7 @@
       <w:pPr>
         <w:pStyle w:val="SubttulodoProjeto"/>
       </w:pPr>
-      <w:bookmarkStart w:id="3" w:name="_Toc216182976"/>
+      <w:bookmarkStart w:id="3" w:name="_Toc216271876"/>
       <w:r>
         <w:t>ESCOPO</w:t>
       </w:r>
@@ -3450,7 +3720,7 @@
       <w:pPr>
         <w:pStyle w:val="SubttulodoProjeto"/>
       </w:pPr>
-      <w:bookmarkStart w:id="4" w:name="_Toc216182977"/>
+      <w:bookmarkStart w:id="4" w:name="_Toc216271877"/>
       <w:r>
         <w:t>DEFINIÇÕES, ACRÔNIMOS E ABREVIAÇÕES</w:t>
       </w:r>
@@ -3506,7 +3776,7 @@
       <w:pPr>
         <w:pStyle w:val="TtulodoProjeto"/>
       </w:pPr>
-      <w:bookmarkStart w:id="5" w:name="_Toc216182978"/>
+      <w:bookmarkStart w:id="5" w:name="_Toc216271878"/>
       <w:r>
         <w:lastRenderedPageBreak/>
         <w:t>OBJETIVOS</w:t>
@@ -3530,7 +3800,7 @@
       <w:pPr>
         <w:pStyle w:val="SubttulodoProjeto"/>
       </w:pPr>
-      <w:bookmarkStart w:id="6" w:name="_Toc216182979"/>
+      <w:bookmarkStart w:id="6" w:name="_Toc216271879"/>
       <w:r>
         <w:t>OBJETIVO GERAL</w:t>
       </w:r>
@@ -3614,7 +3884,7 @@
       <w:pPr>
         <w:pStyle w:val="SubttulodoProjeto"/>
       </w:pPr>
-      <w:bookmarkStart w:id="7" w:name="_Toc216182980"/>
+      <w:bookmarkStart w:id="7" w:name="_Toc216271880"/>
       <w:r>
         <w:t>OBJETIVOS ESPECÍFICOS</w:t>
       </w:r>
@@ -3741,7 +4011,7 @@
       <w:pPr>
         <w:pStyle w:val="SubttulodoProjeto"/>
       </w:pPr>
-      <w:bookmarkStart w:id="8" w:name="_Toc216182981"/>
+      <w:bookmarkStart w:id="8" w:name="_Toc216271881"/>
       <w:r>
         <w:lastRenderedPageBreak/>
         <w:t>ANÁLISE E PROJETO</w:t>
@@ -3765,7 +4035,7 @@
       <w:pPr>
         <w:pStyle w:val="TtulodoProjeto"/>
       </w:pPr>
-      <w:bookmarkStart w:id="9" w:name="_Toc216182982"/>
+      <w:bookmarkStart w:id="9" w:name="_Toc216271882"/>
       <w:r>
         <w:t>VISÃO GERAL DO SISTEMA</w:t>
       </w:r>
@@ -3915,15 +4185,7 @@
         <w:t>Editar perfil: nome</w:t>
       </w:r>
       <w:r>
-        <w:t xml:space="preserve">, </w:t>
-      </w:r>
-      <w:proofErr w:type="spellStart"/>
-      <w:r>
-        <w:t>email</w:t>
-      </w:r>
-      <w:proofErr w:type="spellEnd"/>
-      <w:r>
-        <w:t xml:space="preserve">, senha </w:t>
+        <w:t xml:space="preserve">, email, senha </w:t>
       </w:r>
     </w:p>
     <w:p>
@@ -3935,11 +4197,9 @@
         <w:spacing w:after="134"/>
         <w:ind w:right="131"/>
       </w:pPr>
-      <w:proofErr w:type="gramStart"/>
       <w:r>
         <w:t>Curtir</w:t>
       </w:r>
-      <w:proofErr w:type="gramEnd"/>
       <w:r>
         <w:t xml:space="preserve"> filmes, adicionar avaliações e comentários após assistir.</w:t>
       </w:r>
@@ -4033,13 +4293,8 @@
       <w:r>
         <w:t xml:space="preserve">Login com </w:t>
       </w:r>
-      <w:proofErr w:type="spellStart"/>
-      <w:r>
-        <w:t>email</w:t>
-      </w:r>
-      <w:proofErr w:type="spellEnd"/>
-      <w:r>
-        <w:t xml:space="preserve"> </w:t>
+      <w:r>
+        <w:t xml:space="preserve">email </w:t>
       </w:r>
       <w:r>
         <w:t>e senha, ou via Google/Facebook.</w:t>
@@ -4055,15 +4310,7 @@
         <w:ind w:right="131"/>
       </w:pPr>
       <w:r>
-        <w:t xml:space="preserve">Recuperação de senha via </w:t>
-      </w:r>
-      <w:proofErr w:type="spellStart"/>
-      <w:r>
-        <w:t>email</w:t>
-      </w:r>
-      <w:proofErr w:type="spellEnd"/>
-      <w:r>
-        <w:t xml:space="preserve"> com código de verificação.</w:t>
+        <w:t>Recuperação de senha via email com código de verificação.</w:t>
       </w:r>
     </w:p>
     <w:p>
@@ -4078,11 +4325,9 @@
       <w:r>
         <w:t xml:space="preserve">Cadastro de conta com informações pessoais: nome, </w:t>
       </w:r>
-      <w:proofErr w:type="spellStart"/>
       <w:r>
         <w:t>email</w:t>
       </w:r>
-      <w:proofErr w:type="spellEnd"/>
       <w:r>
         <w:t>, data de nascimento</w:t>
       </w:r>
@@ -4396,18 +4641,99 @@
     </w:p>
     <w:p>
       <w:pPr>
+        <w:pStyle w:val="SubttulodoProjeto"/>
+        <w:numPr>
+          <w:ilvl w:val="0"/>
+          <w:numId w:val="0"/>
+        </w:numPr>
+        <w:ind w:left="1440"/>
+      </w:pPr>
+    </w:p>
+    <w:p>
+      <w:pPr>
+        <w:pStyle w:val="TtulodoProjeto"/>
+      </w:pPr>
+      <w:bookmarkStart w:id="10" w:name="_Toc216271883"/>
+      <w:r>
+        <w:t>Técnicas Utilizadas</w:t>
+      </w:r>
+      <w:bookmarkEnd w:id="10"/>
+      <w:r>
+        <w:t xml:space="preserve"> </w:t>
+      </w:r>
+    </w:p>
+    <w:p>
+      <w:pPr>
         <w:spacing w:after="116" w:line="259" w:lineRule="auto"/>
         <w:ind w:left="0" w:right="0" w:firstLine="0"/>
         <w:jc w:val="left"/>
       </w:pPr>
-    </w:p>
-    <w:p>
-      <w:pPr>
-        <w:pStyle w:val="SubttulodoProjeto"/>
-      </w:pPr>
-      <w:r>
-        <w:t xml:space="preserve">Técnicas Utilizadas </w:t>
-      </w:r>
+      <w:r>
+        <w:t xml:space="preserve"> </w:t>
+      </w:r>
+    </w:p>
+    <w:p>
+      <w:pPr>
+        <w:pStyle w:val="PargrafodoProjeto"/>
+      </w:pPr>
+      <w:r>
+        <w:t xml:space="preserve">    </w:t>
+      </w:r>
+      <w:r>
+        <w:t>Para a definição dos requisitos funcionais do sistema, utilizamos a técnica de especificação por descrição textual estruturada, organizada em um quadro com código, nome, descrição</w:t>
+      </w:r>
+      <w:r>
+        <w:t xml:space="preserve">. </w:t>
+      </w:r>
+      <w:r>
+        <w:t>Esses requisitos foram levantados com base nos objetivos do projeto e na experiência esperada dos usuários, buscando garantir uma navegação intuitiva e o uso eficiente das funcionalidades principais.</w:t>
+      </w:r>
+    </w:p>
+    <w:p>
+      <w:pPr>
+        <w:pStyle w:val="PargrafodoProjeto"/>
+      </w:pPr>
+      <w:r>
+        <w:t>Além disso, os requisitos foram organizados conforme sua relevância para o funcionamento básico do sistema, priorizando funcionalidades como visualização de filmes, autenticação, cadastro de usuários e painel administrativo. A descrição clara e direta de cada requisito serviu como base para os protótipos de interface e para orientar o desenvolvimento.</w:t>
+      </w:r>
+    </w:p>
+    <w:p>
+      <w:pPr>
+        <w:pStyle w:val="PargrafodoProjeto"/>
+      </w:pPr>
+      <w:r>
+        <w:t>Essa abordagem facilitou a criação dos protótipos, uma vez que cada requisito impactou diretamente o planejamento das telas do sistema, como página de login, cadastro, listagem de filmes, reservas, perfil de usuário, entre outras.</w:t>
+      </w:r>
+    </w:p>
+    <w:p>
+      <w:pPr>
+        <w:spacing w:line="360" w:lineRule="auto"/>
+        <w:ind w:left="-5" w:right="131"/>
+      </w:pPr>
+      <w:r>
+        <w:t>Os requisitos não funcionais foram definidos considerando as características de qualidade esperadas, como segurança, desempenho, disponibilidade e organização interna da arquitetura. Para isso, adotamos a técnica de categorização, dividindo-os em Produto (funcionalidades e usabilidade), Organizacional (regras e padrões de implementação) e Externo (integrações e uso de recursos de terceiros).</w:t>
+      </w:r>
+    </w:p>
+    <w:p>
+      <w:pPr>
+        <w:spacing w:line="360" w:lineRule="auto"/>
+        <w:ind w:left="-5" w:right="131"/>
+      </w:pPr>
+    </w:p>
+    <w:p>
+      <w:pPr>
+        <w:spacing w:line="360" w:lineRule="auto"/>
+        <w:ind w:left="-5" w:right="131"/>
+      </w:pPr>
+      <w:r>
+        <w:t>A coleta e documentação desses requisitos seguiram boas práticas da engenharia de software, garantindo um sistema confiável, eficiente e seguro. Por exemplo, requisitos como autenticação em dois fatores, criptografia de dados sensíveis, controle de duplicidade de cadastros e uso flexível de APIs para trailers (YouTube, Vimeo etc.) foram fundamentais para definir os padrões técnicos a serem adotados.</w:t>
+      </w:r>
+    </w:p>
+    <w:p>
+      <w:pPr>
+        <w:spacing w:line="360" w:lineRule="auto"/>
+        <w:ind w:left="-5" w:right="131"/>
+      </w:pPr>
     </w:p>
     <w:p>
       <w:pPr>
@@ -4416,79 +4742,15 @@
         <w:jc w:val="left"/>
       </w:pPr>
       <w:r>
-        <w:t xml:space="preserve"> </w:t>
-      </w:r>
-    </w:p>
-    <w:p>
-      <w:pPr>
-        <w:pStyle w:val="PargrafodoProjeto"/>
-      </w:pPr>
-      <w:r>
-        <w:t xml:space="preserve">    </w:t>
-      </w:r>
-      <w:r>
-        <w:t>Para a definição dos requisitos funcionais do sistema, utilizamos a técnica de especificação por descrição textual estruturada, organizada em um quadro com código, nome, descrição</w:t>
-      </w:r>
-      <w:r>
-        <w:t xml:space="preserve">. </w:t>
-      </w:r>
-      <w:r>
-        <w:t>Esses requisitos foram levantados com base nos objetivos do projeto e na experiência esperada dos usuários, buscando garantir uma navegação intuitiva e o uso eficiente das funcionalidades principais.</w:t>
-      </w:r>
-    </w:p>
-    <w:p>
-      <w:pPr>
-        <w:pStyle w:val="PargrafodoProjeto"/>
-      </w:pPr>
-      <w:r>
-        <w:t>Além disso, os requisitos foram organizados conforme sua relevância para o funcionamento básico do sistema, priorizando funcionalidades como visualização de filmes, autenticação, cadastro de usuários e painel administrativo. A descrição clara e direta de cada requisito serviu como base para os protótipos de interface e para orientar o desenvolvimento.</w:t>
-      </w:r>
-    </w:p>
-    <w:p>
-      <w:pPr>
-        <w:pStyle w:val="PargrafodoProjeto"/>
-      </w:pPr>
-      <w:r>
-        <w:t>Essa abordagem facilitou a criação dos protótipos, uma vez que cada requisito impactou diretamente o planejamento das telas do sistema, como página de login, cadastro, listagem de filmes, reservas, perfil de usuário, entre outras.</w:t>
-      </w:r>
-    </w:p>
-    <w:p>
-      <w:pPr>
-        <w:spacing w:line="360" w:lineRule="auto"/>
-        <w:ind w:left="-5" w:right="131"/>
-      </w:pPr>
-      <w:r>
-        <w:t>Os requisitos não funcionais foram definidos considerando as características de qualidade esperadas, como segurança, desempenho, disponibilidade e organização interna da arquitetura. Para isso, adotamos a técnica de categorização, dividindo-os em Produto (funcionalidades e usabilidade), Organizacional (regras e padrões de implementação) e Externo (integrações e uso de recursos de terceiros).</w:t>
-      </w:r>
-    </w:p>
-    <w:p>
-      <w:pPr>
-        <w:spacing w:line="360" w:lineRule="auto"/>
-        <w:ind w:left="-5" w:right="131"/>
-      </w:pPr>
-    </w:p>
-    <w:p>
-      <w:pPr>
-        <w:spacing w:line="360" w:lineRule="auto"/>
-        <w:ind w:left="-5" w:right="131"/>
-      </w:pPr>
-      <w:r>
-        <w:t xml:space="preserve">A coleta e documentação desses requisitos seguiram boas práticas da engenharia de software, garantindo um sistema confiável, eficiente e seguro. Por exemplo, requisitos como autenticação em dois fatores, criptografia de dados sensíveis, controle de duplicidade de cadastros e uso flexível de APIs para trailers (YouTube, </w:t>
-      </w:r>
-      <w:proofErr w:type="spellStart"/>
-      <w:r>
-        <w:t>Vimeo</w:t>
-      </w:r>
-      <w:proofErr w:type="spellEnd"/>
-      <w:r>
-        <w:t xml:space="preserve"> etc.) foram fundamentais para definir os padrões técnicos a serem adotados.</w:t>
-      </w:r>
-    </w:p>
-    <w:p>
-      <w:pPr>
-        <w:spacing w:line="360" w:lineRule="auto"/>
-        <w:ind w:left="-5" w:right="131"/>
-      </w:pPr>
+        <w:lastRenderedPageBreak/>
+        <w:t>Quanto à tecnologia, a definição inicial previa o uso da linguagem Java com arquitetura MVC e Jakarta EE, porém, devido à necessidade de escalabilidade e modularidade, foi decidido adotar o framework Django</w:t>
+      </w:r>
+      <w:r>
+        <w:t xml:space="preserve"> com MVT</w:t>
+      </w:r>
+      <w:r>
+        <w:t>, utilizando a linguagem Python, que oferece maior flexibilidade e desempenho para a equipe."</w:t>
+      </w:r>
     </w:p>
     <w:p>
       <w:pPr>
@@ -4496,35 +4758,18 @@
         <w:ind w:left="0" w:right="0" w:firstLine="0"/>
         <w:jc w:val="left"/>
       </w:pPr>
-      <w:r>
-        <w:lastRenderedPageBreak/>
-        <w:t>Quanto à tecnologia, a definição inicial previa o uso da linguagem Java com arquitetura MVC e Jakarta EE, porém, devido à necessidade de escalabilidade e modularidade, foi decidido adotar o framework Django</w:t>
-      </w:r>
-      <w:r>
-        <w:t xml:space="preserve"> com MVT</w:t>
-      </w:r>
-      <w:r>
-        <w:t>, utilizando a linguagem Python, que oferece maior flexibilidade e desempenho para a equipe."</w:t>
-      </w:r>
-    </w:p>
-    <w:p>
-      <w:pPr>
-        <w:spacing w:after="116" w:line="259" w:lineRule="auto"/>
-        <w:ind w:left="0" w:right="0" w:firstLine="0"/>
-        <w:jc w:val="left"/>
-      </w:pPr>
-    </w:p>
-    <w:p>
-      <w:pPr>
-        <w:spacing w:after="120" w:line="259" w:lineRule="auto"/>
-        <w:ind w:left="-5" w:right="0"/>
-        <w:jc w:val="left"/>
-      </w:pPr>
-      <w:r>
-        <w:rPr>
-          <w:b/>
-        </w:rPr>
-        <w:t xml:space="preserve">2.2.2 Requisitos funcionais </w:t>
+    </w:p>
+    <w:p>
+      <w:pPr>
+        <w:pStyle w:val="SubttulodoProjeto"/>
+      </w:pPr>
+      <w:bookmarkStart w:id="11" w:name="_Toc216271884"/>
+      <w:r>
+        <w:t>Requisitos funcionais</w:t>
+      </w:r>
+      <w:bookmarkEnd w:id="11"/>
+      <w:r>
+        <w:t xml:space="preserve"> </w:t>
       </w:r>
     </w:p>
     <w:p>
@@ -6075,15 +6320,18 @@
     </w:p>
     <w:p>
       <w:pPr>
-        <w:spacing w:after="120" w:line="259" w:lineRule="auto"/>
-        <w:ind w:left="-5" w:right="0"/>
-        <w:jc w:val="left"/>
-      </w:pPr>
-      <w:r>
-        <w:rPr>
-          <w:b/>
-        </w:rPr>
-        <w:t xml:space="preserve">2.2.3 Requisitos não funcionais </w:t>
+        <w:pStyle w:val="SubttulodoProjeto"/>
+      </w:pPr>
+      <w:r>
+        <w:t xml:space="preserve"> </w:t>
+      </w:r>
+      <w:bookmarkStart w:id="12" w:name="_Toc216271885"/>
+      <w:r>
+        <w:t>Requisitos não funcionais</w:t>
+      </w:r>
+      <w:bookmarkEnd w:id="12"/>
+      <w:r>
+        <w:t xml:space="preserve"> </w:t>
       </w:r>
     </w:p>
     <w:p>
@@ -6592,14 +6840,12 @@
               </w:rPr>
               <w:t xml:space="preserve"> </w:t>
             </w:r>
-            <w:proofErr w:type="spellStart"/>
             <w:r>
               <w:rPr>
                 <w:rFonts w:ascii="Times New Roman" w:eastAsia="Times New Roman" w:hAnsi="Times New Roman" w:cs="Times New Roman"/>
               </w:rPr>
               <w:t>hash</w:t>
             </w:r>
-            <w:proofErr w:type="spellEnd"/>
             <w:r>
               <w:rPr>
                 <w:rFonts w:ascii="Times New Roman" w:eastAsia="Times New Roman" w:hAnsi="Times New Roman" w:cs="Times New Roman"/>
@@ -7191,23 +7437,7 @@
               <w:ind w:left="5" w:right="60" w:firstLine="0"/>
             </w:pPr>
             <w:r>
-              <w:t xml:space="preserve">O design do sistema deve seguir o padrão de arquitetura Model </w:t>
-            </w:r>
-            <w:proofErr w:type="spellStart"/>
-            <w:r>
-              <w:t>View</w:t>
-            </w:r>
-            <w:proofErr w:type="spellEnd"/>
-            <w:r>
-              <w:t xml:space="preserve"> </w:t>
-            </w:r>
-            <w:proofErr w:type="spellStart"/>
-            <w:r>
-              <w:t>Template</w:t>
-            </w:r>
-            <w:proofErr w:type="spellEnd"/>
-            <w:r>
-              <w:t xml:space="preserve"> (MVT), conforme definido pelo framework.</w:t>
+              <w:t>O design do sistema deve seguir o padrão de arquitetura Model View Template (MVT), conforme definido pelo framework.</w:t>
             </w:r>
           </w:p>
         </w:tc>
@@ -7799,25 +8029,16 @@
     </w:p>
     <w:p>
       <w:pPr>
-        <w:spacing w:after="126" w:line="259" w:lineRule="auto"/>
-        <w:ind w:left="0" w:right="0" w:firstLine="0"/>
-        <w:jc w:val="left"/>
-        <w:rPr>
-          <w:b/>
-        </w:rPr>
-      </w:pPr>
-      <w:r>
-        <w:rPr>
-          <w:b/>
-        </w:rPr>
-        <w:t xml:space="preserve">2.2 </w:t>
-      </w:r>
-      <w:r>
-        <w:rPr>
-          <w:b/>
-        </w:rPr>
+        <w:pStyle w:val="TtulodoProjeto"/>
+      </w:pPr>
+      <w:r>
+        <w:t xml:space="preserve"> </w:t>
+      </w:r>
+      <w:bookmarkStart w:id="13" w:name="_Toc216271886"/>
+      <w:r>
         <w:t>PROTÓTIPOS DE TELA</w:t>
       </w:r>
+      <w:bookmarkEnd w:id="13"/>
     </w:p>
     <w:p>
       <w:pPr>
@@ -7886,25 +8107,38 @@
         <w:pStyle w:val="Legenda"/>
         <w:jc w:val="center"/>
       </w:pPr>
-      <w:bookmarkStart w:id="10" w:name="_Toc216246692"/>
+      <w:bookmarkStart w:id="14" w:name="_Toc216271857"/>
       <w:r>
         <w:t xml:space="preserve">Figura </w:t>
       </w:r>
-      <w:fldSimple w:instr=" SEQ Figura \* ARABIC ">
-        <w:r>
-          <w:rPr>
-            <w:noProof/>
-          </w:rPr>
-          <w:t>1</w:t>
-        </w:r>
-      </w:fldSimple>
+      <w:r>
+        <w:fldChar w:fldCharType="begin"/>
+      </w:r>
+      <w:r>
+        <w:instrText xml:space="preserve"> SEQ Figura \* ARABIC </w:instrText>
+      </w:r>
+      <w:r>
+        <w:fldChar w:fldCharType="separate"/>
+      </w:r>
+      <w:r>
+        <w:rPr>
+          <w:noProof/>
+        </w:rPr>
+        <w:t>1</w:t>
+      </w:r>
+      <w:r>
+        <w:rPr>
+          <w:noProof/>
+        </w:rPr>
+        <w:fldChar w:fldCharType="end"/>
+      </w:r>
       <w:r>
         <w:t xml:space="preserve"> -</w:t>
       </w:r>
       <w:r>
         <w:t>Tela inicial</w:t>
       </w:r>
-      <w:bookmarkEnd w:id="10"/>
+      <w:bookmarkEnd w:id="14"/>
     </w:p>
     <w:p>
       <w:pPr>
@@ -7936,14 +8170,12 @@
       <w:r>
         <w:t xml:space="preserve"> vertical, comum em interfaces móveis. Os filmes destacados são </w:t>
       </w:r>
-      <w:proofErr w:type="spellStart"/>
       <w:r>
         <w:rPr>
           <w:bCs/>
         </w:rPr>
         <w:t>Interstellar</w:t>
       </w:r>
-      <w:proofErr w:type="spellEnd"/>
       <w:r>
         <w:t xml:space="preserve">, </w:t>
       </w:r>
@@ -7960,21 +8192,70 @@
         <w:rPr>
           <w:iCs/>
         </w:rPr>
-        <w:t xml:space="preserve">The </w:t>
-      </w:r>
-      <w:proofErr w:type="spellStart"/>
+        <w:t>The Imitation Game</w:t>
+      </w:r>
+      <w:r>
+        <w:t xml:space="preserve">) e </w:t>
+      </w:r>
+      <w:r>
+        <w:rPr>
+          <w:bCs/>
+        </w:rPr>
+        <w:t>Oppenheimer</w:t>
+      </w:r>
+      <w:r>
+        <w:t xml:space="preserve">. Cada </w:t>
+      </w:r>
       <w:r>
         <w:rPr>
           <w:iCs/>
         </w:rPr>
-        <w:t>Imitation</w:t>
-      </w:r>
-      <w:proofErr w:type="spellEnd"/>
+        <w:t>card</w:t>
+      </w:r>
+      <w:r>
+        <w:t xml:space="preserve"> de filme apresenta a </w:t>
+      </w:r>
+      <w:r>
+        <w:rPr>
+          <w:bCs/>
+        </w:rPr>
+        <w:t>capa</w:t>
+      </w:r>
+      <w:r>
+        <w:t xml:space="preserve"> do longa-metragem, o </w:t>
+      </w:r>
+      <w:r>
+        <w:rPr>
+          <w:bCs/>
+        </w:rPr>
+        <w:t>título</w:t>
+      </w:r>
+      <w:r>
+        <w:t xml:space="preserve"> em destaque, informações como </w:t>
+      </w:r>
+      <w:r>
+        <w:rPr>
+          <w:bCs/>
+        </w:rPr>
+        <w:t>gênero</w:t>
+      </w:r>
+      <w:r>
+        <w:t xml:space="preserve"> (ficção, Nacional; </w:t>
+      </w:r>
       <w:r>
         <w:rPr>
           <w:iCs/>
         </w:rPr>
-        <w:t xml:space="preserve"> Game</w:t>
+        <w:t>thriller</w:t>
+      </w:r>
+      <w:r>
+        <w:t xml:space="preserve">, guerra; </w:t>
+      </w:r>
+      <w:r>
+        <w:rPr>
+          <w:iCs/>
+        </w:rPr>
+        <w:t>suspense</w:t>
       </w:r>
       <w:r>
         <w:t xml:space="preserve">) e </w:t>
@@ -7983,99 +8264,28 @@
         <w:rPr>
           <w:bCs/>
         </w:rPr>
-        <w:t>Oppenheimer</w:t>
-      </w:r>
-      <w:r>
-        <w:t xml:space="preserve">. Cada </w:t>
-      </w:r>
-      <w:r>
-        <w:rPr>
-          <w:iCs/>
-        </w:rPr>
-        <w:t>card</w:t>
-      </w:r>
-      <w:r>
-        <w:t xml:space="preserve"> de filme apresenta a </w:t>
+        <w:t>duração</w:t>
+      </w:r>
+      <w:r>
+        <w:t xml:space="preserve"> (2h 49min, 1h 54min, 3h), e um </w:t>
       </w:r>
       <w:r>
         <w:rPr>
           <w:bCs/>
         </w:rPr>
-        <w:t>capa</w:t>
-      </w:r>
-      <w:r>
-        <w:t xml:space="preserve"> do longa-metragem, o </w:t>
+        <w:t>botão central</w:t>
+      </w:r>
+      <w:r>
+        <w:t xml:space="preserve"> com a chamada "Acessar filme" para iniciar a reprodução. Elementos de </w:t>
       </w:r>
       <w:r>
         <w:rPr>
           <w:bCs/>
         </w:rPr>
-        <w:t>título</w:t>
-      </w:r>
-      <w:r>
-        <w:t xml:space="preserve"> em destaque, informações como </w:t>
-      </w:r>
-      <w:r>
-        <w:rPr>
-          <w:bCs/>
-        </w:rPr>
-        <w:t>gênero</w:t>
-      </w:r>
-      <w:r>
-        <w:t xml:space="preserve"> (ficção, Nacional; </w:t>
-      </w:r>
-      <w:r>
-        <w:rPr>
-          <w:iCs/>
-        </w:rPr>
-        <w:t>thriller</w:t>
-      </w:r>
-      <w:r>
-        <w:t xml:space="preserve">, guerra; </w:t>
-      </w:r>
-      <w:r>
-        <w:rPr>
-          <w:iCs/>
-        </w:rPr>
-        <w:t>suspense</w:t>
-      </w:r>
-      <w:r>
-        <w:t xml:space="preserve">) e </w:t>
-      </w:r>
-      <w:r>
-        <w:rPr>
-          <w:bCs/>
-        </w:rPr>
-        <w:t>duração</w:t>
-      </w:r>
-      <w:r>
-        <w:t xml:space="preserve"> (2h 49min, 1h 54min, 3h), e um </w:t>
-      </w:r>
-      <w:r>
-        <w:rPr>
-          <w:bCs/>
-        </w:rPr>
-        <w:t>botão central</w:t>
-      </w:r>
-      <w:r>
-        <w:t xml:space="preserve"> com a chamada "Acessar filme" para iniciar a reprodução. Elementos de </w:t>
-      </w:r>
-      <w:r>
-        <w:rPr>
-          <w:bCs/>
-        </w:rPr>
         <w:t>navegação</w:t>
       </w:r>
       <w:r>
-        <w:t xml:space="preserve"> como setas laterais (</w:t>
-      </w:r>
-      <w:proofErr w:type="gramStart"/>
-      <w:r>
-        <w:t>&lt;  &gt;</w:t>
-      </w:r>
-      <w:proofErr w:type="gramEnd"/>
-      <w:r>
-        <w:t xml:space="preserve">) permitem a rolagem entre os </w:t>
+        <w:t xml:space="preserve"> como setas laterais (&lt;  &gt;) permitem a rolagem entre os </w:t>
       </w:r>
       <w:r>
         <w:rPr>
@@ -8178,32 +8388,22 @@
         <w:pStyle w:val="Legenda"/>
         <w:jc w:val="center"/>
       </w:pPr>
-      <w:bookmarkStart w:id="11" w:name="_Toc216246693"/>
+      <w:bookmarkStart w:id="15" w:name="_Toc216271858"/>
       <w:r>
         <w:t xml:space="preserve">Figura </w:t>
       </w:r>
-      <w:r>
-        <w:fldChar w:fldCharType="begin"/>
-      </w:r>
-      <w:r>
-        <w:instrText xml:space="preserve"> SEQ Figura \* ARABIC </w:instrText>
-      </w:r>
-      <w:r>
-        <w:fldChar w:fldCharType="separate"/>
-      </w:r>
-      <w:r>
-        <w:rPr>
-          <w:noProof/>
-        </w:rPr>
-        <w:t>2</w:t>
-      </w:r>
-      <w:r>
-        <w:fldChar w:fldCharType="end"/>
-      </w:r>
+      <w:fldSimple w:instr=" SEQ Figura \* ARABIC ">
+        <w:r>
+          <w:rPr>
+            <w:noProof/>
+          </w:rPr>
+          <w:t>2</w:t>
+        </w:r>
+      </w:fldSimple>
       <w:r>
         <w:t xml:space="preserve"> - Reservar Filmes</w:t>
       </w:r>
-      <w:bookmarkEnd w:id="11"/>
+      <w:bookmarkEnd w:id="15"/>
     </w:p>
     <w:p>
       <w:pPr>
@@ -8233,23 +8433,7 @@
         <w:t xml:space="preserve"> </w:t>
       </w:r>
       <w:r>
-        <w:t>A tela está dividida em três colunas de informações, uma para cada filme, com uma estética escura. Para Interestelar e O Jogo da Imitação, são mostradas sinopses, classificações de gênero, duração, notas (</w:t>
-      </w:r>
-      <w:proofErr w:type="spellStart"/>
-      <w:r>
-        <w:t>IMDb</w:t>
-      </w:r>
-      <w:proofErr w:type="spellEnd"/>
-      <w:r>
-        <w:t xml:space="preserve"> e </w:t>
-      </w:r>
-      <w:proofErr w:type="spellStart"/>
-      <w:r>
-        <w:t>Metascore</w:t>
-      </w:r>
-      <w:proofErr w:type="spellEnd"/>
-      <w:r>
-        <w:t>) e, mais importante, a Próxima Sessão disponível, que indica a data</w:t>
+        <w:t>A tela está dividida em três colunas de informações, uma para cada filme, com uma estética escura. Para Interestelar e O Jogo da Imitação, são mostradas sinopses, classificações de gênero, duração, notas (IMDb e Metascore) e, mais importante, a Próxima Sessão disponível, que indica a data</w:t>
       </w:r>
       <w:r>
         <w:t xml:space="preserve"> de exemplo</w:t>
@@ -8326,35 +8510,25 @@
         <w:pStyle w:val="Legenda"/>
         <w:jc w:val="center"/>
       </w:pPr>
-      <w:bookmarkStart w:id="12" w:name="_Toc216246694"/>
+      <w:bookmarkStart w:id="16" w:name="_Toc216271859"/>
       <w:r>
         <w:t xml:space="preserve">Figura </w:t>
       </w:r>
-      <w:r>
-        <w:fldChar w:fldCharType="begin"/>
-      </w:r>
-      <w:r>
-        <w:instrText xml:space="preserve"> SEQ Figura \* ARABIC </w:instrText>
-      </w:r>
-      <w:r>
-        <w:fldChar w:fldCharType="separate"/>
-      </w:r>
-      <w:r>
-        <w:rPr>
-          <w:noProof/>
-        </w:rPr>
-        <w:t>3</w:t>
-      </w:r>
-      <w:r>
-        <w:fldChar w:fldCharType="end"/>
-      </w:r>
+      <w:fldSimple w:instr=" SEQ Figura \* ARABIC ">
+        <w:r>
+          <w:rPr>
+            <w:noProof/>
+          </w:rPr>
+          <w:t>3</w:t>
+        </w:r>
+      </w:fldSimple>
       <w:r>
         <w:t xml:space="preserve"> </w:t>
       </w:r>
       <w:r>
         <w:t>– Menu Hambúrguer</w:t>
       </w:r>
-      <w:bookmarkEnd w:id="12"/>
+      <w:bookmarkEnd w:id="16"/>
     </w:p>
     <w:p/>
     <w:p>
@@ -8368,15 +8542,7 @@
         <w:t xml:space="preserve"> da figura 3</w:t>
       </w:r>
       <w:r>
-        <w:t xml:space="preserve"> é um protótipo de tela do aplicativo </w:t>
-      </w:r>
-      <w:proofErr w:type="spellStart"/>
-      <w:r>
-        <w:t>Didacta</w:t>
-      </w:r>
-      <w:proofErr w:type="spellEnd"/>
-      <w:r>
-        <w:t xml:space="preserve"> Vision que, apesar de mostrar a mesma interface de navegação em ambas as metades, ilustra a restrição de acesso para usuários não autenticados. O lado esquerdo exibe o menu lateral principal do aplicativo, com opções como Início, Notificações, Minhas Reservas e Ajuda. O lado direito, no entanto, mostra a tela de conteúdo que o usuário vê ao tentar acessar as funcionalidades do aplicativo sem estar logado, informando explicitamente que é necessário "Registre sua conta para ter acesso aos agendamentos de filmes" e fornecendo o botão "Fazer Login" em destaque, confirmando que as funcionalidades de agendamento e reserva são exclusivas para usuários registrados.</w:t>
+        <w:t xml:space="preserve"> é um protótipo de tela do aplicativo Didacta Vision que, apesar de mostrar a mesma interface de navegação em ambas as metades, ilustra a restrição de acesso para usuários não autenticados. O lado esquerdo exibe o menu lateral principal do aplicativo, com opções como Início, Notificações, Minhas Reservas e Ajuda. O lado direito, no entanto, mostra a tela de conteúdo que o usuário vê ao tentar acessar as funcionalidades do aplicativo sem estar logado, informando explicitamente que é necessário "Registre sua conta para ter acesso aos agendamentos de filmes" e fornecendo o botão "Fazer Login" em destaque, confirmando que as funcionalidades de agendamento e reserva são exclusivas para usuários registrados.</w:t>
       </w:r>
     </w:p>
     <w:p/>
@@ -8438,35 +8604,25 @@
         <w:pStyle w:val="Legenda"/>
         <w:jc w:val="center"/>
       </w:pPr>
-      <w:bookmarkStart w:id="13" w:name="_Toc216246695"/>
+      <w:bookmarkStart w:id="17" w:name="_Toc216271860"/>
       <w:r>
         <w:t xml:space="preserve">Figura </w:t>
       </w:r>
-      <w:r>
-        <w:fldChar w:fldCharType="begin"/>
-      </w:r>
-      <w:r>
-        <w:instrText xml:space="preserve"> SEQ Figura \* ARABIC </w:instrText>
-      </w:r>
-      <w:r>
-        <w:fldChar w:fldCharType="separate"/>
-      </w:r>
-      <w:r>
-        <w:rPr>
-          <w:noProof/>
-        </w:rPr>
-        <w:t>4</w:t>
-      </w:r>
-      <w:r>
-        <w:fldChar w:fldCharType="end"/>
-      </w:r>
+      <w:fldSimple w:instr=" SEQ Figura \* ARABIC ">
+        <w:r>
+          <w:rPr>
+            <w:noProof/>
+          </w:rPr>
+          <w:t>4</w:t>
+        </w:r>
+      </w:fldSimple>
       <w:r>
         <w:t xml:space="preserve"> </w:t>
       </w:r>
       <w:r>
         <w:t>- tela de login e autenticação de 2 fatores</w:t>
       </w:r>
-      <w:bookmarkEnd w:id="13"/>
+      <w:bookmarkEnd w:id="17"/>
     </w:p>
     <w:p/>
     <w:p/>
@@ -8475,23 +8631,7 @@
         <w:pStyle w:val="PargrafodoProjeto"/>
       </w:pPr>
       <w:r>
-        <w:t xml:space="preserve">O conjunto de imagens da figura 4 mostra as etapas de autenticação do aplicativo </w:t>
-      </w:r>
-      <w:proofErr w:type="spellStart"/>
-      <w:r>
-        <w:t>Didacta</w:t>
-      </w:r>
-      <w:proofErr w:type="spellEnd"/>
-      <w:r>
-        <w:t xml:space="preserve"> Vision, dando sequência à tela anterior que exigia o login. A primeira tela (à esquerda) é o formulário de Login, onde o usuário pode entrar com Endereço de Email e Senha, com a opção de "Registrar Conta" (apesar de ser uma tela de Login), ou se conectar usando contas do Google ou Facebook; há também links para "Esqueceu a senha?" e "Cadastre-se" para quem ainda não possui conta. A segunda tela (à direita) ilustra a etapa de "Verificação em 2 fatores", na qual um código é enviado para o </w:t>
-      </w:r>
-      <w:proofErr w:type="spellStart"/>
-      <w:r>
-        <w:t>email</w:t>
-      </w:r>
-      <w:proofErr w:type="spellEnd"/>
-      <w:r>
-        <w:t xml:space="preserve"> do usuário</w:t>
+        <w:t>O conjunto de imagens da figura 4 mostra as etapas de autenticação do aplicativo Didacta Vision, dando sequência à tela anterior que exigia o login. A primeira tela (à esquerda) é o formulário de Login, onde o usuário pode entrar com Endereço de Email e Senha, com a opção de "Registrar Conta" (apesar de ser uma tela de Login), ou se conectar usando contas do Google ou Facebook; há também links para "Esqueceu a senha?" e "Cadastre-se" para quem ainda não possui conta. A segunda tela (à direita) ilustra a etapa de "Verificação em 2 fatores", na qual um código é enviado para o email do usuário</w:t>
       </w:r>
       <w:r>
         <w:t xml:space="preserve"> de exemplo</w:t>
@@ -8559,35 +8699,25 @@
         <w:pStyle w:val="Legenda"/>
         <w:jc w:val="center"/>
       </w:pPr>
-      <w:bookmarkStart w:id="14" w:name="_Toc216246696"/>
+      <w:bookmarkStart w:id="18" w:name="_Toc216271861"/>
       <w:r>
         <w:t xml:space="preserve">Figura </w:t>
       </w:r>
-      <w:r>
-        <w:fldChar w:fldCharType="begin"/>
-      </w:r>
-      <w:r>
-        <w:instrText xml:space="preserve"> SEQ Figura \* ARABIC </w:instrText>
-      </w:r>
-      <w:r>
-        <w:fldChar w:fldCharType="separate"/>
-      </w:r>
-      <w:r>
-        <w:rPr>
-          <w:noProof/>
-        </w:rPr>
-        <w:t>5</w:t>
-      </w:r>
-      <w:r>
-        <w:fldChar w:fldCharType="end"/>
-      </w:r>
+      <w:fldSimple w:instr=" SEQ Figura \* ARABIC ">
+        <w:r>
+          <w:rPr>
+            <w:noProof/>
+          </w:rPr>
+          <w:t>5</w:t>
+        </w:r>
+      </w:fldSimple>
       <w:r>
         <w:t xml:space="preserve"> - </w:t>
       </w:r>
       <w:r>
         <w:t>Cadastro</w:t>
       </w:r>
-      <w:bookmarkEnd w:id="14"/>
+      <w:bookmarkEnd w:id="18"/>
     </w:p>
     <w:p/>
     <w:p>
@@ -8607,15 +8737,7 @@
         <w:t>5</w:t>
       </w:r>
       <w:r>
-        <w:t xml:space="preserve"> do protótipo </w:t>
-      </w:r>
-      <w:proofErr w:type="spellStart"/>
-      <w:r>
-        <w:t>Didacta</w:t>
-      </w:r>
-      <w:proofErr w:type="spellEnd"/>
-      <w:r>
-        <w:t xml:space="preserve"> Vision detalha o fluxo de Cadastro de um novo usuário. A tela, intitulada "Cadastro", convida o usuário a se tornar um membro para "participar das exibições". O formulário solicita informações pessoais básicas necessárias para a criação da conta, que incluem: Nome (com um exemplo sugerido de "Antony Ethan"), Endereço de Email (com o exemplo "antonyetan@email.com"), Data de Nascimento (com um ícone de calendário e a data "20/09/2025" preenchida), Telefone (com o formato sugerido: {DDD | XXXXX-XXXX}), e a definição de uma Senha. Ao final do preenchimento de todos esses dados, o usuário finaliza o processo através do botão em destaque verde, rotulado "Finalizar Cadastro".</w:t>
+        <w:t xml:space="preserve"> do protótipo Didacta Vision detalha o fluxo de Cadastro de um novo usuário. A tela, intitulada "Cadastro", convida o usuário a se tornar um membro para "participar das exibições". O formulário solicita informações pessoais básicas necessárias para a criação da conta, que incluem: Nome (com um exemplo sugerido de "Antony Ethan"), Endereço de Email (com o exemplo "antonyetan@email.com"), Data de Nascimento (com um ícone de calendário e a data "20/09/2025" preenchida), Telefone (com o formato sugerido: {DDD | XXXXX-XXXX}), e a definição de uma Senha. Ao final do preenchimento de todos esses dados, o usuário finaliza o processo através do botão em destaque verde, rotulado "Finalizar Cadastro".</w:t>
       </w:r>
     </w:p>
     <w:p/>
@@ -8677,40 +8799,25 @@
         <w:pStyle w:val="Legenda"/>
         <w:jc w:val="center"/>
       </w:pPr>
-      <w:bookmarkStart w:id="15" w:name="_Toc216246697"/>
+      <w:bookmarkStart w:id="19" w:name="_Toc216271862"/>
       <w:r>
         <w:t xml:space="preserve">Figura </w:t>
       </w:r>
-      <w:r>
-        <w:fldChar w:fldCharType="begin"/>
-      </w:r>
-      <w:r>
-        <w:instrText xml:space="preserve"> SEQ Figura \* ARABIC </w:instrText>
-      </w:r>
-      <w:r>
-        <w:fldChar w:fldCharType="separate"/>
-      </w:r>
-      <w:r>
-        <w:rPr>
-          <w:noProof/>
-        </w:rPr>
-        <w:t>6</w:t>
-      </w:r>
-      <w:r>
-        <w:fldChar w:fldCharType="end"/>
-      </w:r>
+      <w:fldSimple w:instr=" SEQ Figura \* ARABIC ">
+        <w:r>
+          <w:rPr>
+            <w:noProof/>
+          </w:rPr>
+          <w:t>6</w:t>
+        </w:r>
+      </w:fldSimple>
       <w:r>
         <w:t xml:space="preserve"> - </w:t>
       </w:r>
       <w:r>
-        <w:t xml:space="preserve">Reserva do </w:t>
-      </w:r>
-      <w:proofErr w:type="spellStart"/>
-      <w:r>
-        <w:t>FIlme</w:t>
-      </w:r>
-      <w:bookmarkEnd w:id="15"/>
-      <w:proofErr w:type="spellEnd"/>
+        <w:t>Reserva do FIlme</w:t>
+      </w:r>
+      <w:bookmarkEnd w:id="19"/>
     </w:p>
     <w:p>
       <w:pPr>
@@ -8730,19 +8837,7 @@
         <w:t xml:space="preserve"> da figura 6</w:t>
       </w:r>
       <w:r>
-        <w:t xml:space="preserve"> que mostra a tela de confirmação de reserva do filme Interestelar exibe o sucesso da transação no aplicativo </w:t>
-      </w:r>
-      <w:proofErr w:type="spellStart"/>
-      <w:r>
-        <w:t>Didacta</w:t>
-      </w:r>
-      <w:proofErr w:type="spellEnd"/>
-      <w:r>
-        <w:t xml:space="preserve"> Vision. No topo, há a capa do filme, seu título, classificações (10, 2014, ficção, Nacional) e duração (2h 49min). Uma notificação verde confirma que a reserva </w:t>
-      </w:r>
-      <w:proofErr w:type="gramStart"/>
-      <w:r>
-        <w:t xml:space="preserve">para </w:t>
+        <w:t xml:space="preserve"> que mostra a tela de confirmação de reserva do filme Interestelar exibe o sucesso da transação no aplicativo Didacta Vision. No topo, há a capa do filme, seu título, classificações (10, 2014, ficção, Nacional) e duração (2h 49min). Uma notificação verde confirma que a reserva para </w:t>
       </w:r>
       <w:r>
         <w:rPr>
@@ -8751,7 +8846,6 @@
         </w:rPr>
         <w:t>Interestelar</w:t>
       </w:r>
-      <w:proofErr w:type="gramEnd"/>
       <w:r>
         <w:t xml:space="preserve"> na data 04/04/2026 está ativada e fornece o Código da Reserva</w:t>
       </w:r>
@@ -8830,32 +8924,22 @@
         <w:pStyle w:val="Legenda"/>
         <w:jc w:val="center"/>
       </w:pPr>
-      <w:bookmarkStart w:id="16" w:name="_Toc216246698"/>
+      <w:bookmarkStart w:id="20" w:name="_Toc216271863"/>
       <w:r>
         <w:t xml:space="preserve">Figura </w:t>
       </w:r>
-      <w:r>
-        <w:fldChar w:fldCharType="begin"/>
-      </w:r>
-      <w:r>
-        <w:instrText xml:space="preserve"> SEQ Figura \* ARABIC </w:instrText>
-      </w:r>
-      <w:r>
-        <w:fldChar w:fldCharType="separate"/>
-      </w:r>
-      <w:r>
-        <w:rPr>
-          <w:noProof/>
-        </w:rPr>
-        <w:t>7</w:t>
-      </w:r>
-      <w:r>
-        <w:fldChar w:fldCharType="end"/>
-      </w:r>
+      <w:fldSimple w:instr=" SEQ Figura \* ARABIC ">
+        <w:r>
+          <w:rPr>
+            <w:noProof/>
+          </w:rPr>
+          <w:t>7</w:t>
+        </w:r>
+      </w:fldSimple>
       <w:r>
         <w:t xml:space="preserve"> - Minhas reservas</w:t>
       </w:r>
-      <w:bookmarkEnd w:id="16"/>
+      <w:bookmarkEnd w:id="20"/>
     </w:p>
     <w:p>
       <w:pPr>
@@ -8867,31 +8951,7 @@
         <w:pStyle w:val="PargrafodoProjeto"/>
       </w:pPr>
       <w:r>
-        <w:t xml:space="preserve">A figura 7 do protótipo </w:t>
-      </w:r>
-      <w:proofErr w:type="spellStart"/>
-      <w:r>
-        <w:t>Didacta</w:t>
-      </w:r>
-      <w:proofErr w:type="spellEnd"/>
-      <w:r>
-        <w:t xml:space="preserve"> Vision apresenta a área de "Perfil" do usuário logado, com foco na seção "Minhas Reservas". No topo, é exibido o nome do usuário, "Anthony </w:t>
-      </w:r>
-      <w:proofErr w:type="spellStart"/>
-      <w:r>
-        <w:t>Eten</w:t>
-      </w:r>
-      <w:proofErr w:type="spellEnd"/>
-      <w:r>
-        <w:t xml:space="preserve">", com um ícone de seta lateral &gt; que pode ser acessado para visualização de informações do perfil. Abaixo, a lista de reservas ativas inclui o filme </w:t>
-      </w:r>
-      <w:proofErr w:type="spellStart"/>
-      <w:r>
-        <w:t>Interestellar</w:t>
-      </w:r>
-      <w:proofErr w:type="spellEnd"/>
-      <w:r>
-        <w:t>, para o qual o botão "Abrir Discussão" é mostrado, sugerindo que o fórum foi liberado após a confirmação de presença na sessão. O segundo filme listado é O Jogo da Imitação, e para este, é apresentada a opção de "Cancelar Reserva", permitindo que o usuário gerencie e desista desse agendamento específico. Essencialmente, esta tela funciona como um painel de controle pessoal para o gerenciamento das interações e agendamentos do usuário no aplicativo.</w:t>
+        <w:t>A figura 7 do protótipo Didacta Vision apresenta a área de "Perfil" do usuário logado, com foco na seção "Minhas Reservas". No topo, é exibido o nome do usuário, "Anthony Eten", com um ícone de seta lateral &gt; que pode ser acessado para visualização de informações do perfil. Abaixo, a lista de reservas ativas inclui o filme Interestellar, para o qual o botão "Abrir Discussão" é mostrado, sugerindo que o fórum foi liberado após a confirmação de presença na sessão. O segundo filme listado é O Jogo da Imitação, e para este, é apresentada a opção de "Cancelar Reserva", permitindo que o usuário gerencie e desista desse agendamento específico. Essencialmente, esta tela funciona como um painel de controle pessoal para o gerenciamento das interações e agendamentos do usuário no aplicativo.</w:t>
       </w:r>
     </w:p>
     <w:p/>
@@ -8964,32 +9024,22 @@
         <w:pStyle w:val="Legenda"/>
         <w:jc w:val="center"/>
       </w:pPr>
-      <w:bookmarkStart w:id="17" w:name="_Toc216246699"/>
+      <w:bookmarkStart w:id="21" w:name="_Toc216271864"/>
       <w:r>
         <w:t xml:space="preserve">Figura </w:t>
       </w:r>
-      <w:r>
-        <w:fldChar w:fldCharType="begin"/>
-      </w:r>
-      <w:r>
-        <w:instrText xml:space="preserve"> SEQ Figura \* ARABIC </w:instrText>
-      </w:r>
-      <w:r>
-        <w:fldChar w:fldCharType="separate"/>
-      </w:r>
-      <w:r>
-        <w:rPr>
-          <w:noProof/>
-        </w:rPr>
-        <w:t>8</w:t>
-      </w:r>
-      <w:r>
-        <w:fldChar w:fldCharType="end"/>
-      </w:r>
+      <w:fldSimple w:instr=" SEQ Figura \* ARABIC ">
+        <w:r>
+          <w:rPr>
+            <w:noProof/>
+          </w:rPr>
+          <w:t>8</w:t>
+        </w:r>
+      </w:fldSimple>
       <w:r>
         <w:t xml:space="preserve"> – Ajuda</w:t>
       </w:r>
-      <w:bookmarkEnd w:id="17"/>
+      <w:bookmarkEnd w:id="21"/>
     </w:p>
     <w:p/>
     <w:p>
@@ -9003,15 +9053,7 @@
         <w:t xml:space="preserve">da figura 8 </w:t>
       </w:r>
       <w:r>
-        <w:t xml:space="preserve">apresenta a tela de Suporte do aplicativo </w:t>
-      </w:r>
-      <w:proofErr w:type="spellStart"/>
-      <w:r>
-        <w:t>Didacta</w:t>
-      </w:r>
-      <w:proofErr w:type="spellEnd"/>
-      <w:r>
-        <w:t xml:space="preserve"> Vision, oferecendo aos usuários várias formas de obter ajuda e contato. No topo, há informações de contato direto, que incluem um e-mail (didactavision@gmail.com) e um número de WhatsApp (+55 84 9999-9999), ambos clicáveis para redirecionamento. A seção de Horário de Atendimento especifica que o suporte está disponível de Segunda a Sexta, das 9h até 18h, com o Tempo de Resposta estimado em até 24 horas úteis por Email e até 12 horas úteis por WhatsApp. Por fim, a seção Guias Rápidos fornece respostas para ações comuns, como o passo a passo para Acessar Sessões: "1. Acesse o menu principal", "2. Clique em 'Perfil'", "3. Clique no banner do filme" e "4. Você verá sessões disponíveis", orientando o usuário a encontrar o calendário de sessões e fazer sua reserva.</w:t>
+        <w:t>apresenta a tela de Suporte do aplicativo Didacta Vision, oferecendo aos usuários várias formas de obter ajuda e contato. No topo, há informações de contato direto, que incluem um e-mail (didactavision@gmail.com) e um número de WhatsApp (+55 84 9999-9999), ambos clicáveis para redirecionamento. A seção de Horário de Atendimento especifica que o suporte está disponível de Segunda a Sexta, das 9h até 18h, com o Tempo de Resposta estimado em até 24 horas úteis por Email e até 12 horas úteis por WhatsApp. Por fim, a seção Guias Rápidos fornece respostas para ações comuns, como o passo a passo para Acessar Sessões: "1. Acesse o menu principal", "2. Clique em 'Perfil'", "3. Clique no banner do filme" e "4. Você verá sessões disponíveis", orientando o usuário a encontrar o calendário de sessões e fazer sua reserva.</w:t>
       </w:r>
     </w:p>
     <w:p>
@@ -9077,32 +9119,22 @@
         <w:pStyle w:val="Legenda"/>
         <w:jc w:val="center"/>
       </w:pPr>
-      <w:bookmarkStart w:id="18" w:name="_Toc216246700"/>
+      <w:bookmarkStart w:id="22" w:name="_Toc216271865"/>
       <w:r>
         <w:t xml:space="preserve">Figura </w:t>
       </w:r>
-      <w:r>
-        <w:fldChar w:fldCharType="begin"/>
-      </w:r>
-      <w:r>
-        <w:instrText xml:space="preserve"> SEQ Figura \* ARABIC </w:instrText>
-      </w:r>
-      <w:r>
-        <w:fldChar w:fldCharType="separate"/>
-      </w:r>
-      <w:r>
-        <w:rPr>
-          <w:noProof/>
-        </w:rPr>
-        <w:t>9</w:t>
-      </w:r>
-      <w:r>
-        <w:fldChar w:fldCharType="end"/>
-      </w:r>
+      <w:fldSimple w:instr=" SEQ Figura \* ARABIC ">
+        <w:r>
+          <w:rPr>
+            <w:noProof/>
+          </w:rPr>
+          <w:t>9</w:t>
+        </w:r>
+      </w:fldSimple>
       <w:r>
         <w:t xml:space="preserve"> - Editar Perfil</w:t>
       </w:r>
-      <w:bookmarkEnd w:id="18"/>
+      <w:bookmarkEnd w:id="22"/>
     </w:p>
     <w:p/>
     <w:p>
@@ -9116,31 +9148,7 @@
         <w:t xml:space="preserve">da figura 9 </w:t>
       </w:r>
       <w:r>
-        <w:t xml:space="preserve">exibe duas telas relacionadas à gestão do Perfil do usuário "Anthony </w:t>
-      </w:r>
-      <w:proofErr w:type="spellStart"/>
-      <w:r>
-        <w:t>Eten</w:t>
-      </w:r>
-      <w:proofErr w:type="spellEnd"/>
-      <w:r>
-        <w:t>" no aplicativo </w:t>
-      </w:r>
-      <w:proofErr w:type="spellStart"/>
-      <w:r>
-        <w:t>Didacta</w:t>
-      </w:r>
-      <w:proofErr w:type="spellEnd"/>
-      <w:r>
-        <w:t xml:space="preserve"> Vision. A tela da esquerda mostra o "Perfil" do usuário, exibindo suas informações cadastradas de Nome ("Anthony </w:t>
-      </w:r>
-      <w:proofErr w:type="spellStart"/>
-      <w:r>
-        <w:t>Eten</w:t>
-      </w:r>
-      <w:proofErr w:type="spellEnd"/>
-      <w:r>
-        <w:t>"), Endereço de Email ("antonyetan@email.com") e Telefone ("+55 (84) 9999-9999"), além de um resumo estatístico indicando que ele assistiu a "1 filme assistido”. Abaixo dessas informações, há um botão verde de ação rotulado "Editar Perfil". Ao clicar neste botão, o usuário é levado à tela da direita, que é a interface de Edição do Perfil. Nesta tela, ele pode modificar o Nome, Endereço de Email e Telefone em campos editáveis. Após fazer as alterações desejadas, o usuário pode confirmá-las clicando no botão verde "Salvar Alterações".</w:t>
+        <w:t>exibe duas telas relacionadas à gestão do Perfil do usuário "Anthony Eten" no aplicativo Didacta Vision. A tela da esquerda mostra o "Perfil" do usuário, exibindo suas informações cadastradas de Nome ("Anthony Eten"), Endereço de Email ("antonyetan@email.com") e Telefone ("+55 (84) 9999-9999"), além de um resumo estatístico indicando que ele assistiu a "1 filme assistido”. Abaixo dessas informações, há um botão verde de ação rotulado "Editar Perfil". Ao clicar neste botão, o usuário é levado à tela da direita, que é a interface de Edição do Perfil. Nesta tela, ele pode modificar o Nome, Endereço de Email e Telefone em campos editáveis. Após fazer as alterações desejadas, o usuário pode confirmá-las clicando no botão verde "Salvar Alterações".</w:t>
       </w:r>
     </w:p>
     <w:p>
@@ -9200,35 +9208,25 @@
         <w:pStyle w:val="Legenda"/>
         <w:jc w:val="center"/>
       </w:pPr>
-      <w:bookmarkStart w:id="19" w:name="_Toc216246701"/>
+      <w:bookmarkStart w:id="23" w:name="_Toc216271866"/>
       <w:r>
         <w:t xml:space="preserve">Figura </w:t>
       </w:r>
-      <w:r>
-        <w:fldChar w:fldCharType="begin"/>
-      </w:r>
-      <w:r>
-        <w:instrText xml:space="preserve"> SEQ Figura \* ARABIC </w:instrText>
-      </w:r>
-      <w:r>
-        <w:fldChar w:fldCharType="separate"/>
-      </w:r>
-      <w:r>
-        <w:rPr>
-          <w:noProof/>
-        </w:rPr>
-        <w:t>10</w:t>
-      </w:r>
-      <w:r>
-        <w:fldChar w:fldCharType="end"/>
-      </w:r>
+      <w:fldSimple w:instr=" SEQ Figura \* ARABIC ">
+        <w:r>
+          <w:rPr>
+            <w:noProof/>
+          </w:rPr>
+          <w:t>10</w:t>
+        </w:r>
+      </w:fldSimple>
       <w:r>
         <w:t xml:space="preserve"> – </w:t>
       </w:r>
       <w:r>
         <w:t>Discussão</w:t>
       </w:r>
-      <w:bookmarkEnd w:id="19"/>
+      <w:bookmarkEnd w:id="23"/>
     </w:p>
     <w:p/>
     <w:p/>
@@ -9237,31 +9235,7 @@
         <w:pStyle w:val="PargrafodoProjeto"/>
       </w:pPr>
       <w:r>
-        <w:t xml:space="preserve">A imagem da figura 10 apresenta a tela do Fórum de Discussão do aplicativo </w:t>
-      </w:r>
-      <w:proofErr w:type="spellStart"/>
-      <w:r>
-        <w:t>Didacta</w:t>
-      </w:r>
-      <w:proofErr w:type="spellEnd"/>
-      <w:r>
-        <w:t xml:space="preserve"> Vision, especificamente para o filme "</w:t>
-      </w:r>
-      <w:proofErr w:type="spellStart"/>
-      <w:r>
-        <w:t>Interestellar</w:t>
-      </w:r>
-      <w:proofErr w:type="spellEnd"/>
-      <w:r>
-        <w:t xml:space="preserve">: Uma Jornada pelo Espaço-Tempo". No topo, após a descrição do filme, duração (2h 49min) e nota (8.0/10 </w:t>
-      </w:r>
-      <w:proofErr w:type="spellStart"/>
-      <w:r>
-        <w:t>IMDb</w:t>
-      </w:r>
-      <w:proofErr w:type="spellEnd"/>
-      <w:r>
-        <w:t>), a tela exibe uma lista de Mensagens. O primeiro comentário é do Prof. Saulo Maciel (Professor), que dá as boas-vindas e introduz o tema de discussão. Em seguida, há uma resposta de João Pedro (Astrônomo), questionando a cena do planeta Miller, indicando que o fórum é ativo e permite a participação de especialistas e usuários. A parte inferior da tela lista os Participantes ativos, como o Prof. Saulo Maciel, João Pedro, Maria Silva, Pedro Oliveira e Ana Costa, confirmando o ambiente de interação e comunidade após a exibição do filme.</w:t>
+        <w:t>A imagem da figura 10 apresenta a tela do Fórum de Discussão do aplicativo Didacta Vision, especificamente para o filme "Interestellar: Uma Jornada pelo Espaço-Tempo". No topo, após a descrição do filme, duração (2h 49min) e nota (8.0/10 IMDb), a tela exibe uma lista de Mensagens. O primeiro comentário é do Prof. Saulo Maciel (Professor), que dá as boas-vindas e introduz o tema de discussão. Em seguida, há uma resposta de João Pedro (Astrônomo), questionando a cena do planeta Miller, indicando que o fórum é ativo e permite a participação de especialistas e usuários. A parte inferior da tela lista os Participantes ativos, como o Prof. Saulo Maciel, João Pedro, Maria Silva, Pedro Oliveira e Ana Costa, confirmando o ambiente de interação e comunidade após a exibição do filme.</w:t>
       </w:r>
     </w:p>
     <w:p/>
@@ -9322,35 +9296,25 @@
         <w:pStyle w:val="Legenda"/>
         <w:jc w:val="center"/>
       </w:pPr>
-      <w:bookmarkStart w:id="20" w:name="_Toc216246702"/>
+      <w:bookmarkStart w:id="24" w:name="_Toc216271867"/>
       <w:r>
         <w:t xml:space="preserve">Figura </w:t>
       </w:r>
-      <w:r>
-        <w:fldChar w:fldCharType="begin"/>
-      </w:r>
-      <w:r>
-        <w:instrText xml:space="preserve"> SEQ Figura \* ARABIC </w:instrText>
-      </w:r>
-      <w:r>
-        <w:fldChar w:fldCharType="separate"/>
-      </w:r>
-      <w:r>
-        <w:rPr>
-          <w:noProof/>
-        </w:rPr>
-        <w:t>11</w:t>
-      </w:r>
-      <w:r>
-        <w:fldChar w:fldCharType="end"/>
-      </w:r>
+      <w:fldSimple w:instr=" SEQ Figura \* ARABIC ">
+        <w:r>
+          <w:rPr>
+            <w:noProof/>
+          </w:rPr>
+          <w:t>11</w:t>
+        </w:r>
+      </w:fldSimple>
       <w:r>
         <w:t xml:space="preserve"> - </w:t>
       </w:r>
       <w:r>
         <w:t>Notificações</w:t>
       </w:r>
-      <w:bookmarkEnd w:id="20"/>
+      <w:bookmarkEnd w:id="24"/>
     </w:p>
     <w:p>
       <w:pPr>
@@ -9362,23 +9326,7 @@
     </w:p>
     <w:p>
       <w:r>
-        <w:t>A imagem da figura 11 exibe a tela de Notificações do aplicativo </w:t>
-      </w:r>
-      <w:proofErr w:type="spellStart"/>
-      <w:r>
-        <w:t>Didacta</w:t>
-      </w:r>
-      <w:proofErr w:type="spellEnd"/>
-      <w:r>
-        <w:t xml:space="preserve"> Vision, dividida em duas visualizações: a primeira (à esquerda) mostra o estado padrão da aba Não Lidas, indicando que não há "Nada aqui, por enquanto..." e exibindo a opção de "Marcar tudo como lido". A segunda visualização (à direita) mostra a seção de notificações com uma mensagem nova, indicando que o "Seu Agendamento n°1 da Exibição </w:t>
-      </w:r>
-      <w:proofErr w:type="spellStart"/>
-      <w:r>
-        <w:t>Interestellar</w:t>
-      </w:r>
-      <w:proofErr w:type="spellEnd"/>
-      <w:r>
-        <w:t xml:space="preserve"> foi confirmado", o que significa que o sistema de reservas comunicou o sucesso de uma transação ao usuário, mantendo-o informado sobre o status de seus agendamentos no aplicativo.</w:t>
+        <w:t>A imagem da figura 11 exibe a tela de Notificações do aplicativo Didacta Vision, dividida em duas visualizações: a primeira (à esquerda) mostra o estado padrão da aba Não Lidas, indicando que não há "Nada aqui, por enquanto..." e exibindo a opção de "Marcar tudo como lido". A segunda visualização (à direita) mostra a seção de notificações com uma mensagem nova, indicando que o "Seu Agendamento n°1 da Exibição Interestellar foi confirmado", o que significa que o sistema de reservas comunicou o sucesso de uma transação ao usuário, mantendo-o informado sobre o status de seus agendamentos no aplicativo.</w:t>
       </w:r>
     </w:p>
     <w:p/>
@@ -9510,32 +9458,22 @@
         <w:pStyle w:val="Legenda"/>
         <w:jc w:val="center"/>
       </w:pPr>
-      <w:bookmarkStart w:id="21" w:name="_Toc216246703"/>
+      <w:bookmarkStart w:id="25" w:name="_Toc216271868"/>
       <w:r>
         <w:t xml:space="preserve">Figura </w:t>
       </w:r>
-      <w:r>
-        <w:fldChar w:fldCharType="begin"/>
-      </w:r>
-      <w:r>
-        <w:instrText xml:space="preserve"> SEQ Figura \* ARABIC </w:instrText>
-      </w:r>
-      <w:r>
-        <w:fldChar w:fldCharType="separate"/>
-      </w:r>
-      <w:r>
-        <w:rPr>
-          <w:noProof/>
-        </w:rPr>
-        <w:t>12</w:t>
-      </w:r>
-      <w:r>
-        <w:fldChar w:fldCharType="end"/>
-      </w:r>
+      <w:fldSimple w:instr=" SEQ Figura \* ARABIC ">
+        <w:r>
+          <w:rPr>
+            <w:noProof/>
+          </w:rPr>
+          <w:t>12</w:t>
+        </w:r>
+      </w:fldSimple>
       <w:r>
         <w:t xml:space="preserve"> – Dashboard</w:t>
       </w:r>
-      <w:bookmarkEnd w:id="21"/>
+      <w:bookmarkEnd w:id="25"/>
     </w:p>
     <w:p>
       <w:pPr>
@@ -9553,23 +9491,7 @@
         <w:t xml:space="preserve"> da figura 12</w:t>
       </w:r>
       <w:r>
-        <w:t xml:space="preserve"> exibe o Dashboard do sistema de sessões educativas </w:t>
-      </w:r>
-      <w:proofErr w:type="spellStart"/>
-      <w:r>
-        <w:t>Didacta</w:t>
-      </w:r>
-      <w:proofErr w:type="spellEnd"/>
-      <w:r>
-        <w:t xml:space="preserve"> Vision, oferecendo uma visão geral e estatísticas importantes. O painel resume os dados principais, mostrando que o sistema possui um Total de Filmes de 3, Sessões Agendadas em número de 3, e um Total de Reservas de 10. Há também uma métrica de Pendentes que totaliza 2. Na seção de Atividades Recentes, o painel mostra o engajamento dos usuários, listando dois novos comentários nos filmes: um em </w:t>
-      </w:r>
-      <w:proofErr w:type="spellStart"/>
-      <w:r>
-        <w:t>Interestellar</w:t>
-      </w:r>
-      <w:proofErr w:type="spellEnd"/>
-      <w:r>
-        <w:t xml:space="preserve">, postado por "João da Silva", e outro em O Jogo da Imitação, postado por "Sara </w:t>
+        <w:t xml:space="preserve"> exibe o Dashboard do sistema de sessões educativas Didacta Vision, oferecendo uma visão geral e estatísticas importantes. O painel resume os dados principais, mostrando que o sistema possui um Total de Filmes de 3, Sessões Agendadas em número de 3, e um Total de Reservas de 10. Há também uma métrica de Pendentes que totaliza 2. Na seção de Atividades Recentes, o painel mostra o engajamento dos usuários, listando dois novos comentários nos filmes: um em Interestellar, postado por "João da Silva", e outro em O Jogo da Imitação, postado por "Sara </w:t>
       </w:r>
       <w:r>
         <w:t>Beatriz</w:t>
@@ -9677,32 +9599,22 @@
         <w:pStyle w:val="Legenda"/>
         <w:jc w:val="center"/>
       </w:pPr>
-      <w:bookmarkStart w:id="22" w:name="_Toc216246704"/>
+      <w:bookmarkStart w:id="26" w:name="_Toc216271869"/>
       <w:r>
         <w:t xml:space="preserve">Figura </w:t>
       </w:r>
-      <w:r>
-        <w:fldChar w:fldCharType="begin"/>
-      </w:r>
-      <w:r>
-        <w:instrText xml:space="preserve"> SEQ Figura \* ARABIC </w:instrText>
-      </w:r>
-      <w:r>
-        <w:fldChar w:fldCharType="separate"/>
-      </w:r>
-      <w:r>
-        <w:rPr>
-          <w:noProof/>
-        </w:rPr>
-        <w:t>13</w:t>
-      </w:r>
-      <w:r>
-        <w:fldChar w:fldCharType="end"/>
-      </w:r>
+      <w:fldSimple w:instr=" SEQ Figura \* ARABIC ">
+        <w:r>
+          <w:rPr>
+            <w:noProof/>
+          </w:rPr>
+          <w:t>13</w:t>
+        </w:r>
+      </w:fldSimple>
       <w:r>
         <w:t xml:space="preserve"> - Reservas dos Usuários</w:t>
       </w:r>
-      <w:bookmarkEnd w:id="22"/>
+      <w:bookmarkEnd w:id="26"/>
     </w:p>
     <w:p/>
     <w:p>
@@ -9710,15 +9622,7 @@
         <w:pStyle w:val="PargrafodoProjeto"/>
       </w:pPr>
       <w:r>
-        <w:t xml:space="preserve">A imagem da figura 13 exibe uma tela de Gerenciamento de Reservas e Confirmação de Presença do aplicativo </w:t>
-      </w:r>
-      <w:proofErr w:type="spellStart"/>
-      <w:r>
-        <w:t>Didacta</w:t>
-      </w:r>
-      <w:proofErr w:type="spellEnd"/>
-      <w:r>
-        <w:t xml:space="preserve"> Vision, que </w:t>
+        <w:t xml:space="preserve">A imagem da figura 13 exibe uma tela de Gerenciamento de Reservas e Confirmação de Presença do aplicativo Didacta Vision, que </w:t>
       </w:r>
       <w:r>
         <w:t xml:space="preserve">é </w:t>
@@ -9732,7 +9636,6 @@
       <w:r>
         <w:t xml:space="preserve">. A tela permite buscar reservas e filtrá-las por Todas, Confirmadas ou Canceladas. A lista detalha as reservas por usuário, exibindo o nome do reservante e os detalhes da sessão, como o Filme e a data/hora da sessão (por exemplo, "04/04/2026 às 10:30"). No exemplo, as reservas de João Silva e Maria Santos para o filme </w:t>
       </w:r>
-      <w:proofErr w:type="spellStart"/>
       <w:r>
         <w:rPr>
           <w:i/>
@@ -9740,17 +9643,8 @@
         </w:rPr>
         <w:t>Interestellar</w:t>
       </w:r>
-      <w:proofErr w:type="spellEnd"/>
-      <w:r>
-        <w:t xml:space="preserve"> estão marcadas </w:t>
-      </w:r>
-      <w:proofErr w:type="gramStart"/>
-      <w:r>
-        <w:t>como Confirmada</w:t>
-      </w:r>
-      <w:proofErr w:type="gramEnd"/>
-      <w:r>
-        <w:t xml:space="preserve"> e possuem ícones que sugerem a possibilidade de validação ou cancelamento da presença. Já as reservas de Pedro Costa para </w:t>
+      <w:r>
+        <w:t xml:space="preserve"> estão marcadas como Confirmada e possuem ícones que sugerem a possibilidade de validação ou cancelamento da presença. Já as reservas de Pedro Costa para </w:t>
       </w:r>
       <w:r>
         <w:rPr>
@@ -9770,15 +9664,7 @@
         <w:t>O Jogo da Imitação</w:t>
       </w:r>
       <w:r>
-        <w:t xml:space="preserve"> estão marcadas </w:t>
-      </w:r>
-      <w:proofErr w:type="gramStart"/>
-      <w:r>
-        <w:t>como Ausente</w:t>
-      </w:r>
-      <w:proofErr w:type="gramEnd"/>
-      <w:r>
-        <w:t>, indicando que o administrador pode registrar a falta do usuário na sessão. Esta tela é essencial para a gestão do evento e liberação de acesso aos fóruns de discussão.</w:t>
+        <w:t xml:space="preserve"> estão marcadas como Ausente, indicando que o administrador pode registrar a falta do usuário na sessão. Esta tela é essencial para a gestão do evento e liberação de acesso aos fóruns de discussão.</w:t>
       </w:r>
     </w:p>
     <w:p/>
@@ -9846,32 +9732,22 @@
         <w:pStyle w:val="Legenda"/>
         <w:jc w:val="center"/>
       </w:pPr>
-      <w:bookmarkStart w:id="23" w:name="_Toc216246705"/>
+      <w:bookmarkStart w:id="27" w:name="_Toc216271870"/>
       <w:r>
         <w:t xml:space="preserve">Figura </w:t>
       </w:r>
-      <w:r>
-        <w:fldChar w:fldCharType="begin"/>
-      </w:r>
-      <w:r>
-        <w:instrText xml:space="preserve"> SEQ Figura \* ARABIC </w:instrText>
-      </w:r>
-      <w:r>
-        <w:fldChar w:fldCharType="separate"/>
-      </w:r>
-      <w:r>
-        <w:rPr>
-          <w:noProof/>
-        </w:rPr>
-        <w:t>14</w:t>
-      </w:r>
-      <w:r>
-        <w:fldChar w:fldCharType="end"/>
-      </w:r>
+      <w:fldSimple w:instr=" SEQ Figura \* ARABIC ">
+        <w:r>
+          <w:rPr>
+            <w:noProof/>
+          </w:rPr>
+          <w:t>14</w:t>
+        </w:r>
+      </w:fldSimple>
       <w:r>
         <w:t xml:space="preserve"> – Sessões</w:t>
       </w:r>
-      <w:bookmarkEnd w:id="23"/>
+      <w:bookmarkEnd w:id="27"/>
     </w:p>
     <w:p>
       <w:pPr>
@@ -9889,19 +9765,7 @@
         <w:t xml:space="preserve"> da figura 14</w:t>
       </w:r>
       <w:r>
-        <w:t xml:space="preserve"> é uma tela de Gerenciamento de Sessões do aplicativo </w:t>
-      </w:r>
-      <w:proofErr w:type="spellStart"/>
-      <w:r>
-        <w:t>Didacta</w:t>
-      </w:r>
-      <w:proofErr w:type="spellEnd"/>
-      <w:r>
-        <w:t xml:space="preserve"> Vision, provavelmente uma interface de administração ou para o gestor do conteúdo, intitulada "Sessões" com a descrição "Gerencie as sessões de exibição". A tela lista as sessões agendadas para três filmes: Interestelar, O Jogo da Imitação e Oppenheimer. Para cada filme, é exibida a data de agendamento (por exemplo, 30/10/2025 </w:t>
-      </w:r>
-      <w:proofErr w:type="gramStart"/>
-      <w:r>
-        <w:t xml:space="preserve">para </w:t>
+        <w:t xml:space="preserve"> é uma tela de Gerenciamento de Sessões do aplicativo Didacta Vision, provavelmente uma interface de administração ou para o gestor do conteúdo, intitulada "Sessões" com a descrição "Gerencie as sessões de exibição". A tela lista as sessões agendadas para três filmes: Interestelar, O Jogo da Imitação e Oppenheimer. Para cada filme, é exibida a data de agendamento (por exemplo, 30/10/2025 para </w:t>
       </w:r>
       <w:r>
         <w:rPr>
@@ -9910,17 +9774,8 @@
         </w:rPr>
         <w:t>Interestelar</w:t>
       </w:r>
-      <w:proofErr w:type="gramEnd"/>
-      <w:r>
-        <w:t>), o horário e local (10:00 - Sala de Videoconferência) e o status das reservas, mostrando o número de vagas preenchidas em relação ao total (</w:t>
-      </w:r>
-      <w:proofErr w:type="spellStart"/>
-      <w:r>
-        <w:t>ex</w:t>
-      </w:r>
-      <w:proofErr w:type="spellEnd"/>
-      <w:r>
-        <w:t>: 19/20 Reservas). Crucialmente, cada sessão listada possui botões de ação para Editar e Excluir a sessão, indicando que esta é a área onde o administrador mantém o calendário de exibições atualizado.</w:t>
+      <w:r>
+        <w:t>), o horário e local (10:00 - Sala de Videoconferência) e o status das reservas, mostrando o número de vagas preenchidas em relação ao total (ex: 19/20 Reservas). Crucialmente, cada sessão listada possui botões de ação para Editar e Excluir a sessão, indicando que esta é a área onde o administrador mantém o calendário de exibições atualizado.</w:t>
       </w:r>
     </w:p>
     <w:p/>
@@ -9982,32 +9837,22 @@
         <w:pStyle w:val="Legenda"/>
         <w:jc w:val="center"/>
       </w:pPr>
-      <w:bookmarkStart w:id="24" w:name="_Toc216246706"/>
+      <w:bookmarkStart w:id="28" w:name="_Toc216271871"/>
       <w:r>
         <w:t xml:space="preserve">Figura </w:t>
       </w:r>
-      <w:r>
-        <w:fldChar w:fldCharType="begin"/>
-      </w:r>
-      <w:r>
-        <w:instrText xml:space="preserve"> SEQ Figura \* ARABIC </w:instrText>
-      </w:r>
-      <w:r>
-        <w:fldChar w:fldCharType="separate"/>
-      </w:r>
-      <w:r>
-        <w:rPr>
-          <w:noProof/>
-        </w:rPr>
-        <w:t>15</w:t>
-      </w:r>
-      <w:r>
-        <w:fldChar w:fldCharType="end"/>
-      </w:r>
+      <w:fldSimple w:instr=" SEQ Figura \* ARABIC ">
+        <w:r>
+          <w:rPr>
+            <w:noProof/>
+          </w:rPr>
+          <w:t>15</w:t>
+        </w:r>
+      </w:fldSimple>
       <w:r>
         <w:t xml:space="preserve"> - Gerenciamento de Notificações pelo Admin</w:t>
       </w:r>
-      <w:bookmarkEnd w:id="24"/>
+      <w:bookmarkEnd w:id="28"/>
     </w:p>
     <w:p/>
     <w:p/>
@@ -10017,15 +9862,7 @@
         <w:pStyle w:val="PargrafodoProjeto"/>
       </w:pPr>
       <w:r>
-        <w:t xml:space="preserve">A imagem da figura 15 apresenta a tela de Envio de Notificações do aplicativo </w:t>
-      </w:r>
-      <w:proofErr w:type="spellStart"/>
-      <w:r>
-        <w:t>Didacta</w:t>
-      </w:r>
-      <w:proofErr w:type="spellEnd"/>
-      <w:r>
-        <w:t xml:space="preserve"> Vision, que é uma ferramenta administrativa para comunicação direta com os usuários. A interface permite ao gestor Enviar nova notificação, onde é possível Selecionar um usuário, definir o tipo de aviso (como Lembrete da Sessão) e redigir a Mensagem, que pode ser enviada clicando no botão verde "Enviar Notificação". Na parte inferior da tela, o Histórico de Notificações mostra o registro dos comunicados já enviados, embora no estado atual, ele indique "Nenhuma notificação enviada".</w:t>
+        <w:t>A imagem da figura 15 apresenta a tela de Envio de Notificações do aplicativo Didacta Vision, que é uma ferramenta administrativa para comunicação direta com os usuários. A interface permite ao gestor Enviar nova notificação, onde é possível Selecionar um usuário, definir o tipo de aviso (como Lembrete da Sessão) e redigir a Mensagem, que pode ser enviada clicando no botão verde "Enviar Notificação". Na parte inferior da tela, o Histórico de Notificações mostra o registro dos comunicados já enviados, embora no estado atual, ele indique "Nenhuma notificação enviada".</w:t>
       </w:r>
     </w:p>
     <w:p/>
@@ -10091,32 +9928,22 @@
         <w:pStyle w:val="Legenda"/>
         <w:jc w:val="center"/>
       </w:pPr>
-      <w:bookmarkStart w:id="25" w:name="_Toc216246707"/>
+      <w:bookmarkStart w:id="29" w:name="_Toc216271872"/>
       <w:r>
         <w:t xml:space="preserve">Figura </w:t>
       </w:r>
-      <w:r>
-        <w:fldChar w:fldCharType="begin"/>
-      </w:r>
-      <w:r>
-        <w:instrText xml:space="preserve"> SEQ Figura \* ARABIC </w:instrText>
-      </w:r>
-      <w:r>
-        <w:fldChar w:fldCharType="separate"/>
-      </w:r>
-      <w:r>
-        <w:rPr>
-          <w:noProof/>
-        </w:rPr>
-        <w:t>16</w:t>
-      </w:r>
-      <w:r>
-        <w:fldChar w:fldCharType="end"/>
-      </w:r>
+      <w:fldSimple w:instr=" SEQ Figura \* ARABIC ">
+        <w:r>
+          <w:rPr>
+            <w:noProof/>
+          </w:rPr>
+          <w:t>16</w:t>
+        </w:r>
+      </w:fldSimple>
       <w:r>
         <w:t xml:space="preserve"> - Menu do Admin</w:t>
       </w:r>
-      <w:bookmarkEnd w:id="25"/>
+      <w:bookmarkEnd w:id="29"/>
     </w:p>
     <w:p>
       <w:pPr>
@@ -10128,15 +9955,7 @@
         <w:pStyle w:val="PargrafodoProjeto"/>
       </w:pPr>
       <w:r>
-        <w:t xml:space="preserve">A Figura 16 exibe o Menu do Administrador do aplicativo </w:t>
-      </w:r>
-      <w:proofErr w:type="spellStart"/>
-      <w:r>
-        <w:t>Didacta</w:t>
-      </w:r>
-      <w:proofErr w:type="spellEnd"/>
-      <w:r>
-        <w:t xml:space="preserve"> Vision, que é o painel de navegação dedicado à gestão e controle do sistema de sessões educativas. O menu lista as principais áreas de acesso administrativo: Dashboard (visão geral), Notificações (para envio de comunicados), Filmes, Sessões (gestão de agendamentos), Usuários e Reservas (para confirmação de presença). No rodapé do menu, é exibido o perfil do administrador logado, identificado como "Saulo" com o e-mail "saulo@gmail.com", além da opção "Sair da Conta". Este menu centraliza todas as ferramentas necessárias para a operação e monitoramento do aplicativo.</w:t>
+        <w:t>A Figura 16 exibe o Menu do Administrador do aplicativo Didacta Vision, que é o painel de navegação dedicado à gestão e controle do sistema de sessões educativas. O menu lista as principais áreas de acesso administrativo: Dashboard (visão geral), Notificações (para envio de comunicados), Filmes, Sessões (gestão de agendamentos), Usuários e Reservas (para confirmação de presença). No rodapé do menu, é exibido o perfil do administrador logado, identificado como "Saulo" com o e-mail "saulo@gmail.com", além da opção "Sair da Conta". Este menu centraliza todas as ferramentas necessárias para a operação e monitoramento do aplicativo.</w:t>
       </w:r>
     </w:p>
     <w:p/>
@@ -10144,12 +9963,8 @@
       <w:pPr>
         <w:pStyle w:val="PargrafodaLista"/>
         <w:keepNext/>
-        <w:numPr>
-          <w:ilvl w:val="0"/>
-          <w:numId w:val="34"/>
-        </w:numPr>
         <w:spacing w:after="237" w:line="259" w:lineRule="auto"/>
-        <w:ind w:right="131"/>
+        <w:ind w:right="131" w:firstLine="0"/>
         <w:jc w:val="center"/>
       </w:pPr>
       <w:r>
@@ -10197,38 +10012,27 @@
     <w:p>
       <w:pPr>
         <w:pStyle w:val="Legenda"/>
-        <w:numPr>
-          <w:ilvl w:val="0"/>
-          <w:numId w:val="34"/>
-        </w:numPr>
         <w:jc w:val="center"/>
       </w:pPr>
-      <w:bookmarkStart w:id="26" w:name="_Toc216246708"/>
+      <w:bookmarkStart w:id="30" w:name="_Toc216271873"/>
       <w:r>
         <w:t xml:space="preserve">Figura </w:t>
       </w:r>
-      <w:r>
-        <w:fldChar w:fldCharType="begin"/>
-      </w:r>
-      <w:r>
-        <w:instrText xml:space="preserve"> SEQ Figura \* ARABIC </w:instrText>
-      </w:r>
-      <w:r>
-        <w:fldChar w:fldCharType="separate"/>
-      </w:r>
-      <w:r>
-        <w:rPr>
-          <w:noProof/>
-        </w:rPr>
-        <w:t>17</w:t>
-      </w:r>
-      <w:r>
-        <w:fldChar w:fldCharType="end"/>
-      </w:r>
-      <w:r>
-        <w:t xml:space="preserve"> - Cadastrar Filme</w:t>
-      </w:r>
-      <w:bookmarkEnd w:id="26"/>
+      <w:fldSimple w:instr=" SEQ Figura \* ARABIC ">
+        <w:r>
+          <w:rPr>
+            <w:noProof/>
+          </w:rPr>
+          <w:t>17</w:t>
+        </w:r>
+      </w:fldSimple>
+      <w:r>
+        <w:t xml:space="preserve"> </w:t>
+      </w:r>
+      <w:r>
+        <w:t>- Cadastrar Filme</w:t>
+      </w:r>
+      <w:bookmarkEnd w:id="30"/>
     </w:p>
     <w:p/>
     <w:p>
@@ -10236,17 +10040,8 @@
         <w:pStyle w:val="PargrafodoProjeto"/>
       </w:pPr>
       <w:r>
-        <w:t>A figura17 apresenta a tela de Gerenciamento de Filmes do aplicativo </w:t>
-      </w:r>
-      <w:proofErr w:type="spellStart"/>
-      <w:r>
-        <w:t>Didacta</w:t>
-      </w:r>
-      <w:proofErr w:type="spellEnd"/>
-      <w:r>
-        <w:t xml:space="preserve"> Vision, que é uma interface administrativa fundamental para a gestão do conteúdo. O lado esquerdo mostra a lista de Filmes atualmente cadastrados no catálogo, que são </w:t>
-      </w:r>
-      <w:proofErr w:type="spellStart"/>
+        <w:t>A figura17 apresenta a tela de Gerenciamento de Filmes do aplicativo Didacta Vision, que é uma interface administrativa fundamental para a gestão do conteúdo. O lado esquerdo mostra a lista de Filmes atualmente cadastrados no catálogo, que são </w:t>
+      </w:r>
       <w:r>
         <w:rPr>
           <w:i/>
@@ -10254,7 +10049,6 @@
         </w:rPr>
         <w:t>Interestellar</w:t>
       </w:r>
-      <w:proofErr w:type="spellEnd"/>
       <w:r>
         <w:t>, </w:t>
       </w:r>
@@ -10300,22 +10094,16 @@
     </w:p>
     <w:p>
       <w:pPr>
-        <w:spacing w:after="120" w:line="259" w:lineRule="auto"/>
-        <w:ind w:left="-5" w:right="0"/>
-        <w:jc w:val="left"/>
-      </w:pPr>
-      <w:r>
-        <w:rPr>
-          <w:b/>
-        </w:rPr>
+        <w:pStyle w:val="TtulodoProjeto"/>
+      </w:pPr>
+      <w:r>
         <w:lastRenderedPageBreak/>
         <w:t xml:space="preserve">PRINCIPAIS DESAFIOS ATÉ O MOMENTO </w:t>
       </w:r>
     </w:p>
     <w:p>
       <w:pPr>
-        <w:spacing w:after="126"/>
-        <w:ind w:left="-5" w:right="131"/>
+        <w:pStyle w:val="PargrafodoProjeto"/>
       </w:pPr>
       <w:r>
         <w:t xml:space="preserve">    Até o momento, o projeto encontra-se em fases iniciais de análise e definição. </w:t>
@@ -10323,8 +10111,7 @@
     </w:p>
     <w:p>
       <w:pPr>
-        <w:spacing w:after="126"/>
-        <w:ind w:left="-5" w:right="131"/>
+        <w:pStyle w:val="PargrafodoProjeto"/>
       </w:pPr>
       <w:r>
         <w:t xml:space="preserve">Apesar disso, alguns desafios importantes já foram identificados: </w:t>
@@ -10332,8 +10119,7 @@
     </w:p>
     <w:p>
       <w:pPr>
-        <w:spacing w:after="126"/>
-        <w:ind w:left="-5" w:right="131"/>
+        <w:pStyle w:val="PargrafodoProjeto"/>
       </w:pPr>
       <w:r>
         <w:t xml:space="preserve">Definição e entendimento do problema </w:t>
@@ -10341,12 +10127,11 @@
     </w:p>
     <w:p>
       <w:pPr>
-        <w:spacing w:after="0" w:line="360" w:lineRule="auto"/>
-        <w:ind w:right="117"/>
-        <w:jc w:val="left"/>
-      </w:pPr>
-      <w:r>
-        <w:t xml:space="preserve">    Um dos principais desafios foi compreender claramente o problema a ser resolvido pelo sistema. Isso exigiu discussões aprofundadas, revisões e alinhamento entre os integrantes do grupo. </w:t>
+        <w:pStyle w:val="PargrafodoProjeto"/>
+        <w:ind w:left="705" w:firstLine="270"/>
+      </w:pPr>
+      <w:r>
+        <w:t xml:space="preserve">Um dos principais desafios foi compreender claramente o problema a ser resolvido pelo sistema. Isso exigiu discussões aprofundadas, revisões e alinhamento entre os integrantes do grupo. </w:t>
       </w:r>
     </w:p>
     <w:p>
@@ -10356,7 +10141,7 @@
           <w:numId w:val="9"/>
         </w:numPr>
         <w:spacing w:after="120" w:line="259" w:lineRule="auto"/>
-        <w:ind w:right="0" w:hanging="360"/>
+        <w:ind w:left="1770" w:right="0" w:hanging="360"/>
         <w:jc w:val="left"/>
       </w:pPr>
       <w:r>
@@ -10372,7 +10157,7 @@
     <w:p>
       <w:pPr>
         <w:spacing w:after="0" w:line="360" w:lineRule="auto"/>
-        <w:ind w:left="1420" w:right="117"/>
+        <w:ind w:left="1765" w:right="117"/>
         <w:jc w:val="left"/>
       </w:pPr>
       <w:r>
@@ -10386,7 +10171,7 @@
           <w:numId w:val="9"/>
         </w:numPr>
         <w:spacing w:after="120" w:line="259" w:lineRule="auto"/>
-        <w:ind w:right="0" w:hanging="360"/>
+        <w:ind w:left="1770" w:right="0" w:hanging="360"/>
         <w:jc w:val="left"/>
       </w:pPr>
       <w:r>
@@ -10402,7 +10187,7 @@
     <w:p>
       <w:pPr>
         <w:spacing w:after="0" w:line="360" w:lineRule="auto"/>
-        <w:ind w:left="1420" w:right="117"/>
+        <w:ind w:left="1765" w:right="117"/>
         <w:jc w:val="left"/>
       </w:pPr>
       <w:r>
@@ -10416,7 +10201,7 @@
           <w:numId w:val="9"/>
         </w:numPr>
         <w:spacing w:after="120" w:line="259" w:lineRule="auto"/>
-        <w:ind w:right="0" w:hanging="360"/>
+        <w:ind w:left="1770" w:right="0" w:hanging="360"/>
         <w:jc w:val="left"/>
       </w:pPr>
       <w:r>
@@ -10432,7 +10217,7 @@
     <w:p>
       <w:pPr>
         <w:spacing w:after="0" w:line="360" w:lineRule="auto"/>
-        <w:ind w:left="1420" w:right="117"/>
+        <w:ind w:left="1765" w:right="117"/>
         <w:jc w:val="left"/>
       </w:pPr>
       <w:r>
@@ -10455,20 +10240,27 @@
     <w:p>
       <w:pPr>
         <w:spacing w:after="120" w:line="259" w:lineRule="auto"/>
-        <w:ind w:left="-5" w:right="0"/>
+        <w:ind w:left="703" w:right="0" w:firstLine="5"/>
         <w:jc w:val="left"/>
       </w:pPr>
       <w:r>
         <w:rPr>
           <w:b/>
         </w:rPr>
+        <w:t xml:space="preserve">         </w:t>
+      </w:r>
+      <w:bookmarkStart w:id="31" w:name="_GoBack"/>
+      <w:bookmarkEnd w:id="31"/>
+      <w:r>
+        <w:rPr>
+          <w:b/>
+        </w:rPr>
         <w:t xml:space="preserve">ANEXOS </w:t>
       </w:r>
     </w:p>
     <w:p>
       <w:pPr>
-        <w:spacing w:line="360" w:lineRule="auto"/>
-        <w:ind w:left="-15" w:right="131" w:firstLine="705"/>
+        <w:pStyle w:val="PargrafodoProjeto"/>
       </w:pPr>
       <w:r>
         <w:t xml:space="preserve"> Sobre a entrevista com o Saulo, o seguinte, ele disse que ele gostaria de um sistema para o projeto de extensão dele, (0:10) que nesse sistema pudesse ter a organização dos filmes, a divulgação dos filmes para os usuários tanto internos quanto externos </w:t>
@@ -10477,16 +10269,11 @@
         <w:t>da escola</w:t>
       </w:r>
       <w:r>
-        <w:t xml:space="preserve">. (0:22) E ele falou também que para 20 pessoas, 10 sendo </w:t>
-      </w:r>
-      <w:proofErr w:type="gramStart"/>
-      <w:r>
-        <w:t xml:space="preserve">do </w:t>
+        <w:t xml:space="preserve">. (0:22) E ele falou também que para 20 pessoas, 10 sendo do </w:t>
       </w:r>
       <w:r>
         <w:t>escola</w:t>
       </w:r>
-      <w:proofErr w:type="gramEnd"/>
       <w:r>
         <w:t xml:space="preserve">, 10 sendo de fora. (0:34) Também ele falou que, semanalmente, a exibição dos filmes, que o sistema seria bastante bom para a divulgação, (0:46) que também ele disse que também poderia ser mais organizado se já esse sistema, os usuários pudessem fazer suas inscrições. </w:t>
       </w:r>
@@ -10521,59 +10308,37 @@
         <w:rPr>
           <w:b/>
         </w:rPr>
+        <w:lastRenderedPageBreak/>
         <w:t xml:space="preserve">  </w:t>
       </w:r>
     </w:p>
     <w:p>
       <w:pPr>
+        <w:pStyle w:val="TtulodoProjeto"/>
+      </w:pPr>
+      <w:r>
+        <w:t xml:space="preserve">REFERÊNCIAS  </w:t>
+      </w:r>
+    </w:p>
+    <w:p>
+      <w:pPr>
         <w:spacing w:after="120" w:line="259" w:lineRule="auto"/>
-        <w:ind w:left="-5" w:right="0"/>
+        <w:ind w:left="670" w:right="0"/>
         <w:jc w:val="left"/>
+      </w:pPr>
+    </w:p>
+    <w:p>
+      <w:pPr>
+        <w:spacing w:after="200"/>
+      </w:pPr>
+      <w:r>
+        <w:t xml:space="preserve">AQUILES, Alexandre e Rodrigo Ferreira. </w:t>
+      </w:r>
+      <w:r>
         <w:rPr>
           <w:b/>
         </w:rPr>
-      </w:pPr>
-      <w:r>
-        <w:rPr>
-          <w:b/>
-        </w:rPr>
-        <w:lastRenderedPageBreak/>
-        <w:t xml:space="preserve">REFERÊNCIAS  </w:t>
-      </w:r>
-    </w:p>
-    <w:p>
-      <w:pPr>
-        <w:spacing w:after="120" w:line="259" w:lineRule="auto"/>
-        <w:ind w:left="-5" w:right="0"/>
-        <w:jc w:val="left"/>
-      </w:pPr>
-    </w:p>
-    <w:p>
-      <w:pPr>
-        <w:spacing w:after="200"/>
-      </w:pPr>
-      <w:r>
-        <w:t xml:space="preserve">AQUILES, Alexandre e Rodrigo Ferreira. </w:t>
-      </w:r>
-      <w:r>
-        <w:rPr>
-          <w:b/>
-        </w:rPr>
-        <w:t xml:space="preserve">Controlando Versões com </w:t>
-      </w:r>
-      <w:proofErr w:type="spellStart"/>
-      <w:r>
-        <w:rPr>
-          <w:b/>
-        </w:rPr>
-        <w:t>Git</w:t>
-      </w:r>
-      <w:proofErr w:type="spellEnd"/>
-      <w:r>
-        <w:rPr>
-          <w:b/>
-        </w:rPr>
-        <w:t xml:space="preserve"> e GitHub</w:t>
+        <w:t>Controlando Versões com Git e GitHub</w:t>
       </w:r>
       <w:r>
         <w:t>. 1ªEdição. São Paulo. Casa do Código. 2014.</w:t>
@@ -10683,139 +10448,35 @@
         <w:spacing w:after="200"/>
       </w:pPr>
       <w:r>
-        <w:t xml:space="preserve">PMBOK® </w:t>
-      </w:r>
-      <w:proofErr w:type="spellStart"/>
-      <w:r>
-        <w:t>Guide</w:t>
-      </w:r>
-      <w:proofErr w:type="spellEnd"/>
-      <w:r>
-        <w:t xml:space="preserve"> – </w:t>
+        <w:t xml:space="preserve">PMBOK® Guide – </w:t>
       </w:r>
       <w:r>
         <w:rPr>
           <w:b/>
           <w:bCs/>
         </w:rPr>
-        <w:t xml:space="preserve">A </w:t>
-      </w:r>
-      <w:proofErr w:type="spellStart"/>
+        <w:t>A Guide to the Project Management Body of Knowledge. 6ª ed.</w:t>
+      </w:r>
+      <w:r>
+        <w:t xml:space="preserve"> Project Management Institute, 2017.</w:t>
+      </w:r>
+    </w:p>
+    <w:p>
+      <w:pPr>
+        <w:spacing w:after="200"/>
+      </w:pPr>
+      <w:r>
+        <w:t>BEAL, Adriana</w:t>
+      </w:r>
       <w:r>
         <w:rPr>
           <w:b/>
           <w:bCs/>
         </w:rPr>
-        <w:t>Guide</w:t>
-      </w:r>
-      <w:proofErr w:type="spellEnd"/>
-      <w:r>
-        <w:rPr>
-          <w:b/>
-          <w:bCs/>
-        </w:rPr>
-        <w:t xml:space="preserve"> </w:t>
-      </w:r>
-      <w:proofErr w:type="spellStart"/>
-      <w:r>
-        <w:rPr>
-          <w:b/>
-          <w:bCs/>
-        </w:rPr>
-        <w:t>to</w:t>
-      </w:r>
-      <w:proofErr w:type="spellEnd"/>
-      <w:r>
-        <w:rPr>
-          <w:b/>
-          <w:bCs/>
-        </w:rPr>
-        <w:t xml:space="preserve"> </w:t>
-      </w:r>
-      <w:proofErr w:type="spellStart"/>
-      <w:r>
-        <w:rPr>
-          <w:b/>
-          <w:bCs/>
-        </w:rPr>
-        <w:t>the</w:t>
-      </w:r>
-      <w:proofErr w:type="spellEnd"/>
-      <w:r>
-        <w:rPr>
-          <w:b/>
-          <w:bCs/>
-        </w:rPr>
-        <w:t xml:space="preserve"> Project Management Body </w:t>
-      </w:r>
-      <w:proofErr w:type="spellStart"/>
-      <w:r>
-        <w:rPr>
-          <w:b/>
-          <w:bCs/>
-        </w:rPr>
-        <w:t>of</w:t>
-      </w:r>
-      <w:proofErr w:type="spellEnd"/>
-      <w:r>
-        <w:rPr>
-          <w:b/>
-          <w:bCs/>
-        </w:rPr>
-        <w:t xml:space="preserve"> </w:t>
-      </w:r>
-      <w:proofErr w:type="spellStart"/>
-      <w:r>
-        <w:rPr>
-          <w:b/>
-          <w:bCs/>
-        </w:rPr>
-        <w:t>Knowledge</w:t>
-      </w:r>
-      <w:proofErr w:type="spellEnd"/>
-      <w:r>
-        <w:rPr>
-          <w:b/>
-          <w:bCs/>
-        </w:rPr>
-        <w:t>. 6ª ed.</w:t>
-      </w:r>
-      <w:r>
-        <w:t xml:space="preserve"> Project Management </w:t>
-      </w:r>
-      <w:proofErr w:type="spellStart"/>
-      <w:r>
-        <w:t>Institute</w:t>
-      </w:r>
-      <w:proofErr w:type="spellEnd"/>
-      <w:r>
-        <w:t>, 2017.</w:t>
-      </w:r>
-    </w:p>
-    <w:p>
-      <w:pPr>
-        <w:spacing w:after="200"/>
-      </w:pPr>
-      <w:r>
-        <w:t>BEAL, Adriana</w:t>
-      </w:r>
-      <w:r>
-        <w:rPr>
-          <w:b/>
-          <w:bCs/>
-        </w:rPr>
         <w:t>. Gestão de Requisitos: software orientado ao negócio. Rio de Janeiro:</w:t>
       </w:r>
       <w:r>
-        <w:t xml:space="preserve"> </w:t>
-      </w:r>
-      <w:proofErr w:type="spellStart"/>
-      <w:r>
-        <w:t>Brasport</w:t>
-      </w:r>
-      <w:proofErr w:type="spellEnd"/>
-      <w:r>
-        <w:t>, 2013.</w:t>
+        <w:t xml:space="preserve"> Brasport, 2013.</w:t>
       </w:r>
     </w:p>
     <w:p>
@@ -10876,7 +10537,7 @@
 </file>
 
 <file path=word/endnotes.xml><?xml version="1.0" encoding="utf-8"?>
-<w:endnotes xmlns:wpc="http://schemas.microsoft.com/office/word/2010/wordprocessingCanvas" xmlns:cx="http://schemas.microsoft.com/office/drawing/2014/chartex" xmlns:cx1="http://schemas.microsoft.com/office/drawing/2015/9/8/chartex" xmlns:cx2="http://schemas.microsoft.com/office/drawing/2015/10/21/chartex" xmlns:cx3="http://schemas.microsoft.com/office/drawing/2016/5/9/chartex" xmlns:cx4="http://schemas.microsoft.com/office/drawing/2016/5/10/chartex" xmlns:cx5="http://schemas.microsoft.com/office/drawing/2016/5/11/chartex" xmlns:cx6="http://schemas.microsoft.com/office/drawing/2016/5/12/chartex" xmlns:cx7="http://schemas.microsoft.com/office/drawing/2016/5/13/chartex" xmlns:cx8="http://schemas.microsoft.com/office/drawing/2016/5/14/chartex" xmlns:mc="http://schemas.openxmlformats.org/markup-compatibility/2006" xmlns:aink="http://schemas.microsoft.com/office/drawing/2016/ink" xmlns:am3d="http://schemas.microsoft.com/office/drawing/2017/model3d" xmlns:o="urn:schemas-microsoft-com:office:office" xmlns:oel="http://schemas.microsoft.com/office/2019/extlst" xmlns:r="http://schemas.openxmlformats.org/officeDocument/2006/relationships" xmlns:m="http://schemas.openxmlformats.org/officeDocument/2006/math" xmlns:v="urn:schemas-microsoft-com:vml" xmlns:wp14="http://schemas.microsoft.com/office/word/2010/wordprocessingDrawing" xmlns:wp="http://schemas.openxmlformats.org/drawingml/2006/wordprocessingDrawing" xmlns:w10="urn:schemas-microsoft-com:office:word" xmlns:w="http://schemas.openxmlformats.org/wordprocessingml/2006/main" xmlns:w14="http://schemas.microsoft.com/office/word/2010/wordml" xmlns:w15="http://schemas.microsoft.com/office/word/2012/wordml" xmlns:w16cex="http://schemas.microsoft.com/office/word/2018/wordml/cex" xmlns:w16cid="http://schemas.microsoft.com/office/word/2016/wordml/cid" xmlns:w16="http://schemas.microsoft.com/office/word/2018/wordml" xmlns:w16du="http://schemas.microsoft.com/office/word/2023/wordml/word16du" xmlns:w16sdtdh="http://schemas.microsoft.com/office/word/2020/wordml/sdtdatahash" xmlns:w16sdtfl="http://schemas.microsoft.com/office/word/2024/wordml/sdtformatlock" xmlns:w16se="http://schemas.microsoft.com/office/word/2015/wordml/symex" xmlns:wpg="http://schemas.microsoft.com/office/word/2010/wordprocessingGroup" xmlns:wpi="http://schemas.microsoft.com/office/word/2010/wordprocessingInk" xmlns:wne="http://schemas.microsoft.com/office/word/2006/wordml" xmlns:wps="http://schemas.microsoft.com/office/word/2010/wordprocessingShape" mc:Ignorable="w14 w15 w16se w16cid w16 w16cex w16sdtdh w16sdtfl w16du wp14">
+<w:endnotes xmlns:wpc="http://schemas.microsoft.com/office/word/2010/wordprocessingCanvas" xmlns:cx="http://schemas.microsoft.com/office/drawing/2014/chartex" xmlns:cx1="http://schemas.microsoft.com/office/drawing/2015/9/8/chartex" xmlns:cx2="http://schemas.microsoft.com/office/drawing/2015/10/21/chartex" xmlns:cx3="http://schemas.microsoft.com/office/drawing/2016/5/9/chartex" xmlns:cx4="http://schemas.microsoft.com/office/drawing/2016/5/10/chartex" xmlns:cx5="http://schemas.microsoft.com/office/drawing/2016/5/11/chartex" xmlns:cx6="http://schemas.microsoft.com/office/drawing/2016/5/12/chartex" xmlns:cx7="http://schemas.microsoft.com/office/drawing/2016/5/13/chartex" xmlns:cx8="http://schemas.microsoft.com/office/drawing/2016/5/14/chartex" xmlns:mc="http://schemas.openxmlformats.org/markup-compatibility/2006" xmlns:aink="http://schemas.microsoft.com/office/drawing/2016/ink" xmlns:am3d="http://schemas.microsoft.com/office/drawing/2017/model3d" xmlns:o="urn:schemas-microsoft-com:office:office" xmlns:r="http://schemas.openxmlformats.org/officeDocument/2006/relationships" xmlns:m="http://schemas.openxmlformats.org/officeDocument/2006/math" xmlns:v="urn:schemas-microsoft-com:vml" xmlns:wp14="http://schemas.microsoft.com/office/word/2010/wordprocessingDrawing" xmlns:wp="http://schemas.openxmlformats.org/drawingml/2006/wordprocessingDrawing" xmlns:w10="urn:schemas-microsoft-com:office:word" xmlns:w="http://schemas.openxmlformats.org/wordprocessingml/2006/main" xmlns:w14="http://schemas.microsoft.com/office/word/2010/wordml" xmlns:w15="http://schemas.microsoft.com/office/word/2012/wordml" xmlns:w16cid="http://schemas.microsoft.com/office/word/2016/wordml/cid" xmlns:w16se="http://schemas.microsoft.com/office/word/2015/wordml/symex" xmlns:wpg="http://schemas.microsoft.com/office/word/2010/wordprocessingGroup" xmlns:wpi="http://schemas.microsoft.com/office/word/2010/wordprocessingInk" xmlns:wne="http://schemas.microsoft.com/office/word/2006/wordml" xmlns:wps="http://schemas.microsoft.com/office/word/2010/wordprocessingShape" mc:Ignorable="w14 w15 w16se w16cid wp14">
   <w:endnote w:type="separator" w:id="-1">
     <w:p>
       <w:pPr>
@@ -10901,7 +10562,7 @@
 </file>
 
 <file path=word/footer1.xml><?xml version="1.0" encoding="utf-8"?>
-<w:ftr xmlns:wpc="http://schemas.microsoft.com/office/word/2010/wordprocessingCanvas" xmlns:cx="http://schemas.microsoft.com/office/drawing/2014/chartex" xmlns:cx1="http://schemas.microsoft.com/office/drawing/2015/9/8/chartex" xmlns:cx2="http://schemas.microsoft.com/office/drawing/2015/10/21/chartex" xmlns:cx3="http://schemas.microsoft.com/office/drawing/2016/5/9/chartex" xmlns:cx4="http://schemas.microsoft.com/office/drawing/2016/5/10/chartex" xmlns:cx5="http://schemas.microsoft.com/office/drawing/2016/5/11/chartex" xmlns:cx6="http://schemas.microsoft.com/office/drawing/2016/5/12/chartex" xmlns:cx7="http://schemas.microsoft.com/office/drawing/2016/5/13/chartex" xmlns:cx8="http://schemas.microsoft.com/office/drawing/2016/5/14/chartex" xmlns:mc="http://schemas.openxmlformats.org/markup-compatibility/2006" xmlns:aink="http://schemas.microsoft.com/office/drawing/2016/ink" xmlns:am3d="http://schemas.microsoft.com/office/drawing/2017/model3d" xmlns:o="urn:schemas-microsoft-com:office:office" xmlns:oel="http://schemas.microsoft.com/office/2019/extlst" xmlns:r="http://schemas.openxmlformats.org/officeDocument/2006/relationships" xmlns:m="http://schemas.openxmlformats.org/officeDocument/2006/math" xmlns:v="urn:schemas-microsoft-com:vml" xmlns:wp14="http://schemas.microsoft.com/office/word/2010/wordprocessingDrawing" xmlns:wp="http://schemas.openxmlformats.org/drawingml/2006/wordprocessingDrawing" xmlns:w10="urn:schemas-microsoft-com:office:word" xmlns:w="http://schemas.openxmlformats.org/wordprocessingml/2006/main" xmlns:w14="http://schemas.microsoft.com/office/word/2010/wordml" xmlns:w15="http://schemas.microsoft.com/office/word/2012/wordml" xmlns:w16cex="http://schemas.microsoft.com/office/word/2018/wordml/cex" xmlns:w16cid="http://schemas.microsoft.com/office/word/2016/wordml/cid" xmlns:w16="http://schemas.microsoft.com/office/word/2018/wordml" xmlns:w16du="http://schemas.microsoft.com/office/word/2023/wordml/word16du" xmlns:w16sdtdh="http://schemas.microsoft.com/office/word/2020/wordml/sdtdatahash" xmlns:w16sdtfl="http://schemas.microsoft.com/office/word/2024/wordml/sdtformatlock" xmlns:w16se="http://schemas.microsoft.com/office/word/2015/wordml/symex" xmlns:wpg="http://schemas.microsoft.com/office/word/2010/wordprocessingGroup" xmlns:wpi="http://schemas.microsoft.com/office/word/2010/wordprocessingInk" xmlns:wne="http://schemas.microsoft.com/office/word/2006/wordml" xmlns:wps="http://schemas.microsoft.com/office/word/2010/wordprocessingShape" mc:Ignorable="w14 w15 w16se w16cid w16 w16cex w16sdtdh w16sdtfl w16du wp14">
+<w:ftr xmlns:wpc="http://schemas.microsoft.com/office/word/2010/wordprocessingCanvas" xmlns:cx="http://schemas.microsoft.com/office/drawing/2014/chartex" xmlns:cx1="http://schemas.microsoft.com/office/drawing/2015/9/8/chartex" xmlns:cx2="http://schemas.microsoft.com/office/drawing/2015/10/21/chartex" xmlns:cx3="http://schemas.microsoft.com/office/drawing/2016/5/9/chartex" xmlns:cx4="http://schemas.microsoft.com/office/drawing/2016/5/10/chartex" xmlns:cx5="http://schemas.microsoft.com/office/drawing/2016/5/11/chartex" xmlns:cx6="http://schemas.microsoft.com/office/drawing/2016/5/12/chartex" xmlns:cx7="http://schemas.microsoft.com/office/drawing/2016/5/13/chartex" xmlns:cx8="http://schemas.microsoft.com/office/drawing/2016/5/14/chartex" xmlns:mc="http://schemas.openxmlformats.org/markup-compatibility/2006" xmlns:aink="http://schemas.microsoft.com/office/drawing/2016/ink" xmlns:am3d="http://schemas.microsoft.com/office/drawing/2017/model3d" xmlns:o="urn:schemas-microsoft-com:office:office" xmlns:r="http://schemas.openxmlformats.org/officeDocument/2006/relationships" xmlns:m="http://schemas.openxmlformats.org/officeDocument/2006/math" xmlns:v="urn:schemas-microsoft-com:vml" xmlns:wp14="http://schemas.microsoft.com/office/word/2010/wordprocessingDrawing" xmlns:wp="http://schemas.openxmlformats.org/drawingml/2006/wordprocessingDrawing" xmlns:w10="urn:schemas-microsoft-com:office:word" xmlns:w="http://schemas.openxmlformats.org/wordprocessingml/2006/main" xmlns:w14="http://schemas.microsoft.com/office/word/2010/wordml" xmlns:w15="http://schemas.microsoft.com/office/word/2012/wordml" xmlns:w16cid="http://schemas.microsoft.com/office/word/2016/wordml/cid" xmlns:w16se="http://schemas.microsoft.com/office/word/2015/wordml/symex" xmlns:wpg="http://schemas.microsoft.com/office/word/2010/wordprocessingGroup" xmlns:wpi="http://schemas.microsoft.com/office/word/2010/wordprocessingInk" xmlns:wne="http://schemas.microsoft.com/office/word/2006/wordml" xmlns:wps="http://schemas.microsoft.com/office/word/2010/wordprocessingShape" mc:Ignorable="w14 w15 w16se w16cid wp14">
   <w:p>
     <w:pPr>
       <w:spacing w:after="160" w:line="259" w:lineRule="auto"/>
@@ -10913,7 +10574,7 @@
 </file>
 
 <file path=word/footer2.xml><?xml version="1.0" encoding="utf-8"?>
-<w:ftr xmlns:wpc="http://schemas.microsoft.com/office/word/2010/wordprocessingCanvas" xmlns:cx="http://schemas.microsoft.com/office/drawing/2014/chartex" xmlns:cx1="http://schemas.microsoft.com/office/drawing/2015/9/8/chartex" xmlns:cx2="http://schemas.microsoft.com/office/drawing/2015/10/21/chartex" xmlns:cx3="http://schemas.microsoft.com/office/drawing/2016/5/9/chartex" xmlns:cx4="http://schemas.microsoft.com/office/drawing/2016/5/10/chartex" xmlns:cx5="http://schemas.microsoft.com/office/drawing/2016/5/11/chartex" xmlns:cx6="http://schemas.microsoft.com/office/drawing/2016/5/12/chartex" xmlns:cx7="http://schemas.microsoft.com/office/drawing/2016/5/13/chartex" xmlns:cx8="http://schemas.microsoft.com/office/drawing/2016/5/14/chartex" xmlns:mc="http://schemas.openxmlformats.org/markup-compatibility/2006" xmlns:aink="http://schemas.microsoft.com/office/drawing/2016/ink" xmlns:am3d="http://schemas.microsoft.com/office/drawing/2017/model3d" xmlns:o="urn:schemas-microsoft-com:office:office" xmlns:oel="http://schemas.microsoft.com/office/2019/extlst" xmlns:r="http://schemas.openxmlformats.org/officeDocument/2006/relationships" xmlns:m="http://schemas.openxmlformats.org/officeDocument/2006/math" xmlns:v="urn:schemas-microsoft-com:vml" xmlns:wp14="http://schemas.microsoft.com/office/word/2010/wordprocessingDrawing" xmlns:wp="http://schemas.openxmlformats.org/drawingml/2006/wordprocessingDrawing" xmlns:w10="urn:schemas-microsoft-com:office:word" xmlns:w="http://schemas.openxmlformats.org/wordprocessingml/2006/main" xmlns:w14="http://schemas.microsoft.com/office/word/2010/wordml" xmlns:w15="http://schemas.microsoft.com/office/word/2012/wordml" xmlns:w16cex="http://schemas.microsoft.com/office/word/2018/wordml/cex" xmlns:w16cid="http://schemas.microsoft.com/office/word/2016/wordml/cid" xmlns:w16="http://schemas.microsoft.com/office/word/2018/wordml" xmlns:w16du="http://schemas.microsoft.com/office/word/2023/wordml/word16du" xmlns:w16sdtdh="http://schemas.microsoft.com/office/word/2020/wordml/sdtdatahash" xmlns:w16sdtfl="http://schemas.microsoft.com/office/word/2024/wordml/sdtformatlock" xmlns:w16se="http://schemas.microsoft.com/office/word/2015/wordml/symex" xmlns:wpg="http://schemas.microsoft.com/office/word/2010/wordprocessingGroup" xmlns:wpi="http://schemas.microsoft.com/office/word/2010/wordprocessingInk" xmlns:wne="http://schemas.microsoft.com/office/word/2006/wordml" xmlns:wps="http://schemas.microsoft.com/office/word/2010/wordprocessingShape" mc:Ignorable="w14 w15 w16se w16cid w16 w16cex w16sdtdh w16sdtfl w16du wp14">
+<w:ftr xmlns:wpc="http://schemas.microsoft.com/office/word/2010/wordprocessingCanvas" xmlns:cx="http://schemas.microsoft.com/office/drawing/2014/chartex" xmlns:cx1="http://schemas.microsoft.com/office/drawing/2015/9/8/chartex" xmlns:cx2="http://schemas.microsoft.com/office/drawing/2015/10/21/chartex" xmlns:cx3="http://schemas.microsoft.com/office/drawing/2016/5/9/chartex" xmlns:cx4="http://schemas.microsoft.com/office/drawing/2016/5/10/chartex" xmlns:cx5="http://schemas.microsoft.com/office/drawing/2016/5/11/chartex" xmlns:cx6="http://schemas.microsoft.com/office/drawing/2016/5/12/chartex" xmlns:cx7="http://schemas.microsoft.com/office/drawing/2016/5/13/chartex" xmlns:cx8="http://schemas.microsoft.com/office/drawing/2016/5/14/chartex" xmlns:mc="http://schemas.openxmlformats.org/markup-compatibility/2006" xmlns:aink="http://schemas.microsoft.com/office/drawing/2016/ink" xmlns:am3d="http://schemas.microsoft.com/office/drawing/2017/model3d" xmlns:o="urn:schemas-microsoft-com:office:office" xmlns:r="http://schemas.openxmlformats.org/officeDocument/2006/relationships" xmlns:m="http://schemas.openxmlformats.org/officeDocument/2006/math" xmlns:v="urn:schemas-microsoft-com:vml" xmlns:wp14="http://schemas.microsoft.com/office/word/2010/wordprocessingDrawing" xmlns:wp="http://schemas.openxmlformats.org/drawingml/2006/wordprocessingDrawing" xmlns:w10="urn:schemas-microsoft-com:office:word" xmlns:w="http://schemas.openxmlformats.org/wordprocessingml/2006/main" xmlns:w14="http://schemas.microsoft.com/office/word/2010/wordml" xmlns:w15="http://schemas.microsoft.com/office/word/2012/wordml" xmlns:w16cid="http://schemas.microsoft.com/office/word/2016/wordml/cid" xmlns:w16se="http://schemas.microsoft.com/office/word/2015/wordml/symex" xmlns:wpg="http://schemas.microsoft.com/office/word/2010/wordprocessingGroup" xmlns:wpi="http://schemas.microsoft.com/office/word/2010/wordprocessingInk" xmlns:wne="http://schemas.microsoft.com/office/word/2006/wordml" xmlns:wps="http://schemas.microsoft.com/office/word/2010/wordprocessingShape" mc:Ignorable="w14 w15 w16se w16cid wp14">
   <w:p>
     <w:pPr>
       <w:spacing w:after="160" w:line="259" w:lineRule="auto"/>
@@ -10925,7 +10586,7 @@
 </file>
 
 <file path=word/footer3.xml><?xml version="1.0" encoding="utf-8"?>
-<w:ftr xmlns:wpc="http://schemas.microsoft.com/office/word/2010/wordprocessingCanvas" xmlns:cx="http://schemas.microsoft.com/office/drawing/2014/chartex" xmlns:cx1="http://schemas.microsoft.com/office/drawing/2015/9/8/chartex" xmlns:cx2="http://schemas.microsoft.com/office/drawing/2015/10/21/chartex" xmlns:cx3="http://schemas.microsoft.com/office/drawing/2016/5/9/chartex" xmlns:cx4="http://schemas.microsoft.com/office/drawing/2016/5/10/chartex" xmlns:cx5="http://schemas.microsoft.com/office/drawing/2016/5/11/chartex" xmlns:cx6="http://schemas.microsoft.com/office/drawing/2016/5/12/chartex" xmlns:cx7="http://schemas.microsoft.com/office/drawing/2016/5/13/chartex" xmlns:cx8="http://schemas.microsoft.com/office/drawing/2016/5/14/chartex" xmlns:mc="http://schemas.openxmlformats.org/markup-compatibility/2006" xmlns:aink="http://schemas.microsoft.com/office/drawing/2016/ink" xmlns:am3d="http://schemas.microsoft.com/office/drawing/2017/model3d" xmlns:o="urn:schemas-microsoft-com:office:office" xmlns:oel="http://schemas.microsoft.com/office/2019/extlst" xmlns:r="http://schemas.openxmlformats.org/officeDocument/2006/relationships" xmlns:m="http://schemas.openxmlformats.org/officeDocument/2006/math" xmlns:v="urn:schemas-microsoft-com:vml" xmlns:wp14="http://schemas.microsoft.com/office/word/2010/wordprocessingDrawing" xmlns:wp="http://schemas.openxmlformats.org/drawingml/2006/wordprocessingDrawing" xmlns:w10="urn:schemas-microsoft-com:office:word" xmlns:w="http://schemas.openxmlformats.org/wordprocessingml/2006/main" xmlns:w14="http://schemas.microsoft.com/office/word/2010/wordml" xmlns:w15="http://schemas.microsoft.com/office/word/2012/wordml" xmlns:w16cex="http://schemas.microsoft.com/office/word/2018/wordml/cex" xmlns:w16cid="http://schemas.microsoft.com/office/word/2016/wordml/cid" xmlns:w16="http://schemas.microsoft.com/office/word/2018/wordml" xmlns:w16du="http://schemas.microsoft.com/office/word/2023/wordml/word16du" xmlns:w16sdtdh="http://schemas.microsoft.com/office/word/2020/wordml/sdtdatahash" xmlns:w16sdtfl="http://schemas.microsoft.com/office/word/2024/wordml/sdtformatlock" xmlns:w16se="http://schemas.microsoft.com/office/word/2015/wordml/symex" xmlns:wpg="http://schemas.microsoft.com/office/word/2010/wordprocessingGroup" xmlns:wpi="http://schemas.microsoft.com/office/word/2010/wordprocessingInk" xmlns:wne="http://schemas.microsoft.com/office/word/2006/wordml" xmlns:wps="http://schemas.microsoft.com/office/word/2010/wordprocessingShape" mc:Ignorable="w14 w15 w16se w16cid w16 w16cex w16sdtdh w16sdtfl w16du wp14">
+<w:ftr xmlns:wpc="http://schemas.microsoft.com/office/word/2010/wordprocessingCanvas" xmlns:cx="http://schemas.microsoft.com/office/drawing/2014/chartex" xmlns:cx1="http://schemas.microsoft.com/office/drawing/2015/9/8/chartex" xmlns:cx2="http://schemas.microsoft.com/office/drawing/2015/10/21/chartex" xmlns:cx3="http://schemas.microsoft.com/office/drawing/2016/5/9/chartex" xmlns:cx4="http://schemas.microsoft.com/office/drawing/2016/5/10/chartex" xmlns:cx5="http://schemas.microsoft.com/office/drawing/2016/5/11/chartex" xmlns:cx6="http://schemas.microsoft.com/office/drawing/2016/5/12/chartex" xmlns:cx7="http://schemas.microsoft.com/office/drawing/2016/5/13/chartex" xmlns:cx8="http://schemas.microsoft.com/office/drawing/2016/5/14/chartex" xmlns:mc="http://schemas.openxmlformats.org/markup-compatibility/2006" xmlns:aink="http://schemas.microsoft.com/office/drawing/2016/ink" xmlns:am3d="http://schemas.microsoft.com/office/drawing/2017/model3d" xmlns:o="urn:schemas-microsoft-com:office:office" xmlns:r="http://schemas.openxmlformats.org/officeDocument/2006/relationships" xmlns:m="http://schemas.openxmlformats.org/officeDocument/2006/math" xmlns:v="urn:schemas-microsoft-com:vml" xmlns:wp14="http://schemas.microsoft.com/office/word/2010/wordprocessingDrawing" xmlns:wp="http://schemas.openxmlformats.org/drawingml/2006/wordprocessingDrawing" xmlns:w10="urn:schemas-microsoft-com:office:word" xmlns:w="http://schemas.openxmlformats.org/wordprocessingml/2006/main" xmlns:w14="http://schemas.microsoft.com/office/word/2010/wordml" xmlns:w15="http://schemas.microsoft.com/office/word/2012/wordml" xmlns:w16cid="http://schemas.microsoft.com/office/word/2016/wordml/cid" xmlns:w16se="http://schemas.microsoft.com/office/word/2015/wordml/symex" xmlns:wpg="http://schemas.microsoft.com/office/word/2010/wordprocessingGroup" xmlns:wpi="http://schemas.microsoft.com/office/word/2010/wordprocessingInk" xmlns:wne="http://schemas.microsoft.com/office/word/2006/wordml" xmlns:wps="http://schemas.microsoft.com/office/word/2010/wordprocessingShape" mc:Ignorable="w14 w15 w16se w16cid wp14">
   <w:p>
     <w:pPr>
       <w:spacing w:after="160" w:line="259" w:lineRule="auto"/>
@@ -10937,7 +10598,7 @@
 </file>
 
 <file path=word/footer4.xml><?xml version="1.0" encoding="utf-8"?>
-<w:ftr xmlns:wpc="http://schemas.microsoft.com/office/word/2010/wordprocessingCanvas" xmlns:cx="http://schemas.microsoft.com/office/drawing/2014/chartex" xmlns:cx1="http://schemas.microsoft.com/office/drawing/2015/9/8/chartex" xmlns:cx2="http://schemas.microsoft.com/office/drawing/2015/10/21/chartex" xmlns:cx3="http://schemas.microsoft.com/office/drawing/2016/5/9/chartex" xmlns:cx4="http://schemas.microsoft.com/office/drawing/2016/5/10/chartex" xmlns:cx5="http://schemas.microsoft.com/office/drawing/2016/5/11/chartex" xmlns:cx6="http://schemas.microsoft.com/office/drawing/2016/5/12/chartex" xmlns:cx7="http://schemas.microsoft.com/office/drawing/2016/5/13/chartex" xmlns:cx8="http://schemas.microsoft.com/office/drawing/2016/5/14/chartex" xmlns:mc="http://schemas.openxmlformats.org/markup-compatibility/2006" xmlns:aink="http://schemas.microsoft.com/office/drawing/2016/ink" xmlns:am3d="http://schemas.microsoft.com/office/drawing/2017/model3d" xmlns:o="urn:schemas-microsoft-com:office:office" xmlns:oel="http://schemas.microsoft.com/office/2019/extlst" xmlns:r="http://schemas.openxmlformats.org/officeDocument/2006/relationships" xmlns:m="http://schemas.openxmlformats.org/officeDocument/2006/math" xmlns:v="urn:schemas-microsoft-com:vml" xmlns:wp14="http://schemas.microsoft.com/office/word/2010/wordprocessingDrawing" xmlns:wp="http://schemas.openxmlformats.org/drawingml/2006/wordprocessingDrawing" xmlns:w10="urn:schemas-microsoft-com:office:word" xmlns:w="http://schemas.openxmlformats.org/wordprocessingml/2006/main" xmlns:w14="http://schemas.microsoft.com/office/word/2010/wordml" xmlns:w15="http://schemas.microsoft.com/office/word/2012/wordml" xmlns:w16cex="http://schemas.microsoft.com/office/word/2018/wordml/cex" xmlns:w16cid="http://schemas.microsoft.com/office/word/2016/wordml/cid" xmlns:w16="http://schemas.microsoft.com/office/word/2018/wordml" xmlns:w16du="http://schemas.microsoft.com/office/word/2023/wordml/word16du" xmlns:w16sdtdh="http://schemas.microsoft.com/office/word/2020/wordml/sdtdatahash" xmlns:w16sdtfl="http://schemas.microsoft.com/office/word/2024/wordml/sdtformatlock" xmlns:w16se="http://schemas.microsoft.com/office/word/2015/wordml/symex" xmlns:wpg="http://schemas.microsoft.com/office/word/2010/wordprocessingGroup" xmlns:wpi="http://schemas.microsoft.com/office/word/2010/wordprocessingInk" xmlns:wne="http://schemas.microsoft.com/office/word/2006/wordml" xmlns:wps="http://schemas.microsoft.com/office/word/2010/wordprocessingShape" mc:Ignorable="w14 w15 w16se w16cid w16 w16cex w16sdtdh w16sdtfl w16du wp14">
+<w:ftr xmlns:wpc="http://schemas.microsoft.com/office/word/2010/wordprocessingCanvas" xmlns:cx="http://schemas.microsoft.com/office/drawing/2014/chartex" xmlns:cx1="http://schemas.microsoft.com/office/drawing/2015/9/8/chartex" xmlns:cx2="http://schemas.microsoft.com/office/drawing/2015/10/21/chartex" xmlns:cx3="http://schemas.microsoft.com/office/drawing/2016/5/9/chartex" xmlns:cx4="http://schemas.microsoft.com/office/drawing/2016/5/10/chartex" xmlns:cx5="http://schemas.microsoft.com/office/drawing/2016/5/11/chartex" xmlns:cx6="http://schemas.microsoft.com/office/drawing/2016/5/12/chartex" xmlns:cx7="http://schemas.microsoft.com/office/drawing/2016/5/13/chartex" xmlns:cx8="http://schemas.microsoft.com/office/drawing/2016/5/14/chartex" xmlns:mc="http://schemas.openxmlformats.org/markup-compatibility/2006" xmlns:aink="http://schemas.microsoft.com/office/drawing/2016/ink" xmlns:am3d="http://schemas.microsoft.com/office/drawing/2017/model3d" xmlns:o="urn:schemas-microsoft-com:office:office" xmlns:r="http://schemas.openxmlformats.org/officeDocument/2006/relationships" xmlns:m="http://schemas.openxmlformats.org/officeDocument/2006/math" xmlns:v="urn:schemas-microsoft-com:vml" xmlns:wp14="http://schemas.microsoft.com/office/word/2010/wordprocessingDrawing" xmlns:wp="http://schemas.openxmlformats.org/drawingml/2006/wordprocessingDrawing" xmlns:w10="urn:schemas-microsoft-com:office:word" xmlns:w="http://schemas.openxmlformats.org/wordprocessingml/2006/main" xmlns:w14="http://schemas.microsoft.com/office/word/2010/wordml" xmlns:w15="http://schemas.microsoft.com/office/word/2012/wordml" xmlns:w16cid="http://schemas.microsoft.com/office/word/2016/wordml/cid" xmlns:w16se="http://schemas.microsoft.com/office/word/2015/wordml/symex" xmlns:wpg="http://schemas.microsoft.com/office/word/2010/wordprocessingGroup" xmlns:wpi="http://schemas.microsoft.com/office/word/2010/wordprocessingInk" xmlns:wne="http://schemas.microsoft.com/office/word/2006/wordml" xmlns:wps="http://schemas.microsoft.com/office/word/2010/wordprocessingShape" mc:Ignorable="w14 w15 w16se w16cid wp14">
   <w:p>
     <w:pPr>
       <w:spacing w:after="0" w:line="259" w:lineRule="auto"/>
@@ -10977,7 +10638,7 @@
 </file>
 
 <file path=word/footer5.xml><?xml version="1.0" encoding="utf-8"?>
-<w:ftr xmlns:wpc="http://schemas.microsoft.com/office/word/2010/wordprocessingCanvas" xmlns:cx="http://schemas.microsoft.com/office/drawing/2014/chartex" xmlns:cx1="http://schemas.microsoft.com/office/drawing/2015/9/8/chartex" xmlns:cx2="http://schemas.microsoft.com/office/drawing/2015/10/21/chartex" xmlns:cx3="http://schemas.microsoft.com/office/drawing/2016/5/9/chartex" xmlns:cx4="http://schemas.microsoft.com/office/drawing/2016/5/10/chartex" xmlns:cx5="http://schemas.microsoft.com/office/drawing/2016/5/11/chartex" xmlns:cx6="http://schemas.microsoft.com/office/drawing/2016/5/12/chartex" xmlns:cx7="http://schemas.microsoft.com/office/drawing/2016/5/13/chartex" xmlns:cx8="http://schemas.microsoft.com/office/drawing/2016/5/14/chartex" xmlns:mc="http://schemas.openxmlformats.org/markup-compatibility/2006" xmlns:aink="http://schemas.microsoft.com/office/drawing/2016/ink" xmlns:am3d="http://schemas.microsoft.com/office/drawing/2017/model3d" xmlns:o="urn:schemas-microsoft-com:office:office" xmlns:oel="http://schemas.microsoft.com/office/2019/extlst" xmlns:r="http://schemas.openxmlformats.org/officeDocument/2006/relationships" xmlns:m="http://schemas.openxmlformats.org/officeDocument/2006/math" xmlns:v="urn:schemas-microsoft-com:vml" xmlns:wp14="http://schemas.microsoft.com/office/word/2010/wordprocessingDrawing" xmlns:wp="http://schemas.openxmlformats.org/drawingml/2006/wordprocessingDrawing" xmlns:w10="urn:schemas-microsoft-com:office:word" xmlns:w="http://schemas.openxmlformats.org/wordprocessingml/2006/main" xmlns:w14="http://schemas.microsoft.com/office/word/2010/wordml" xmlns:w15="http://schemas.microsoft.com/office/word/2012/wordml" xmlns:w16cex="http://schemas.microsoft.com/office/word/2018/wordml/cex" xmlns:w16cid="http://schemas.microsoft.com/office/word/2016/wordml/cid" xmlns:w16="http://schemas.microsoft.com/office/word/2018/wordml" xmlns:w16du="http://schemas.microsoft.com/office/word/2023/wordml/word16du" xmlns:w16sdtdh="http://schemas.microsoft.com/office/word/2020/wordml/sdtdatahash" xmlns:w16sdtfl="http://schemas.microsoft.com/office/word/2024/wordml/sdtformatlock" xmlns:w16se="http://schemas.microsoft.com/office/word/2015/wordml/symex" xmlns:wpg="http://schemas.microsoft.com/office/word/2010/wordprocessingGroup" xmlns:wpi="http://schemas.microsoft.com/office/word/2010/wordprocessingInk" xmlns:wne="http://schemas.microsoft.com/office/word/2006/wordml" xmlns:wps="http://schemas.microsoft.com/office/word/2010/wordprocessingShape" mc:Ignorable="w14 w15 w16se w16cid w16 w16cex w16sdtdh w16sdtfl w16du wp14">
+<w:ftr xmlns:wpc="http://schemas.microsoft.com/office/word/2010/wordprocessingCanvas" xmlns:cx="http://schemas.microsoft.com/office/drawing/2014/chartex" xmlns:cx1="http://schemas.microsoft.com/office/drawing/2015/9/8/chartex" xmlns:cx2="http://schemas.microsoft.com/office/drawing/2015/10/21/chartex" xmlns:cx3="http://schemas.microsoft.com/office/drawing/2016/5/9/chartex" xmlns:cx4="http://schemas.microsoft.com/office/drawing/2016/5/10/chartex" xmlns:cx5="http://schemas.microsoft.com/office/drawing/2016/5/11/chartex" xmlns:cx6="http://schemas.microsoft.com/office/drawing/2016/5/12/chartex" xmlns:cx7="http://schemas.microsoft.com/office/drawing/2016/5/13/chartex" xmlns:cx8="http://schemas.microsoft.com/office/drawing/2016/5/14/chartex" xmlns:mc="http://schemas.openxmlformats.org/markup-compatibility/2006" xmlns:aink="http://schemas.microsoft.com/office/drawing/2016/ink" xmlns:am3d="http://schemas.microsoft.com/office/drawing/2017/model3d" xmlns:o="urn:schemas-microsoft-com:office:office" xmlns:r="http://schemas.openxmlformats.org/officeDocument/2006/relationships" xmlns:m="http://schemas.openxmlformats.org/officeDocument/2006/math" xmlns:v="urn:schemas-microsoft-com:vml" xmlns:wp14="http://schemas.microsoft.com/office/word/2010/wordprocessingDrawing" xmlns:wp="http://schemas.openxmlformats.org/drawingml/2006/wordprocessingDrawing" xmlns:w10="urn:schemas-microsoft-com:office:word" xmlns:w="http://schemas.openxmlformats.org/wordprocessingml/2006/main" xmlns:w14="http://schemas.microsoft.com/office/word/2010/wordml" xmlns:w15="http://schemas.microsoft.com/office/word/2012/wordml" xmlns:w16cid="http://schemas.microsoft.com/office/word/2016/wordml/cid" xmlns:w16se="http://schemas.microsoft.com/office/word/2015/wordml/symex" xmlns:wpg="http://schemas.microsoft.com/office/word/2010/wordprocessingGroup" xmlns:wpi="http://schemas.microsoft.com/office/word/2010/wordprocessingInk" xmlns:wne="http://schemas.microsoft.com/office/word/2006/wordml" xmlns:wps="http://schemas.microsoft.com/office/word/2010/wordprocessingShape" mc:Ignorable="w14 w15 w16se w16cid wp14">
   <w:p>
     <w:pPr>
       <w:spacing w:after="0" w:line="259" w:lineRule="auto"/>
@@ -11017,7 +10678,7 @@
 </file>
 
 <file path=word/footer6.xml><?xml version="1.0" encoding="utf-8"?>
-<w:ftr xmlns:wpc="http://schemas.microsoft.com/office/word/2010/wordprocessingCanvas" xmlns:cx="http://schemas.microsoft.com/office/drawing/2014/chartex" xmlns:cx1="http://schemas.microsoft.com/office/drawing/2015/9/8/chartex" xmlns:cx2="http://schemas.microsoft.com/office/drawing/2015/10/21/chartex" xmlns:cx3="http://schemas.microsoft.com/office/drawing/2016/5/9/chartex" xmlns:cx4="http://schemas.microsoft.com/office/drawing/2016/5/10/chartex" xmlns:cx5="http://schemas.microsoft.com/office/drawing/2016/5/11/chartex" xmlns:cx6="http://schemas.microsoft.com/office/drawing/2016/5/12/chartex" xmlns:cx7="http://schemas.microsoft.com/office/drawing/2016/5/13/chartex" xmlns:cx8="http://schemas.microsoft.com/office/drawing/2016/5/14/chartex" xmlns:mc="http://schemas.openxmlformats.org/markup-compatibility/2006" xmlns:aink="http://schemas.microsoft.com/office/drawing/2016/ink" xmlns:am3d="http://schemas.microsoft.com/office/drawing/2017/model3d" xmlns:o="urn:schemas-microsoft-com:office:office" xmlns:oel="http://schemas.microsoft.com/office/2019/extlst" xmlns:r="http://schemas.openxmlformats.org/officeDocument/2006/relationships" xmlns:m="http://schemas.openxmlformats.org/officeDocument/2006/math" xmlns:v="urn:schemas-microsoft-com:vml" xmlns:wp14="http://schemas.microsoft.com/office/word/2010/wordprocessingDrawing" xmlns:wp="http://schemas.openxmlformats.org/drawingml/2006/wordprocessingDrawing" xmlns:w10="urn:schemas-microsoft-com:office:word" xmlns:w="http://schemas.openxmlformats.org/wordprocessingml/2006/main" xmlns:w14="http://schemas.microsoft.com/office/word/2010/wordml" xmlns:w15="http://schemas.microsoft.com/office/word/2012/wordml" xmlns:w16cex="http://schemas.microsoft.com/office/word/2018/wordml/cex" xmlns:w16cid="http://schemas.microsoft.com/office/word/2016/wordml/cid" xmlns:w16="http://schemas.microsoft.com/office/word/2018/wordml" xmlns:w16du="http://schemas.microsoft.com/office/word/2023/wordml/word16du" xmlns:w16sdtdh="http://schemas.microsoft.com/office/word/2020/wordml/sdtdatahash" xmlns:w16sdtfl="http://schemas.microsoft.com/office/word/2024/wordml/sdtformatlock" xmlns:w16se="http://schemas.microsoft.com/office/word/2015/wordml/symex" xmlns:wpg="http://schemas.microsoft.com/office/word/2010/wordprocessingGroup" xmlns:wpi="http://schemas.microsoft.com/office/word/2010/wordprocessingInk" xmlns:wne="http://schemas.microsoft.com/office/word/2006/wordml" xmlns:wps="http://schemas.microsoft.com/office/word/2010/wordprocessingShape" mc:Ignorable="w14 w15 w16se w16cid w16 w16cex w16sdtdh w16sdtfl w16du wp14">
+<w:ftr xmlns:wpc="http://schemas.microsoft.com/office/word/2010/wordprocessingCanvas" xmlns:cx="http://schemas.microsoft.com/office/drawing/2014/chartex" xmlns:cx1="http://schemas.microsoft.com/office/drawing/2015/9/8/chartex" xmlns:cx2="http://schemas.microsoft.com/office/drawing/2015/10/21/chartex" xmlns:cx3="http://schemas.microsoft.com/office/drawing/2016/5/9/chartex" xmlns:cx4="http://schemas.microsoft.com/office/drawing/2016/5/10/chartex" xmlns:cx5="http://schemas.microsoft.com/office/drawing/2016/5/11/chartex" xmlns:cx6="http://schemas.microsoft.com/office/drawing/2016/5/12/chartex" xmlns:cx7="http://schemas.microsoft.com/office/drawing/2016/5/13/chartex" xmlns:cx8="http://schemas.microsoft.com/office/drawing/2016/5/14/chartex" xmlns:mc="http://schemas.openxmlformats.org/markup-compatibility/2006" xmlns:aink="http://schemas.microsoft.com/office/drawing/2016/ink" xmlns:am3d="http://schemas.microsoft.com/office/drawing/2017/model3d" xmlns:o="urn:schemas-microsoft-com:office:office" xmlns:r="http://schemas.openxmlformats.org/officeDocument/2006/relationships" xmlns:m="http://schemas.openxmlformats.org/officeDocument/2006/math" xmlns:v="urn:schemas-microsoft-com:vml" xmlns:wp14="http://schemas.microsoft.com/office/word/2010/wordprocessingDrawing" xmlns:wp="http://schemas.openxmlformats.org/drawingml/2006/wordprocessingDrawing" xmlns:w10="urn:schemas-microsoft-com:office:word" xmlns:w="http://schemas.openxmlformats.org/wordprocessingml/2006/main" xmlns:w14="http://schemas.microsoft.com/office/word/2010/wordml" xmlns:w15="http://schemas.microsoft.com/office/word/2012/wordml" xmlns:w16cid="http://schemas.microsoft.com/office/word/2016/wordml/cid" xmlns:w16se="http://schemas.microsoft.com/office/word/2015/wordml/symex" xmlns:wpg="http://schemas.microsoft.com/office/word/2010/wordprocessingGroup" xmlns:wpi="http://schemas.microsoft.com/office/word/2010/wordprocessingInk" xmlns:wne="http://schemas.microsoft.com/office/word/2006/wordml" xmlns:wps="http://schemas.microsoft.com/office/word/2010/wordprocessingShape" mc:Ignorable="w14 w15 w16se w16cid wp14">
   <w:p>
     <w:pPr>
       <w:spacing w:after="0" w:line="259" w:lineRule="auto"/>
@@ -11057,7 +10718,7 @@
 </file>
 
 <file path=word/footnotes.xml><?xml version="1.0" encoding="utf-8"?>
-<w:footnotes xmlns:wpc="http://schemas.microsoft.com/office/word/2010/wordprocessingCanvas" xmlns:cx="http://schemas.microsoft.com/office/drawing/2014/chartex" xmlns:cx1="http://schemas.microsoft.com/office/drawing/2015/9/8/chartex" xmlns:cx2="http://schemas.microsoft.com/office/drawing/2015/10/21/chartex" xmlns:cx3="http://schemas.microsoft.com/office/drawing/2016/5/9/chartex" xmlns:cx4="http://schemas.microsoft.com/office/drawing/2016/5/10/chartex" xmlns:cx5="http://schemas.microsoft.com/office/drawing/2016/5/11/chartex" xmlns:cx6="http://schemas.microsoft.com/office/drawing/2016/5/12/chartex" xmlns:cx7="http://schemas.microsoft.com/office/drawing/2016/5/13/chartex" xmlns:cx8="http://schemas.microsoft.com/office/drawing/2016/5/14/chartex" xmlns:mc="http://schemas.openxmlformats.org/markup-compatibility/2006" xmlns:aink="http://schemas.microsoft.com/office/drawing/2016/ink" xmlns:am3d="http://schemas.microsoft.com/office/drawing/2017/model3d" xmlns:o="urn:schemas-microsoft-com:office:office" xmlns:oel="http://schemas.microsoft.com/office/2019/extlst" xmlns:r="http://schemas.openxmlformats.org/officeDocument/2006/relationships" xmlns:m="http://schemas.openxmlformats.org/officeDocument/2006/math" xmlns:v="urn:schemas-microsoft-com:vml" xmlns:wp14="http://schemas.microsoft.com/office/word/2010/wordprocessingDrawing" xmlns:wp="http://schemas.openxmlformats.org/drawingml/2006/wordprocessingDrawing" xmlns:w10="urn:schemas-microsoft-com:office:word" xmlns:w="http://schemas.openxmlformats.org/wordprocessingml/2006/main" xmlns:w14="http://schemas.microsoft.com/office/word/2010/wordml" xmlns:w15="http://schemas.microsoft.com/office/word/2012/wordml" xmlns:w16cex="http://schemas.microsoft.com/office/word/2018/wordml/cex" xmlns:w16cid="http://schemas.microsoft.com/office/word/2016/wordml/cid" xmlns:w16="http://schemas.microsoft.com/office/word/2018/wordml" xmlns:w16du="http://schemas.microsoft.com/office/word/2023/wordml/word16du" xmlns:w16sdtdh="http://schemas.microsoft.com/office/word/2020/wordml/sdtdatahash" xmlns:w16sdtfl="http://schemas.microsoft.com/office/word/2024/wordml/sdtformatlock" xmlns:w16se="http://schemas.microsoft.com/office/word/2015/wordml/symex" xmlns:wpg="http://schemas.microsoft.com/office/word/2010/wordprocessingGroup" xmlns:wpi="http://schemas.microsoft.com/office/word/2010/wordprocessingInk" xmlns:wne="http://schemas.microsoft.com/office/word/2006/wordml" xmlns:wps="http://schemas.microsoft.com/office/word/2010/wordprocessingShape" mc:Ignorable="w14 w15 w16se w16cid w16 w16cex w16sdtdh w16sdtfl w16du wp14">
+<w:footnotes xmlns:wpc="http://schemas.microsoft.com/office/word/2010/wordprocessingCanvas" xmlns:cx="http://schemas.microsoft.com/office/drawing/2014/chartex" xmlns:cx1="http://schemas.microsoft.com/office/drawing/2015/9/8/chartex" xmlns:cx2="http://schemas.microsoft.com/office/drawing/2015/10/21/chartex" xmlns:cx3="http://schemas.microsoft.com/office/drawing/2016/5/9/chartex" xmlns:cx4="http://schemas.microsoft.com/office/drawing/2016/5/10/chartex" xmlns:cx5="http://schemas.microsoft.com/office/drawing/2016/5/11/chartex" xmlns:cx6="http://schemas.microsoft.com/office/drawing/2016/5/12/chartex" xmlns:cx7="http://schemas.microsoft.com/office/drawing/2016/5/13/chartex" xmlns:cx8="http://schemas.microsoft.com/office/drawing/2016/5/14/chartex" xmlns:mc="http://schemas.openxmlformats.org/markup-compatibility/2006" xmlns:aink="http://schemas.microsoft.com/office/drawing/2016/ink" xmlns:am3d="http://schemas.microsoft.com/office/drawing/2017/model3d" xmlns:o="urn:schemas-microsoft-com:office:office" xmlns:r="http://schemas.openxmlformats.org/officeDocument/2006/relationships" xmlns:m="http://schemas.openxmlformats.org/officeDocument/2006/math" xmlns:v="urn:schemas-microsoft-com:vml" xmlns:wp14="http://schemas.microsoft.com/office/word/2010/wordprocessingDrawing" xmlns:wp="http://schemas.openxmlformats.org/drawingml/2006/wordprocessingDrawing" xmlns:w10="urn:schemas-microsoft-com:office:word" xmlns:w="http://schemas.openxmlformats.org/wordprocessingml/2006/main" xmlns:w14="http://schemas.microsoft.com/office/word/2010/wordml" xmlns:w15="http://schemas.microsoft.com/office/word/2012/wordml" xmlns:w16cid="http://schemas.microsoft.com/office/word/2016/wordml/cid" xmlns:w16se="http://schemas.microsoft.com/office/word/2015/wordml/symex" xmlns:wpg="http://schemas.microsoft.com/office/word/2010/wordprocessingGroup" xmlns:wpi="http://schemas.microsoft.com/office/word/2010/wordprocessingInk" xmlns:wne="http://schemas.microsoft.com/office/word/2006/wordml" xmlns:wps="http://schemas.microsoft.com/office/word/2010/wordprocessingShape" mc:Ignorable="w14 w15 w16se w16cid wp14">
   <w:footnote w:type="separator" w:id="-1">
     <w:p>
       <w:pPr>
@@ -11082,7 +10743,7 @@
 </file>
 
 <file path=word/numbering.xml><?xml version="1.0" encoding="utf-8"?>
-<w:numbering xmlns:wpc="http://schemas.microsoft.com/office/word/2010/wordprocessingCanvas" xmlns:cx="http://schemas.microsoft.com/office/drawing/2014/chartex" xmlns:cx1="http://schemas.microsoft.com/office/drawing/2015/9/8/chartex" xmlns:cx2="http://schemas.microsoft.com/office/drawing/2015/10/21/chartex" xmlns:cx3="http://schemas.microsoft.com/office/drawing/2016/5/9/chartex" xmlns:cx4="http://schemas.microsoft.com/office/drawing/2016/5/10/chartex" xmlns:cx5="http://schemas.microsoft.com/office/drawing/2016/5/11/chartex" xmlns:cx6="http://schemas.microsoft.com/office/drawing/2016/5/12/chartex" xmlns:cx7="http://schemas.microsoft.com/office/drawing/2016/5/13/chartex" xmlns:cx8="http://schemas.microsoft.com/office/drawing/2016/5/14/chartex" xmlns:mc="http://schemas.openxmlformats.org/markup-compatibility/2006" xmlns:aink="http://schemas.microsoft.com/office/drawing/2016/ink" xmlns:am3d="http://schemas.microsoft.com/office/drawing/2017/model3d" xmlns:o="urn:schemas-microsoft-com:office:office" xmlns:oel="http://schemas.microsoft.com/office/2019/extlst" xmlns:r="http://schemas.openxmlformats.org/officeDocument/2006/relationships" xmlns:m="http://schemas.openxmlformats.org/officeDocument/2006/math" xmlns:v="urn:schemas-microsoft-com:vml" xmlns:wp14="http://schemas.microsoft.com/office/word/2010/wordprocessingDrawing" xmlns:wp="http://schemas.openxmlformats.org/drawingml/2006/wordprocessingDrawing" xmlns:w10="urn:schemas-microsoft-com:office:word" xmlns:w="http://schemas.openxmlformats.org/wordprocessingml/2006/main" xmlns:w14="http://schemas.microsoft.com/office/word/2010/wordml" xmlns:w15="http://schemas.microsoft.com/office/word/2012/wordml" xmlns:w16cex="http://schemas.microsoft.com/office/word/2018/wordml/cex" xmlns:w16cid="http://schemas.microsoft.com/office/word/2016/wordml/cid" xmlns:w16="http://schemas.microsoft.com/office/word/2018/wordml" xmlns:w16du="http://schemas.microsoft.com/office/word/2023/wordml/word16du" xmlns:w16sdtdh="http://schemas.microsoft.com/office/word/2020/wordml/sdtdatahash" xmlns:w16sdtfl="http://schemas.microsoft.com/office/word/2024/wordml/sdtformatlock" xmlns:w16se="http://schemas.microsoft.com/office/word/2015/wordml/symex" xmlns:wpg="http://schemas.microsoft.com/office/word/2010/wordprocessingGroup" xmlns:wpi="http://schemas.microsoft.com/office/word/2010/wordprocessingInk" xmlns:wne="http://schemas.microsoft.com/office/word/2006/wordml" xmlns:wps="http://schemas.microsoft.com/office/word/2010/wordprocessingShape" mc:Ignorable="w14 w15 w16se w16cid w16 w16cex w16sdtdh w16sdtfl w16du wp14">
+<w:numbering xmlns:wpc="http://schemas.microsoft.com/office/word/2010/wordprocessingCanvas" xmlns:cx="http://schemas.microsoft.com/office/drawing/2014/chartex" xmlns:cx1="http://schemas.microsoft.com/office/drawing/2015/9/8/chartex" xmlns:cx2="http://schemas.microsoft.com/office/drawing/2015/10/21/chartex" xmlns:cx3="http://schemas.microsoft.com/office/drawing/2016/5/9/chartex" xmlns:cx4="http://schemas.microsoft.com/office/drawing/2016/5/10/chartex" xmlns:cx5="http://schemas.microsoft.com/office/drawing/2016/5/11/chartex" xmlns:cx6="http://schemas.microsoft.com/office/drawing/2016/5/12/chartex" xmlns:cx7="http://schemas.microsoft.com/office/drawing/2016/5/13/chartex" xmlns:cx8="http://schemas.microsoft.com/office/drawing/2016/5/14/chartex" xmlns:mc="http://schemas.openxmlformats.org/markup-compatibility/2006" xmlns:aink="http://schemas.microsoft.com/office/drawing/2016/ink" xmlns:am3d="http://schemas.microsoft.com/office/drawing/2017/model3d" xmlns:o="urn:schemas-microsoft-com:office:office" xmlns:r="http://schemas.openxmlformats.org/officeDocument/2006/relationships" xmlns:m="http://schemas.openxmlformats.org/officeDocument/2006/math" xmlns:v="urn:schemas-microsoft-com:vml" xmlns:wp14="http://schemas.microsoft.com/office/word/2010/wordprocessingDrawing" xmlns:wp="http://schemas.openxmlformats.org/drawingml/2006/wordprocessingDrawing" xmlns:w10="urn:schemas-microsoft-com:office:word" xmlns:w="http://schemas.openxmlformats.org/wordprocessingml/2006/main" xmlns:w14="http://schemas.microsoft.com/office/word/2010/wordml" xmlns:w15="http://schemas.microsoft.com/office/word/2012/wordml" xmlns:w16cid="http://schemas.microsoft.com/office/word/2016/wordml/cid" xmlns:w16se="http://schemas.microsoft.com/office/word/2015/wordml/symex" xmlns:wpg="http://schemas.microsoft.com/office/word/2010/wordprocessingGroup" xmlns:wpi="http://schemas.microsoft.com/office/word/2010/wordprocessingInk" xmlns:wne="http://schemas.microsoft.com/office/word/2006/wordml" xmlns:wps="http://schemas.microsoft.com/office/word/2010/wordprocessingShape" mc:Ignorable="w14 w15 w16se w16cid wp14">
   <w:abstractNum w:abstractNumId="0" w15:restartNumberingAfterBreak="0">
     <w:nsid w:val="0BD17DC4"/>
     <w:multiLevelType w:val="hybridMultilevel"/>
@@ -16557,113 +16218,113 @@
       </w:rPr>
     </w:lvl>
   </w:abstractNum>
-  <w:num w:numId="1" w16cid:durableId="393160240">
+  <w:num w:numId="1">
     <w:abstractNumId w:val="14"/>
   </w:num>
-  <w:num w:numId="2" w16cid:durableId="522017769">
+  <w:num w:numId="2">
     <w:abstractNumId w:val="1"/>
   </w:num>
-  <w:num w:numId="3" w16cid:durableId="1742287776">
+  <w:num w:numId="3">
     <w:abstractNumId w:val="6"/>
   </w:num>
-  <w:num w:numId="4" w16cid:durableId="1347635829">
+  <w:num w:numId="4">
     <w:abstractNumId w:val="0"/>
   </w:num>
-  <w:num w:numId="5" w16cid:durableId="1665235680">
+  <w:num w:numId="5">
     <w:abstractNumId w:val="10"/>
   </w:num>
-  <w:num w:numId="6" w16cid:durableId="1988821884">
+  <w:num w:numId="6">
     <w:abstractNumId w:val="30"/>
   </w:num>
-  <w:num w:numId="7" w16cid:durableId="1804733437">
+  <w:num w:numId="7">
     <w:abstractNumId w:val="9"/>
   </w:num>
-  <w:num w:numId="8" w16cid:durableId="1055349718">
+  <w:num w:numId="8">
     <w:abstractNumId w:val="25"/>
   </w:num>
-  <w:num w:numId="9" w16cid:durableId="870067227">
+  <w:num w:numId="9">
     <w:abstractNumId w:val="16"/>
   </w:num>
-  <w:num w:numId="10" w16cid:durableId="187375155">
+  <w:num w:numId="10">
     <w:abstractNumId w:val="27"/>
   </w:num>
-  <w:num w:numId="11" w16cid:durableId="199510208">
+  <w:num w:numId="11">
     <w:abstractNumId w:val="11"/>
   </w:num>
-  <w:num w:numId="12" w16cid:durableId="729962972">
+  <w:num w:numId="12">
     <w:abstractNumId w:val="23"/>
   </w:num>
-  <w:num w:numId="13" w16cid:durableId="899098796">
+  <w:num w:numId="13">
     <w:abstractNumId w:val="33"/>
   </w:num>
-  <w:num w:numId="14" w16cid:durableId="1218511796">
+  <w:num w:numId="14">
     <w:abstractNumId w:val="22"/>
   </w:num>
-  <w:num w:numId="15" w16cid:durableId="1411778651">
+  <w:num w:numId="15">
     <w:abstractNumId w:val="15"/>
   </w:num>
-  <w:num w:numId="16" w16cid:durableId="1330937431">
+  <w:num w:numId="16">
     <w:abstractNumId w:val="17"/>
   </w:num>
-  <w:num w:numId="17" w16cid:durableId="531502986">
+  <w:num w:numId="17">
     <w:abstractNumId w:val="13"/>
   </w:num>
-  <w:num w:numId="18" w16cid:durableId="1505586511">
+  <w:num w:numId="18">
     <w:abstractNumId w:val="12"/>
   </w:num>
-  <w:num w:numId="19" w16cid:durableId="1099330058">
+  <w:num w:numId="19">
     <w:abstractNumId w:val="21"/>
   </w:num>
-  <w:num w:numId="20" w16cid:durableId="282423471">
+  <w:num w:numId="20">
     <w:abstractNumId w:val="3"/>
   </w:num>
-  <w:num w:numId="21" w16cid:durableId="1140150944">
+  <w:num w:numId="21">
     <w:abstractNumId w:val="18"/>
   </w:num>
-  <w:num w:numId="22" w16cid:durableId="1257598924">
+  <w:num w:numId="22">
     <w:abstractNumId w:val="32"/>
   </w:num>
-  <w:num w:numId="23" w16cid:durableId="280500593">
+  <w:num w:numId="23">
     <w:abstractNumId w:val="28"/>
   </w:num>
-  <w:num w:numId="24" w16cid:durableId="1186938724">
+  <w:num w:numId="24">
     <w:abstractNumId w:val="5"/>
   </w:num>
-  <w:num w:numId="25" w16cid:durableId="87888892">
+  <w:num w:numId="25">
     <w:abstractNumId w:val="29"/>
   </w:num>
-  <w:num w:numId="26" w16cid:durableId="1225986519">
+  <w:num w:numId="26">
     <w:abstractNumId w:val="8"/>
   </w:num>
-  <w:num w:numId="27" w16cid:durableId="378674604">
+  <w:num w:numId="27">
     <w:abstractNumId w:val="2"/>
   </w:num>
-  <w:num w:numId="28" w16cid:durableId="752698354">
+  <w:num w:numId="28">
     <w:abstractNumId w:val="31"/>
   </w:num>
-  <w:num w:numId="29" w16cid:durableId="38015846">
+  <w:num w:numId="29">
     <w:abstractNumId w:val="26"/>
   </w:num>
-  <w:num w:numId="30" w16cid:durableId="547373500">
+  <w:num w:numId="30">
     <w:abstractNumId w:val="20"/>
   </w:num>
-  <w:num w:numId="31" w16cid:durableId="1968775786">
+  <w:num w:numId="31">
     <w:abstractNumId w:val="4"/>
   </w:num>
-  <w:num w:numId="32" w16cid:durableId="563219407">
+  <w:num w:numId="32">
     <w:abstractNumId w:val="7"/>
   </w:num>
-  <w:num w:numId="33" w16cid:durableId="1960985431">
+  <w:num w:numId="33">
     <w:abstractNumId w:val="19"/>
   </w:num>
-  <w:num w:numId="34" w16cid:durableId="1080446926">
+  <w:num w:numId="34">
     <w:abstractNumId w:val="24"/>
   </w:num>
 </w:numbering>
 </file>
 
 <file path=word/styles.xml><?xml version="1.0" encoding="utf-8"?>
-<w:styles xmlns:mc="http://schemas.openxmlformats.org/markup-compatibility/2006" xmlns:r="http://schemas.openxmlformats.org/officeDocument/2006/relationships" xmlns:w="http://schemas.openxmlformats.org/wordprocessingml/2006/main" xmlns:w14="http://schemas.microsoft.com/office/word/2010/wordml" xmlns:w15="http://schemas.microsoft.com/office/word/2012/wordml" xmlns:w16cex="http://schemas.microsoft.com/office/word/2018/wordml/cex" xmlns:w16cid="http://schemas.microsoft.com/office/word/2016/wordml/cid" xmlns:w16="http://schemas.microsoft.com/office/word/2018/wordml" xmlns:w16du="http://schemas.microsoft.com/office/word/2023/wordml/word16du" xmlns:w16sdtdh="http://schemas.microsoft.com/office/word/2020/wordml/sdtdatahash" xmlns:w16sdtfl="http://schemas.microsoft.com/office/word/2024/wordml/sdtformatlock" xmlns:w16se="http://schemas.microsoft.com/office/word/2015/wordml/symex" mc:Ignorable="w14 w15 w16se w16cid w16 w16cex w16sdtdh w16sdtfl w16du">
+<w:styles xmlns:mc="http://schemas.openxmlformats.org/markup-compatibility/2006" xmlns:r="http://schemas.openxmlformats.org/officeDocument/2006/relationships" xmlns:w="http://schemas.openxmlformats.org/wordprocessingml/2006/main" xmlns:w14="http://schemas.microsoft.com/office/word/2010/wordml" xmlns:w15="http://schemas.microsoft.com/office/word/2012/wordml" xmlns:w16cid="http://schemas.microsoft.com/office/word/2016/wordml/cid" xmlns:w16se="http://schemas.microsoft.com/office/word/2015/wordml/symex" mc:Ignorable="w14 w15 w16se w16cid">
   <w:docDefaults>
     <w:rPrDefault>
       <w:rPr>
@@ -16681,7 +16342,7 @@
       </w:pPr>
     </w:pPrDefault>
   </w:docDefaults>
-  <w:latentStyles w:defLockedState="0" w:defUIPriority="99" w:defSemiHidden="0" w:defUnhideWhenUsed="0" w:defQFormat="0" w:count="376">
+  <w:latentStyles w:defLockedState="0" w:defUIPriority="99" w:defSemiHidden="0" w:defUnhideWhenUsed="0" w:defQFormat="0" w:count="375">
     <w:lsdException w:name="Normal" w:uiPriority="0" w:qFormat="1"/>
     <w:lsdException w:name="heading 1" w:uiPriority="9" w:qFormat="1"/>
     <w:lsdException w:name="heading 2" w:semiHidden="1" w:uiPriority="9" w:unhideWhenUsed="1" w:qFormat="1"/>
@@ -17057,7 +16718,6 @@
     <w:lsdException w:name="Smart Hyperlink" w:semiHidden="1" w:unhideWhenUsed="1"/>
     <w:lsdException w:name="Hashtag" w:semiHidden="1" w:unhideWhenUsed="1"/>
     <w:lsdException w:name="Unresolved Mention" w:semiHidden="1" w:unhideWhenUsed="1"/>
-    <w:lsdException w:name="Smart Link" w:semiHidden="1" w:unhideWhenUsed="1"/>
   </w:latentStyles>
   <w:style w:type="paragraph" w:default="1" w:styleId="Normal">
     <w:name w:val="Normal"/>
@@ -17822,7 +17482,7 @@
 </file>
 
 <file path=customXml/itemProps1.xml><?xml version="1.0" encoding="utf-8"?>
-<ds:datastoreItem xmlns:ds="http://schemas.openxmlformats.org/officeDocument/2006/customXml" ds:itemID="{BC7E03C0-5DEC-4B5A-9252-9E3974FEDEB0}">
+<ds:datastoreItem xmlns:ds="http://schemas.openxmlformats.org/officeDocument/2006/customXml" ds:itemID="{44728416-E546-457B-ACAD-8FE51F07D513}">
   <ds:schemaRefs>
     <ds:schemaRef ds:uri="http://schemas.openxmlformats.org/officeDocument/2006/bibliography"/>
   </ds:schemaRefs>

</xml_diff>